<commit_message>
feat(remote): confirm icon logout and validate consent at login submission
</commit_message>
<xml_diff>
--- a/public/streaming-mvp/独立远程电脑PRD-飞书导入版.docx
+++ b/public/streaming-mvp/独立远程电脑PRD-飞书导入版.docx
@@ -7,7 +7,7 @@
         <w:pStyle w:val="Title"/>
       </w:pPr>
       <w:r>
-        <w:t>盖世远程独立客户端与移动 App PRD V4.6</w:t>
+        <w:t>盖世远程独立客户端与移动 App PRD V4.7</w:t>
       </w:r>
     </w:p>
     <w:p>
@@ -1097,6 +1097,131 @@
           </w:p>
         </w:tc>
       </w:tr>
+      <w:tr>
+        <w:trPr>
+          <w:cantSplit/>
+        </w:trPr>
+        <w:tc>
+          <w:tcPr>
+            <w:tcW w:type="dxa" w:w="2592"/>
+            <w:vAlign w:val="top"/>
+            <w:tcMar>
+              <w:top w:w="80" w:type="dxa"/>
+              <w:start w:w="100" w:type="dxa"/>
+              <w:bottom w:w="80" w:type="dxa"/>
+              <w:end w:w="100" w:type="dxa"/>
+            </w:tcMar>
+          </w:tcPr>
+          <w:p>
+            <w:pPr>
+              <w:spacing w:after="40"/>
+            </w:pPr>
+            <w:r>
+              <w:rPr>
+                <w:rFonts w:ascii="Microsoft YaHei" w:hAnsi="Microsoft YaHei" w:eastAsia="Microsoft YaHei"/>
+              </w:rPr>
+            </w:r>
+            <w:r>
+              <w:rPr>
+                <w:rFonts w:ascii="Microsoft YaHei" w:hAnsi="Microsoft YaHei" w:eastAsia="Microsoft YaHei"/>
+                <w:b w:val="0"/>
+                <w:i w:val="0"/>
+              </w:rPr>
+              <w:t>2026/10/26</w:t>
+            </w:r>
+          </w:p>
+        </w:tc>
+        <w:tc>
+          <w:tcPr>
+            <w:tcW w:type="dxa" w:w="2592"/>
+            <w:vAlign w:val="top"/>
+            <w:tcMar>
+              <w:top w:w="80" w:type="dxa"/>
+              <w:start w:w="100" w:type="dxa"/>
+              <w:bottom w:w="80" w:type="dxa"/>
+              <w:end w:w="100" w:type="dxa"/>
+            </w:tcMar>
+          </w:tcPr>
+          <w:p>
+            <w:pPr>
+              <w:spacing w:after="40"/>
+            </w:pPr>
+            <w:r>
+              <w:rPr>
+                <w:rFonts w:ascii="Microsoft YaHei" w:hAnsi="Microsoft YaHei" w:eastAsia="Microsoft YaHei"/>
+              </w:rPr>
+            </w:r>
+            <w:r>
+              <w:rPr>
+                <w:rFonts w:ascii="Microsoft YaHei" w:hAnsi="Microsoft YaHei" w:eastAsia="Microsoft YaHei"/>
+                <w:b w:val="0"/>
+                <w:i w:val="0"/>
+              </w:rPr>
+              <w:t>双端退出改为图标并增加二次确认；协议未勾选仍可输入、获取验证码和扫码，登录提交或扫码确认时提示先勾选，完成登录仍需同意</w:t>
+            </w:r>
+          </w:p>
+        </w:tc>
+        <w:tc>
+          <w:tcPr>
+            <w:tcW w:type="dxa" w:w="2592"/>
+            <w:vAlign w:val="top"/>
+            <w:tcMar>
+              <w:top w:w="80" w:type="dxa"/>
+              <w:start w:w="100" w:type="dxa"/>
+              <w:bottom w:w="80" w:type="dxa"/>
+              <w:end w:w="100" w:type="dxa"/>
+            </w:tcMar>
+          </w:tcPr>
+          <w:p>
+            <w:pPr>
+              <w:spacing w:after="40"/>
+            </w:pPr>
+            <w:r>
+              <w:rPr>
+                <w:rFonts w:ascii="Microsoft YaHei" w:hAnsi="Microsoft YaHei" w:eastAsia="Microsoft YaHei"/>
+              </w:rPr>
+            </w:r>
+            <w:r>
+              <w:rPr>
+                <w:rFonts w:ascii="Microsoft YaHei" w:hAnsi="Microsoft YaHei" w:eastAsia="Microsoft YaHei"/>
+                <w:b w:val="0"/>
+                <w:i w:val="0"/>
+              </w:rPr>
+              <w:t>V4.7-Draft</w:t>
+            </w:r>
+          </w:p>
+        </w:tc>
+        <w:tc>
+          <w:tcPr>
+            <w:tcW w:type="dxa" w:w="2592"/>
+            <w:vAlign w:val="top"/>
+            <w:tcMar>
+              <w:top w:w="80" w:type="dxa"/>
+              <w:start w:w="100" w:type="dxa"/>
+              <w:bottom w:w="80" w:type="dxa"/>
+              <w:end w:w="100" w:type="dxa"/>
+            </w:tcMar>
+          </w:tcPr>
+          <w:p>
+            <w:pPr>
+              <w:spacing w:after="40"/>
+            </w:pPr>
+            <w:r>
+              <w:rPr>
+                <w:rFonts w:ascii="Microsoft YaHei" w:hAnsi="Microsoft YaHei" w:eastAsia="Microsoft YaHei"/>
+              </w:rPr>
+            </w:r>
+            <w:r>
+              <w:rPr>
+                <w:rFonts w:ascii="Microsoft YaHei" w:hAnsi="Microsoft YaHei" w:eastAsia="Microsoft YaHei"/>
+                <w:b w:val="0"/>
+                <w:i w:val="0"/>
+              </w:rPr>
+              <w:t>产品</w:t>
+            </w:r>
+          </w:p>
+        </w:tc>
+      </w:tr>
     </w:tbl>
     <w:p>
       <w:pPr>
@@ -1112,7 +1237,7 @@
           <w:b w:val="0"/>
           <w:i w:val="0"/>
         </w:rPr>
-        <w:t>备注：搜2026.10.26修改（两Tab、我的、扫一扫、更新通知、昵称旁退出及电脑默认登录）。本稿替代 V3.10 中的游戏库入口、盖世 Mac 侧栏、默认沿用盖世登录态及首次安装引导。工作名为“盖世远程”。本期为 MVP，保留现有 Demo 远控能力，补登录、登录协议、电脑端新手引导、我的与帮助入口。国内手机号验证码、海外邮箱验证码/Google、电脑端扫码已确认；移动端保留盖世游戏 App 拉起登录，并在我的Tab提供扫一扫，用于扫描电脑端登录码，不展示供本机扫描的二维码。配图为本地 Demo，不代表登录服务或远控引擎已经接通。</w:t>
+        <w:t>备注：搜2026.10.26修改（两Tab、我的、扫一扫、更新通知、昵称旁退出图标、退出二次确认、未勾协议可操作及电脑默认登录）。本稿替代 V3.10 中的游戏库入口、盖世 Mac 侧栏、默认沿用盖世登录态及首次安装引导。工作名为“盖世远程”。本期为 MVP，保留现有 Demo 远控能力，补登录、登录协议、电脑端新手引导、我的与帮助入口。国内手机号验证码、海外邮箱验证码/Google、电脑端扫码已确认；移动端保留盖世游戏 App 拉起登录，并在我的Tab提供扫一扫，用于扫描电脑端登录码，不展示供本机扫描的二维码。配图为本地 Demo，不代表登录服务或远控引擎已经接通。</w:t>
       </w:r>
     </w:p>
     <w:p>
@@ -3007,7 +3132,7 @@
                 <w:b w:val="0"/>
                 <w:i w:val="0"/>
               </w:rPr>
-              <w:t>1. 先校验协议，再获取验证码/提交登录/发起 Google 或盖世 App 授权；未同意时就地提示，不发送或授权。</w:t>
+              <w:t>1. 协议未勾选时仍可填写手机号/邮箱和验证码，获取验证码及各登录入口保持可点击，不因未勾选禁用。获取验证码只校验当前账号格式，不要求先同意协议。点击登录、Google或盖世App登录入口时，未同意先提示“请先勾选协议”，保留表单，不提交登录、不启动第三方授权；提示不自动勾选协议。</w:t>
             </w:r>
             <w:r>
               <w:rPr>
@@ -3035,7 +3160,7 @@
                 <w:b w:val="0"/>
                 <w:i w:val="0"/>
               </w:rPr>
-              <w:t>3. 点击“登录”，核实本次验证码及有效会话后获取当前盖世 UID 的设备；点击 App/Google 入口进入本次授权。</w:t>
+              <w:t>3. 勾选同意后保留本次输入和仍有效的验证码，无需因勾选重新发码；点击“登录”校验本次验证码及协议，取得并核实有效会话后获取当前盖世UID设备。已同意时点击App/Google入口进入本次授权；异步成功前再次核对本次同意及尝试仍有效。</w:t>
             </w:r>
             <w:r>
               <w:rPr>
@@ -3193,7 +3318,7 @@
                 <w:b w:val="0"/>
                 <w:i w:val="0"/>
               </w:rPr>
-              <w:t>2. 撤销同意作废验证码及未完成授权；重新勾选需重新获取验证码/发起授权。切换评审地区清空输入并恢复未勾选，旧结果不得登录。</w:t>
+              <w:t>2. 撤销同意作废旧验证码请求、验证码及未完成授权，晚到结果不得恢复；仍可在未勾选状态重新获取验证码，重新勾选保留此后新获取的有效验证码。切换评审地区清空输入并恢复未勾选，退出隔离旧请求。</w:t>
             </w:r>
             <w:r>
               <w:rPr>
@@ -3512,7 +3637,7 @@
                 <w:b w:val="0"/>
                 <w:i w:val="0"/>
               </w:rPr>
-              <w:t>已主动同意本地区登录协议；Google 仅海外；盖世 App 授权需能拉起已安装 App。</w:t>
+              <w:t>进入实际授权流程前需主动同意本地区登录协议；未同意时入口可点击，只提示“请先勾选协议”，不启动授权。Google仅海外；盖世App授权需能拉起已安装App。</w:t>
             </w:r>
           </w:p>
         </w:tc>
@@ -3720,7 +3845,7 @@
                 <w:b w:val="0"/>
                 <w:i w:val="0"/>
               </w:rPr>
-              <w:t>2. 确认后回到发起端，核对本次授权和独立会话，再取当前 UID 设备；不复制盖世 App 令牌，不要求绑定 Steam/Epic。</w:t>
+              <w:t>2. 确认后回到发起端，再次核对本次协议同意、授权和独立会话，均有效才取当前UID设备；不复制盖世App令牌，不要求绑定Steam/Epic。</w:t>
             </w:r>
             <w:r>
               <w:rPr>
@@ -8036,7 +8161,7 @@
                 <w:b w:val="0"/>
                 <w:i/>
               </w:rPr>
-              <w:t>图3-10：我的；昵称右侧退出、右上扫一扫，以及帮助中心、检查更新和关于。</w:t>
+              <w:t>图3-10：我的；昵称右侧退出图标、右上扫一扫，以及帮助中心、检查更新和关于。</w:t>
             </w:r>
             <w:r>
               <w:rPr>
@@ -8047,6 +8172,63 @@
             <w:r>
               <w:rPr>
                 <w:rFonts w:ascii="Microsoft YaHei" w:hAnsi="Microsoft YaHei" w:eastAsia="Microsoft YaHei"/>
+              </w:rPr>
+              <w:drawing>
+                <wp:inline xmlns:a="http://schemas.openxmlformats.org/drawingml/2006/main" xmlns:pic="http://schemas.openxmlformats.org/drawingml/2006/picture">
+                  <wp:extent cx="1666190" cy="3657600"/>
+                  <wp:docPr id="11" name="Picture 11"/>
+                  <wp:cNvGraphicFramePr>
+                    <a:graphicFrameLocks noChangeAspect="1"/>
+                  </wp:cNvGraphicFramePr>
+                  <a:graphic>
+                    <a:graphicData uri="http://schemas.openxmlformats.org/drawingml/2006/picture">
+                      <pic:pic>
+                        <pic:nvPicPr>
+                          <pic:cNvPr id="0" name="standalone-mobile-logout.png"/>
+                          <pic:cNvPicPr/>
+                        </pic:nvPicPr>
+                        <pic:blipFill>
+                          <a:blip r:embed="rId19"/>
+                          <a:stretch>
+                            <a:fillRect/>
+                          </a:stretch>
+                        </pic:blipFill>
+                        <pic:spPr>
+                          <a:xfrm>
+                            <a:off x="0" y="0"/>
+                            <a:ext cx="1666190" cy="3657600"/>
+                          </a:xfrm>
+                          <a:prstGeom prst="rect"/>
+                        </pic:spPr>
+                      </pic:pic>
+                    </a:graphicData>
+                  </a:graphic>
+                </wp:inline>
+              </w:drawing>
+            </w:r>
+            <w:r>
+              <w:rPr>
+                <w:rFonts w:ascii="Microsoft YaHei" w:hAnsi="Microsoft YaHei" w:eastAsia="Microsoft YaHei"/>
+              </w:rPr>
+              <w:br/>
+            </w:r>
+            <w:r>
+              <w:rPr>
+                <w:rFonts w:ascii="Microsoft YaHei" w:hAnsi="Microsoft YaHei" w:eastAsia="Microsoft YaHei"/>
+                <w:b w:val="0"/>
+                <w:i/>
+              </w:rPr>
+              <w:t>图3-10a：我的页上方显示退出登录确认框。</w:t>
+            </w:r>
+            <w:r>
+              <w:rPr>
+                <w:rFonts w:ascii="Microsoft YaHei" w:hAnsi="Microsoft YaHei" w:eastAsia="Microsoft YaHei"/>
+              </w:rPr>
+              <w:br/>
+            </w:r>
+            <w:r>
+              <w:rPr>
+                <w:rFonts w:ascii="Microsoft YaHei" w:hAnsi="Microsoft YaHei" w:eastAsia="Microsoft YaHei"/>
                 <w:b/>
                 <w:i w:val="0"/>
               </w:rPr>
@@ -8078,7 +8260,7 @@
                 <w:b w:val="0"/>
                 <w:i w:val="0"/>
               </w:rPr>
-              <w:t>1. 页面标题为“我的”，右上显示扫一扫；账号区显示头像、昵称和脱敏账号，昵称右侧显示“退出登录”；除退出按钮外，头像和账号资料静态展示，不显示右箭头，不作为按钮或入口。</w:t>
+              <w:t>1. 页面标题为“我的”，右上显示扫一扫；账号区显示头像、昵称和脱敏账号，昵称右侧只显示退出图标，不显示退出文字；图标按钮的aria-label和title均为“退出登录”。除退出按钮外，头像和账号资料静态展示，不显示右箭头，不作为按钮或入口。</w:t>
             </w:r>
             <w:r>
               <w:rPr>
@@ -8134,7 +8316,7 @@
                 <w:b w:val="0"/>
                 <w:i w:val="0"/>
               </w:rPr>
-              <w:t>1. 点击头像、昵称或其他静态资料区域不跳转、不展开弹层、不显示反馈；只有昵称右侧的退出按钮执行退出，不增加头像上传或账号编辑。</w:t>
+              <w:t>1. 点击头像、昵称或其他静态资料区域不跳转、不展开弹层、不显示反馈；只有昵称右侧的退出图标打开退出登录确认框，不增加头像上传或账号编辑。</w:t>
             </w:r>
             <w:r>
               <w:rPr>
@@ -8176,7 +8358,21 @@
                 <w:b w:val="0"/>
                 <w:i w:val="0"/>
               </w:rPr>
-              <w:t>4. 点击昵称右侧的退出登录，结束本端会话及未完成扫码确认，清理设备、选中目标、临时授权和账号缓存，回独立登录页；不退出盖世游戏App或其他电脑。</w:t>
+              <w:t>4. 点击昵称右侧退出图标，显示二次确认框：标题“退出登录？”，说明“退出后需重新登录才能访问你的设备。”，按钮“取消”和“退出登录”。打开确认框不退出账号、不清理任务。</w:t>
+            </w:r>
+            <w:r>
+              <w:rPr>
+                <w:rFonts w:ascii="Microsoft YaHei" w:hAnsi="Microsoft YaHei" w:eastAsia="Microsoft YaHei"/>
+              </w:rPr>
+              <w:br/>
+            </w:r>
+            <w:r>
+              <w:rPr>
+                <w:rFonts w:ascii="Microsoft YaHei" w:hAnsi="Microsoft YaHei" w:eastAsia="Microsoft YaHei"/>
+                <w:b w:val="0"/>
+                <w:i w:val="0"/>
+              </w:rPr>
+              <w:t>5. 点击取消或按Esc关闭确认框，保留当前账号、我的页及进行中的任务。点击确认框的退出登录后，才结束本端会话、未完成扫码确认和任务，清理设备、选中目标、临时授权和账号缓存，回独立登录页；不退出盖世游戏App或其他电脑。</w:t>
             </w:r>
           </w:p>
         </w:tc>
@@ -8241,7 +8437,7 @@
                 <w:b w:val="0"/>
                 <w:i w:val="0"/>
               </w:rPr>
-              <w:t>显示当前账号资料、进入所选页面，或完成本端退出后显示独立登录页。</w:t>
+              <w:t>取消退出保留原账号、页面与任务；确认退出后显示独立登录页。其他入口显示当前账号资料或进入所选页面。</w:t>
             </w:r>
           </w:p>
         </w:tc>
@@ -8321,6 +8517,20 @@
                 <w:i w:val="0"/>
               </w:rPr>
               <w:t>2. Demo只模拟会话和任务清理；真实撤销及传输中断需接入，页面清空不等于服务端解绑，不删除磁盘文件。</w:t>
+            </w:r>
+            <w:r>
+              <w:rPr>
+                <w:rFonts w:ascii="Microsoft YaHei" w:hAnsi="Microsoft YaHei" w:eastAsia="Microsoft YaHei"/>
+              </w:rPr>
+              <w:br/>
+            </w:r>
+            <w:r>
+              <w:rPr>
+                <w:rFonts w:ascii="Microsoft YaHei" w:hAnsi="Microsoft YaHei" w:eastAsia="Microsoft YaHei"/>
+                <w:b w:val="0"/>
+                <w:i w:val="0"/>
+              </w:rPr>
+              <w:t>3. 退出账号二次确认仅用于账号退出，不改变远控会话退出的原有规则。</w:t>
             </w:r>
           </w:p>
         </w:tc>
@@ -8546,7 +8756,7 @@
               <w:drawing>
                 <wp:inline xmlns:a="http://schemas.openxmlformats.org/drawingml/2006/main" xmlns:pic="http://schemas.openxmlformats.org/drawingml/2006/picture">
                   <wp:extent cx="1666190" cy="3657600"/>
-                  <wp:docPr id="11" name="Picture 11"/>
+                  <wp:docPr id="12" name="Picture 12"/>
                   <wp:cNvGraphicFramePr>
                     <a:graphicFrameLocks noChangeAspect="1"/>
                   </wp:cNvGraphicFramePr>
@@ -8558,7 +8768,7 @@
                           <pic:cNvPicPr/>
                         </pic:nvPicPr>
                         <pic:blipFill>
-                          <a:blip r:embed="rId19"/>
+                          <a:blip r:embed="rId20"/>
                           <a:stretch>
                             <a:fillRect/>
                           </a:stretch>
@@ -9105,7 +9315,7 @@
               <w:drawing>
                 <wp:inline xmlns:a="http://schemas.openxmlformats.org/drawingml/2006/main" xmlns:pic="http://schemas.openxmlformats.org/drawingml/2006/picture">
                   <wp:extent cx="1666190" cy="3657600"/>
-                  <wp:docPr id="12" name="Picture 12"/>
+                  <wp:docPr id="13" name="Picture 13"/>
                   <wp:cNvGraphicFramePr>
                     <a:graphicFrameLocks noChangeAspect="1"/>
                   </wp:cNvGraphicFramePr>
@@ -9117,7 +9327,7 @@
                           <pic:cNvPicPr/>
                         </pic:nvPicPr>
                         <pic:blipFill>
-                          <a:blip r:embed="rId20"/>
+                          <a:blip r:embed="rId21"/>
                           <a:stretch>
                             <a:fillRect/>
                           </a:stretch>
@@ -9748,7 +9958,7 @@
               <w:drawing>
                 <wp:inline xmlns:a="http://schemas.openxmlformats.org/drawingml/2006/main" xmlns:pic="http://schemas.openxmlformats.org/drawingml/2006/picture">
                   <wp:extent cx="1666190" cy="3657600"/>
-                  <wp:docPr id="13" name="Picture 13"/>
+                  <wp:docPr id="14" name="Picture 14"/>
                   <wp:cNvGraphicFramePr>
                     <a:graphicFrameLocks noChangeAspect="1"/>
                   </wp:cNvGraphicFramePr>
@@ -9760,7 +9970,7 @@
                           <pic:cNvPicPr/>
                         </pic:nvPicPr>
                         <pic:blipFill>
-                          <a:blip r:embed="rId21"/>
+                          <a:blip r:embed="rId22"/>
                           <a:stretch>
                             <a:fillRect/>
                           </a:stretch>
@@ -10363,7 +10573,7 @@
               <w:drawing>
                 <wp:inline xmlns:a="http://schemas.openxmlformats.org/drawingml/2006/main" xmlns:pic="http://schemas.openxmlformats.org/drawingml/2006/picture">
                   <wp:extent cx="1666190" cy="3657600"/>
-                  <wp:docPr id="14" name="Picture 14"/>
+                  <wp:docPr id="15" name="Picture 15"/>
                   <wp:cNvGraphicFramePr>
                     <a:graphicFrameLocks noChangeAspect="1"/>
                   </wp:cNvGraphicFramePr>
@@ -10375,7 +10585,7 @@
                           <pic:cNvPicPr/>
                         </pic:nvPicPr>
                         <pic:blipFill>
-                          <a:blip r:embed="rId22"/>
+                          <a:blip r:embed="rId23"/>
                           <a:stretch>
                             <a:fillRect/>
                           </a:stretch>
@@ -10896,7 +11106,7 @@
                 <w:b w:val="0"/>
                 <w:i w:val="0"/>
               </w:rPr>
-              <w:t>手机已登录；电脑端已主动同意适用协议并生成仍有效的登录码。移动/电脑地区一致，码属于本产品本次电脑登录。</w:t>
+              <w:t>手机已登录；电脑端已生成仍有效的登录码，尚未勾选协议也可扫描并进入确认页。移动/电脑地区一致，码属于本产品本次电脑登录；确认登录仍需电脑端主动同意适用协议。</w:t>
             </w:r>
           </w:p>
         </w:tc>
@@ -10970,63 +11180,6 @@
                 <w:i w:val="0"/>
               </w:rPr>
               <w:t xml:space="preserve"> </w:t>
-            </w:r>
-            <w:r>
-              <w:rPr>
-                <w:rFonts w:ascii="Microsoft YaHei" w:hAnsi="Microsoft YaHei" w:eastAsia="Microsoft YaHei"/>
-              </w:rPr>
-              <w:drawing>
-                <wp:inline xmlns:a="http://schemas.openxmlformats.org/drawingml/2006/main" xmlns:pic="http://schemas.openxmlformats.org/drawingml/2006/picture">
-                  <wp:extent cx="1666190" cy="3657600"/>
-                  <wp:docPr id="15" name="Picture 15"/>
-                  <wp:cNvGraphicFramePr>
-                    <a:graphicFrameLocks noChangeAspect="1"/>
-                  </wp:cNvGraphicFramePr>
-                  <a:graphic>
-                    <a:graphicData uri="http://schemas.openxmlformats.org/drawingml/2006/picture">
-                      <pic:pic>
-                        <pic:nvPicPr>
-                          <pic:cNvPr id="0" name="standalone-mobile-scan.png"/>
-                          <pic:cNvPicPr/>
-                        </pic:nvPicPr>
-                        <pic:blipFill>
-                          <a:blip r:embed="rId23"/>
-                          <a:stretch>
-                            <a:fillRect/>
-                          </a:stretch>
-                        </pic:blipFill>
-                        <pic:spPr>
-                          <a:xfrm>
-                            <a:off x="0" y="0"/>
-                            <a:ext cx="1666190" cy="3657600"/>
-                          </a:xfrm>
-                          <a:prstGeom prst="rect"/>
-                        </pic:spPr>
-                      </pic:pic>
-                    </a:graphicData>
-                  </a:graphic>
-                </wp:inline>
-              </w:drawing>
-            </w:r>
-            <w:r>
-              <w:rPr>
-                <w:rFonts w:ascii="Microsoft YaHei" w:hAnsi="Microsoft YaHei" w:eastAsia="Microsoft YaHei"/>
-              </w:rPr>
-              <w:br/>
-            </w:r>
-            <w:r>
-              <w:rPr>
-                <w:rFonts w:ascii="Microsoft YaHei" w:hAnsi="Microsoft YaHei" w:eastAsia="Microsoft YaHei"/>
-                <w:b w:val="0"/>
-                <w:i/>
-              </w:rPr>
-              <w:t>图3-26：扫一扫；从我的进入。</w:t>
-            </w:r>
-            <w:r>
-              <w:rPr>
-                <w:rFonts w:ascii="Microsoft YaHei" w:hAnsi="Microsoft YaHei" w:eastAsia="Microsoft YaHei"/>
-              </w:rPr>
-              <w:br/>
             </w:r>
             <w:r>
               <w:rPr>
@@ -11043,7 +11196,7 @@
                     <a:graphicData uri="http://schemas.openxmlformats.org/drawingml/2006/picture">
                       <pic:pic>
                         <pic:nvPicPr>
-                          <pic:cNvPr id="0" name="standalone-mobile-scan-confirm.png"/>
+                          <pic:cNvPr id="0" name="standalone-mobile-scan.png"/>
                           <pic:cNvPicPr/>
                         </pic:nvPicPr>
                         <pic:blipFill>
@@ -11077,6 +11230,63 @@
                 <w:b w:val="0"/>
                 <w:i/>
               </w:rPr>
+              <w:t>图3-26：扫一扫；从我的进入。</w:t>
+            </w:r>
+            <w:r>
+              <w:rPr>
+                <w:rFonts w:ascii="Microsoft YaHei" w:hAnsi="Microsoft YaHei" w:eastAsia="Microsoft YaHei"/>
+              </w:rPr>
+              <w:br/>
+            </w:r>
+            <w:r>
+              <w:rPr>
+                <w:rFonts w:ascii="Microsoft YaHei" w:hAnsi="Microsoft YaHei" w:eastAsia="Microsoft YaHei"/>
+              </w:rPr>
+              <w:drawing>
+                <wp:inline xmlns:a="http://schemas.openxmlformats.org/drawingml/2006/main" xmlns:pic="http://schemas.openxmlformats.org/drawingml/2006/picture">
+                  <wp:extent cx="1666190" cy="3657600"/>
+                  <wp:docPr id="17" name="Picture 17"/>
+                  <wp:cNvGraphicFramePr>
+                    <a:graphicFrameLocks noChangeAspect="1"/>
+                  </wp:cNvGraphicFramePr>
+                  <a:graphic>
+                    <a:graphicData uri="http://schemas.openxmlformats.org/drawingml/2006/picture">
+                      <pic:pic>
+                        <pic:nvPicPr>
+                          <pic:cNvPr id="0" name="standalone-mobile-scan-confirm.png"/>
+                          <pic:cNvPicPr/>
+                        </pic:nvPicPr>
+                        <pic:blipFill>
+                          <a:blip r:embed="rId25"/>
+                          <a:stretch>
+                            <a:fillRect/>
+                          </a:stretch>
+                        </pic:blipFill>
+                        <pic:spPr>
+                          <a:xfrm>
+                            <a:off x="0" y="0"/>
+                            <a:ext cx="1666190" cy="3657600"/>
+                          </a:xfrm>
+                          <a:prstGeom prst="rect"/>
+                        </pic:spPr>
+                      </pic:pic>
+                    </a:graphicData>
+                  </a:graphic>
+                </wp:inline>
+              </w:drawing>
+            </w:r>
+            <w:r>
+              <w:rPr>
+                <w:rFonts w:ascii="Microsoft YaHei" w:hAnsi="Microsoft YaHei" w:eastAsia="Microsoft YaHei"/>
+              </w:rPr>
+              <w:br/>
+            </w:r>
+            <w:r>
+              <w:rPr>
+                <w:rFonts w:ascii="Microsoft YaHei" w:hAnsi="Microsoft YaHei" w:eastAsia="Microsoft YaHei"/>
+                <w:b w:val="0"/>
+                <w:i/>
+              </w:rPr>
               <w:t>图3-26a：电脑登录确认；确认仅登录，不自动远控。</w:t>
             </w:r>
             <w:r>
@@ -11175,7 +11385,7 @@
                 <w:b w:val="0"/>
                 <w:i w:val="0"/>
               </w:rPr>
-              <w:t>2. 点击确认登录，再核对本次码、地区和有效状态，提交当前账号对本次电脑登录的确认；点击取消登录使本次码失效，关闭扫码回我的页。</w:t>
+              <w:t>2. 点击确认登录，再核对本次码、地区、有效状态及电脑端本次协议同意。未同意提示“请先勾选协议”，留在确认页，不确认、不领取会话；电脑勾选后保留仍有效的同一码，可再次确认。全部通过才提交当前账号对本次电脑登录的确认；点击取消登录使本次码失效，关闭扫码回我的页。</w:t>
             </w:r>
             <w:r>
               <w:rPr>
@@ -11718,7 +11928,7 @@
               <w:drawing>
                 <wp:inline xmlns:a="http://schemas.openxmlformats.org/drawingml/2006/main" xmlns:pic="http://schemas.openxmlformats.org/drawingml/2006/picture">
                   <wp:extent cx="2880360" cy="1853576"/>
-                  <wp:docPr id="17" name="Picture 17"/>
+                  <wp:docPr id="18" name="Picture 18"/>
                   <wp:cNvGraphicFramePr>
                     <a:graphicFrameLocks noChangeAspect="1"/>
                   </wp:cNvGraphicFramePr>
@@ -11727,63 +11937,6 @@
                       <pic:pic>
                         <pic:nvPicPr>
                           <pic:cNvPr id="0" name="standalone-desktop-login.png"/>
-                          <pic:cNvPicPr/>
-                        </pic:nvPicPr>
-                        <pic:blipFill>
-                          <a:blip r:embed="rId25"/>
-                          <a:stretch>
-                            <a:fillRect/>
-                          </a:stretch>
-                        </pic:blipFill>
-                        <pic:spPr>
-                          <a:xfrm>
-                            <a:off x="0" y="0"/>
-                            <a:ext cx="2880360" cy="1853576"/>
-                          </a:xfrm>
-                          <a:prstGeom prst="rect"/>
-                        </pic:spPr>
-                      </pic:pic>
-                    </a:graphicData>
-                  </a:graphic>
-                </wp:inline>
-              </w:drawing>
-            </w:r>
-            <w:r>
-              <w:rPr>
-                <w:rFonts w:ascii="Microsoft YaHei" w:hAnsi="Microsoft YaHei" w:eastAsia="Microsoft YaHei"/>
-              </w:rPr>
-              <w:br/>
-            </w:r>
-            <w:r>
-              <w:rPr>
-                <w:rFonts w:ascii="Microsoft YaHei" w:hAnsi="Microsoft YaHei" w:eastAsia="Microsoft YaHei"/>
-                <w:b w:val="0"/>
-                <w:i/>
-              </w:rPr>
-              <w:t>图3-13 国内电脑登录</w:t>
-            </w:r>
-            <w:r>
-              <w:rPr>
-                <w:rFonts w:ascii="Microsoft YaHei" w:hAnsi="Microsoft YaHei" w:eastAsia="Microsoft YaHei"/>
-              </w:rPr>
-              <w:br/>
-            </w:r>
-            <w:r>
-              <w:rPr>
-                <w:rFonts w:ascii="Microsoft YaHei" w:hAnsi="Microsoft YaHei" w:eastAsia="Microsoft YaHei"/>
-              </w:rPr>
-              <w:drawing>
-                <wp:inline xmlns:a="http://schemas.openxmlformats.org/drawingml/2006/main" xmlns:pic="http://schemas.openxmlformats.org/drawingml/2006/picture">
-                  <wp:extent cx="2880360" cy="1853576"/>
-                  <wp:docPr id="18" name="Picture 18"/>
-                  <wp:cNvGraphicFramePr>
-                    <a:graphicFrameLocks noChangeAspect="1"/>
-                  </wp:cNvGraphicFramePr>
-                  <a:graphic>
-                    <a:graphicData uri="http://schemas.openxmlformats.org/drawingml/2006/picture">
-                      <pic:pic>
-                        <pic:nvPicPr>
-                          <pic:cNvPr id="0" name="standalone-desktop-login-overseas.png"/>
                           <pic:cNvPicPr/>
                         </pic:nvPicPr>
                         <pic:blipFill>
@@ -11817,6 +11970,63 @@
                 <w:b w:val="0"/>
                 <w:i/>
               </w:rPr>
+              <w:t>图3-13 国内电脑登录</w:t>
+            </w:r>
+            <w:r>
+              <w:rPr>
+                <w:rFonts w:ascii="Microsoft YaHei" w:hAnsi="Microsoft YaHei" w:eastAsia="Microsoft YaHei"/>
+              </w:rPr>
+              <w:br/>
+            </w:r>
+            <w:r>
+              <w:rPr>
+                <w:rFonts w:ascii="Microsoft YaHei" w:hAnsi="Microsoft YaHei" w:eastAsia="Microsoft YaHei"/>
+              </w:rPr>
+              <w:drawing>
+                <wp:inline xmlns:a="http://schemas.openxmlformats.org/drawingml/2006/main" xmlns:pic="http://schemas.openxmlformats.org/drawingml/2006/picture">
+                  <wp:extent cx="2880360" cy="1853576"/>
+                  <wp:docPr id="19" name="Picture 19"/>
+                  <wp:cNvGraphicFramePr>
+                    <a:graphicFrameLocks noChangeAspect="1"/>
+                  </wp:cNvGraphicFramePr>
+                  <a:graphic>
+                    <a:graphicData uri="http://schemas.openxmlformats.org/drawingml/2006/picture">
+                      <pic:pic>
+                        <pic:nvPicPr>
+                          <pic:cNvPr id="0" name="standalone-desktop-login-overseas.png"/>
+                          <pic:cNvPicPr/>
+                        </pic:nvPicPr>
+                        <pic:blipFill>
+                          <a:blip r:embed="rId27"/>
+                          <a:stretch>
+                            <a:fillRect/>
+                          </a:stretch>
+                        </pic:blipFill>
+                        <pic:spPr>
+                          <a:xfrm>
+                            <a:off x="0" y="0"/>
+                            <a:ext cx="2880360" cy="1853576"/>
+                          </a:xfrm>
+                          <a:prstGeom prst="rect"/>
+                        </pic:spPr>
+                      </pic:pic>
+                    </a:graphicData>
+                  </a:graphic>
+                </wp:inline>
+              </w:drawing>
+            </w:r>
+            <w:r>
+              <w:rPr>
+                <w:rFonts w:ascii="Microsoft YaHei" w:hAnsi="Microsoft YaHei" w:eastAsia="Microsoft YaHei"/>
+              </w:rPr>
+              <w:br/>
+            </w:r>
+            <w:r>
+              <w:rPr>
+                <w:rFonts w:ascii="Microsoft YaHei" w:hAnsi="Microsoft YaHei" w:eastAsia="Microsoft YaHei"/>
+                <w:b w:val="0"/>
+                <w:i/>
+              </w:rPr>
               <w:t>图3-14 海外电脑登录</w:t>
             </w:r>
             <w:r>
@@ -11873,7 +12083,7 @@
                 <w:b w:val="0"/>
                 <w:i w:val="0"/>
               </w:rPr>
-              <w:t>2. 底部统一协议默认未勾选：国内用户/隐私/中国移动认证三项，海外用户/隐私两项。未同意时保留二维码展示，并提示先阅读并同意协议；该码不能用于扫码授权，不得据扫码或迟到结果完成登录。扫码说明中的“盖世游戏 App”为官网下载链接。</w:t>
+              <w:t>2. 底部统一协议默认未勾选：国内用户/隐私/中国移动认证三项，海外用户/隐私两项。未同意时仍展示可扫描的登录码，允许进入手机确认页；表单、获取验证码及登录/Google入口不因未勾选而禁用。扫码本身不代表确认或登录成功。扫码说明中的“盖世游戏 App”为官网下载链接。</w:t>
             </w:r>
             <w:r>
               <w:rPr>
@@ -11901,7 +12111,7 @@
                 <w:b w:val="0"/>
                 <w:i w:val="0"/>
               </w:rPr>
-              <w:t>1. 未同意不请求验证码、不提交、不启动Google或完成扫码登录；点击协议只阅读，不替用户同意。</w:t>
+              <w:t>1. 未同意时可以填写并获取验证码。点击登录或Google入口时，未勾选先提示“请先勾选协议”，保留输入，不提交登录或启动授权；点击扫码确认登录时也校验电脑端协议，未同意显示同样提示，不确认或领取会话。点击协议只阅读，不替用户同意。</w:t>
             </w:r>
             <w:r>
               <w:rPr>
@@ -11929,7 +12139,7 @@
                 <w:b w:val="0"/>
                 <w:i w:val="0"/>
               </w:rPr>
-              <w:t>3. 勾选同意后重新生成绑定本发起端的有效登录码；本轮用已登录盖世远程移动App的我的→扫一扫扫描并确认。盖世游戏App扫码入口沿用账号体系的接入范围，实际码协议与可扫描App需联调核对，不以Demo证明兼容。二维码不是设备被控码，不继承Steam/Epic会话。</w:t>
+              <w:t>3. 初始登录码绑定本发起端，未同意也可扫描至待确认；勾选同意保留仍有效的同一码、扫码状态、输入及验证码，更新本次同意状态，无需重扫或重取验证码。撤勾使旧码和请求失效，生成新的可扫描但未同意的码，旧扫码确认不能复用。本轮用已登录盖世远程移动App的我的→扫一扫扫描并确认。盖世游戏App扫码入口沿用账号体系的接入范围，实际码协议与可扫描App需联调核对，不以Demo证明兼容。二维码不是设备被控码，不继承Steam/Epic会话。</w:t>
             </w:r>
             <w:r>
               <w:rPr>
@@ -11943,7 +12153,7 @@
                 <w:b w:val="0"/>
                 <w:i w:val="0"/>
               </w:rPr>
-              <w:t>4. Google仅海外，走渠道原授权，不收集Google密码；本端领取并核实有效会话后才获取当前UID工作区。</w:t>
+              <w:t>4. Google仅海外，同意后走渠道原授权，不收集Google密码；验证码、Google和扫码在最终异步完成/领取前均复核本次协议同意和请求有效性，取得有效会话后才获取当前UID工作区。</w:t>
             </w:r>
             <w:r>
               <w:rPr>
@@ -12344,7 +12554,7 @@
                 <w:b w:val="0"/>
                 <w:i w:val="0"/>
               </w:rPr>
-              <w:t>展示二维码并提示先同意；该码不能扫码授权。</w:t>
+              <w:t>可填写、获取验证码、点击登录入口或扫描当前码；点击登录入口/扫码确认时提示“请先勾选协议”，不完成登录。</w:t>
             </w:r>
           </w:p>
         </w:tc>
@@ -12374,7 +12584,7 @@
                 <w:b w:val="0"/>
                 <w:i w:val="0"/>
               </w:rPr>
-              <w:t>勾选同意后重新生成有效登录码；撤勾使旧码及授权失效，再显示新的未授权码。</w:t>
+              <w:t>勾选保留当前有效码、扫码状态及验证码；撤勾废弃旧码/请求并生成可扫描的新码，仍须重新同意。</w:t>
             </w:r>
           </w:p>
         </w:tc>
@@ -12439,7 +12649,7 @@
                 <w:b w:val="0"/>
                 <w:i w:val="0"/>
               </w:rPr>
-              <w:t>同意且登录码有效</w:t>
+              <w:t>登录码有效，协议可未勾选</w:t>
             </w:r>
           </w:p>
         </w:tc>
@@ -12499,7 +12709,7 @@
                 <w:b w:val="0"/>
                 <w:i w:val="0"/>
               </w:rPr>
-              <w:t>扫码后进入待手机确认。</w:t>
+              <w:t>扫码后进入待手机确认，不直接登录。</w:t>
             </w:r>
           </w:p>
         </w:tc>
@@ -12594,7 +12804,7 @@
                 <w:b w:val="0"/>
                 <w:i w:val="0"/>
               </w:rPr>
-              <w:t>提示在手机确认，可取消本次登录。</w:t>
+              <w:t>提示在手机确认，可取消本次登录；未同意时点击确认提示“请先勾选协议”，保留待确认。</w:t>
             </w:r>
           </w:p>
         </w:tc>
@@ -12624,7 +12834,7 @@
                 <w:b w:val="0"/>
                 <w:i w:val="0"/>
               </w:rPr>
-              <w:t>未确认不显示成功或设备数据。</w:t>
+              <w:t>勾选后可再次确认；未确认或未同意均不显示成功或设备数据。</w:t>
             </w:r>
           </w:p>
         </w:tc>
@@ -12689,7 +12899,7 @@
                 <w:b w:val="0"/>
                 <w:i w:val="0"/>
               </w:rPr>
-              <w:t>手机同意</w:t>
+              <w:t>电脑已同意协议，且手机确认本次登录</w:t>
             </w:r>
           </w:p>
         </w:tc>
@@ -12749,7 +12959,7 @@
                 <w:b w:val="0"/>
                 <w:i w:val="0"/>
               </w:rPr>
-              <w:t>领取并核实后才进入工作区，同一授权不可重复领取。</w:t>
+              <w:t>领取前复核协议及请求有效性，核实后才进入工作区，同一授权不可重复领取。</w:t>
             </w:r>
           </w:p>
         </w:tc>
@@ -13247,7 +13457,7 @@
               <w:drawing>
                 <wp:inline xmlns:a="http://schemas.openxmlformats.org/drawingml/2006/main" xmlns:pic="http://schemas.openxmlformats.org/drawingml/2006/picture">
                   <wp:extent cx="2880360" cy="1853576"/>
-                  <wp:docPr id="19" name="Picture 19"/>
+                  <wp:docPr id="20" name="Picture 20"/>
                   <wp:cNvGraphicFramePr>
                     <a:graphicFrameLocks noChangeAspect="1"/>
                   </wp:cNvGraphicFramePr>
@@ -13259,7 +13469,7 @@
                           <pic:cNvPicPr/>
                         </pic:nvPicPr>
                         <pic:blipFill>
-                          <a:blip r:embed="rId27"/>
+                          <a:blip r:embed="rId28"/>
                           <a:stretch>
                             <a:fillRect/>
                           </a:stretch>
@@ -13904,7 +14114,7 @@
               <w:drawing>
                 <wp:inline xmlns:a="http://schemas.openxmlformats.org/drawingml/2006/main" xmlns:pic="http://schemas.openxmlformats.org/drawingml/2006/picture">
                   <wp:extent cx="2880360" cy="1853576"/>
-                  <wp:docPr id="20" name="Picture 20"/>
+                  <wp:docPr id="21" name="Picture 21"/>
                   <wp:cNvGraphicFramePr>
                     <a:graphicFrameLocks noChangeAspect="1"/>
                   </wp:cNvGraphicFramePr>
@@ -13916,7 +14126,7 @@
                           <pic:cNvPicPr/>
                         </pic:nvPicPr>
                         <pic:blipFill>
-                          <a:blip r:embed="rId28"/>
+                          <a:blip r:embed="rId29"/>
                           <a:stretch>
                             <a:fillRect/>
                           </a:stretch>
@@ -14030,7 +14240,7 @@
                 <w:b w:val="0"/>
                 <w:i w:val="0"/>
               </w:rPr>
-              <w:t>4. 左侧为设备导航与底部“设置”入口，删除左下“这台Mac／本机未允许被控”状态块；右侧为设备内容；顶部右上显示独立账户按钮和更多按钮。更多下拉承接连接教程、帮助中心、检查更新和关于；退出登录放在账户面板昵称右侧，设置保留左侧入口，不显示手机旋转按钮。</w:t>
+              <w:t>4. 左侧为设备导航与底部“设置”入口，删除左下“这台Mac／本机未允许被控”状态块；右侧为设备内容；顶部右上显示独立账户按钮和更多按钮。更多下拉承接连接教程、帮助中心、检查更新和关于；退出登录图标放在账户面板昵称右侧，设置保留左侧入口，不显示手机旋转按钮。</w:t>
             </w:r>
             <w:r>
               <w:rPr>
@@ -14603,7 +14813,7 @@
               <w:drawing>
                 <wp:inline xmlns:a="http://schemas.openxmlformats.org/drawingml/2006/main" xmlns:pic="http://schemas.openxmlformats.org/drawingml/2006/picture">
                   <wp:extent cx="2880360" cy="1853576"/>
-                  <wp:docPr id="21" name="Picture 21"/>
+                  <wp:docPr id="22" name="Picture 22"/>
                   <wp:cNvGraphicFramePr>
                     <a:graphicFrameLocks noChangeAspect="1"/>
                   </wp:cNvGraphicFramePr>
@@ -14615,7 +14825,7 @@
                           <pic:cNvPicPr/>
                         </pic:nvPicPr>
                         <pic:blipFill>
-                          <a:blip r:embed="rId29"/>
+                          <a:blip r:embed="rId30"/>
                           <a:stretch>
                             <a:fillRect/>
                           </a:stretch>
@@ -15615,7 +15825,7 @@
               <w:drawing>
                 <wp:inline xmlns:a="http://schemas.openxmlformats.org/drawingml/2006/main" xmlns:pic="http://schemas.openxmlformats.org/drawingml/2006/picture">
                   <wp:extent cx="2880360" cy="1853576"/>
-                  <wp:docPr id="22" name="Picture 22"/>
+                  <wp:docPr id="23" name="Picture 23"/>
                   <wp:cNvGraphicFramePr>
                     <a:graphicFrameLocks noChangeAspect="1"/>
                   </wp:cNvGraphicFramePr>
@@ -15627,7 +15837,7 @@
                           <pic:cNvPicPr/>
                         </pic:nvPicPr>
                         <pic:blipFill>
-                          <a:blip r:embed="rId30"/>
+                          <a:blip r:embed="rId31"/>
                           <a:stretch>
                             <a:fillRect/>
                           </a:stretch>
@@ -16655,7 +16865,7 @@
               <w:drawing>
                 <wp:inline xmlns:a="http://schemas.openxmlformats.org/drawingml/2006/main" xmlns:pic="http://schemas.openxmlformats.org/drawingml/2006/picture">
                   <wp:extent cx="2880360" cy="1853576"/>
-                  <wp:docPr id="23" name="Picture 23"/>
+                  <wp:docPr id="24" name="Picture 24"/>
                   <wp:cNvGraphicFramePr>
                     <a:graphicFrameLocks noChangeAspect="1"/>
                   </wp:cNvGraphicFramePr>
@@ -16667,7 +16877,7 @@
                           <pic:cNvPicPr/>
                         </pic:nvPicPr>
                         <pic:blipFill>
-                          <a:blip r:embed="rId31"/>
+                          <a:blip r:embed="rId32"/>
                           <a:stretch>
                             <a:fillRect/>
                           </a:stretch>
@@ -17298,7 +17508,7 @@
               <w:drawing>
                 <wp:inline xmlns:a="http://schemas.openxmlformats.org/drawingml/2006/main" xmlns:pic="http://schemas.openxmlformats.org/drawingml/2006/picture">
                   <wp:extent cx="2880360" cy="1853576"/>
-                  <wp:docPr id="24" name="Picture 24"/>
+                  <wp:docPr id="25" name="Picture 25"/>
                   <wp:cNvGraphicFramePr>
                     <a:graphicFrameLocks noChangeAspect="1"/>
                   </wp:cNvGraphicFramePr>
@@ -17310,7 +17520,7 @@
                           <pic:cNvPicPr/>
                         </pic:nvPicPr>
                         <pic:blipFill>
-                          <a:blip r:embed="rId32"/>
+                          <a:blip r:embed="rId33"/>
                           <a:stretch>
                             <a:fillRect/>
                           </a:stretch>
@@ -17941,7 +18151,7 @@
               <w:drawing>
                 <wp:inline xmlns:a="http://schemas.openxmlformats.org/drawingml/2006/main" xmlns:pic="http://schemas.openxmlformats.org/drawingml/2006/picture">
                   <wp:extent cx="2880360" cy="1853576"/>
-                  <wp:docPr id="25" name="Picture 25"/>
+                  <wp:docPr id="26" name="Picture 26"/>
                   <wp:cNvGraphicFramePr>
                     <a:graphicFrameLocks noChangeAspect="1"/>
                   </wp:cNvGraphicFramePr>
@@ -17950,63 +18160,6 @@
                       <pic:pic>
                         <pic:nvPicPr>
                           <pic:cNvPr id="0" name="standalone-desktop-more.png"/>
-                          <pic:cNvPicPr/>
-                        </pic:nvPicPr>
-                        <pic:blipFill>
-                          <a:blip r:embed="rId33"/>
-                          <a:stretch>
-                            <a:fillRect/>
-                          </a:stretch>
-                        </pic:blipFill>
-                        <pic:spPr>
-                          <a:xfrm>
-                            <a:off x="0" y="0"/>
-                            <a:ext cx="2880360" cy="1853576"/>
-                          </a:xfrm>
-                          <a:prstGeom prst="rect"/>
-                        </pic:spPr>
-                      </pic:pic>
-                    </a:graphicData>
-                  </a:graphic>
-                </wp:inline>
-              </w:drawing>
-            </w:r>
-            <w:r>
-              <w:rPr>
-                <w:rFonts w:ascii="Microsoft YaHei" w:hAnsi="Microsoft YaHei" w:eastAsia="Microsoft YaHei"/>
-              </w:rPr>
-              <w:br/>
-            </w:r>
-            <w:r>
-              <w:rPr>
-                <w:rFonts w:ascii="Microsoft YaHei" w:hAnsi="Microsoft YaHei" w:eastAsia="Microsoft YaHei"/>
-                <w:b w:val="0"/>
-                <w:i/>
-              </w:rPr>
-              <w:t>图3-20：电脑端右上更多。</w:t>
-            </w:r>
-            <w:r>
-              <w:rPr>
-                <w:rFonts w:ascii="Microsoft YaHei" w:hAnsi="Microsoft YaHei" w:eastAsia="Microsoft YaHei"/>
-              </w:rPr>
-              <w:br/>
-            </w:r>
-            <w:r>
-              <w:rPr>
-                <w:rFonts w:ascii="Microsoft YaHei" w:hAnsi="Microsoft YaHei" w:eastAsia="Microsoft YaHei"/>
-              </w:rPr>
-              <w:drawing>
-                <wp:inline xmlns:a="http://schemas.openxmlformats.org/drawingml/2006/main" xmlns:pic="http://schemas.openxmlformats.org/drawingml/2006/picture">
-                  <wp:extent cx="2880360" cy="1853576"/>
-                  <wp:docPr id="26" name="Picture 26"/>
-                  <wp:cNvGraphicFramePr>
-                    <a:graphicFrameLocks noChangeAspect="1"/>
-                  </wp:cNvGraphicFramePr>
-                  <a:graphic>
-                    <a:graphicData uri="http://schemas.openxmlformats.org/drawingml/2006/picture">
-                      <pic:pic>
-                        <pic:nvPicPr>
-                          <pic:cNvPr id="0" name="standalone-desktop-account.png"/>
                           <pic:cNvPicPr/>
                         </pic:nvPicPr>
                         <pic:blipFill>
@@ -18040,7 +18193,7 @@
                 <w:b w:val="0"/>
                 <w:i/>
               </w:rPr>
-              <w:t>图3-20a：电脑端独立账户面板、静态头像及退出登录。</w:t>
+              <w:t>图3-20：电脑端右上更多。</w:t>
             </w:r>
             <w:r>
               <w:rPr>
@@ -18051,6 +18204,120 @@
             <w:r>
               <w:rPr>
                 <w:rFonts w:ascii="Microsoft YaHei" w:hAnsi="Microsoft YaHei" w:eastAsia="Microsoft YaHei"/>
+              </w:rPr>
+              <w:drawing>
+                <wp:inline xmlns:a="http://schemas.openxmlformats.org/drawingml/2006/main" xmlns:pic="http://schemas.openxmlformats.org/drawingml/2006/picture">
+                  <wp:extent cx="2880360" cy="1853576"/>
+                  <wp:docPr id="27" name="Picture 27"/>
+                  <wp:cNvGraphicFramePr>
+                    <a:graphicFrameLocks noChangeAspect="1"/>
+                  </wp:cNvGraphicFramePr>
+                  <a:graphic>
+                    <a:graphicData uri="http://schemas.openxmlformats.org/drawingml/2006/picture">
+                      <pic:pic>
+                        <pic:nvPicPr>
+                          <pic:cNvPr id="0" name="standalone-desktop-account.png"/>
+                          <pic:cNvPicPr/>
+                        </pic:nvPicPr>
+                        <pic:blipFill>
+                          <a:blip r:embed="rId35"/>
+                          <a:stretch>
+                            <a:fillRect/>
+                          </a:stretch>
+                        </pic:blipFill>
+                        <pic:spPr>
+                          <a:xfrm>
+                            <a:off x="0" y="0"/>
+                            <a:ext cx="2880360" cy="1853576"/>
+                          </a:xfrm>
+                          <a:prstGeom prst="rect"/>
+                        </pic:spPr>
+                      </pic:pic>
+                    </a:graphicData>
+                  </a:graphic>
+                </wp:inline>
+              </w:drawing>
+            </w:r>
+            <w:r>
+              <w:rPr>
+                <w:rFonts w:ascii="Microsoft YaHei" w:hAnsi="Microsoft YaHei" w:eastAsia="Microsoft YaHei"/>
+              </w:rPr>
+              <w:br/>
+            </w:r>
+            <w:r>
+              <w:rPr>
+                <w:rFonts w:ascii="Microsoft YaHei" w:hAnsi="Microsoft YaHei" w:eastAsia="Microsoft YaHei"/>
+                <w:b w:val="0"/>
+                <w:i/>
+              </w:rPr>
+              <w:t>图3-20a：电脑端独立账户面板、静态头像及退出图标。</w:t>
+            </w:r>
+            <w:r>
+              <w:rPr>
+                <w:rFonts w:ascii="Microsoft YaHei" w:hAnsi="Microsoft YaHei" w:eastAsia="Microsoft YaHei"/>
+              </w:rPr>
+              <w:br/>
+            </w:r>
+            <w:r>
+              <w:rPr>
+                <w:rFonts w:ascii="Microsoft YaHei" w:hAnsi="Microsoft YaHei" w:eastAsia="Microsoft YaHei"/>
+              </w:rPr>
+              <w:drawing>
+                <wp:inline xmlns:a="http://schemas.openxmlformats.org/drawingml/2006/main" xmlns:pic="http://schemas.openxmlformats.org/drawingml/2006/picture">
+                  <wp:extent cx="2880360" cy="1853576"/>
+                  <wp:docPr id="28" name="Picture 28"/>
+                  <wp:cNvGraphicFramePr>
+                    <a:graphicFrameLocks noChangeAspect="1"/>
+                  </wp:cNvGraphicFramePr>
+                  <a:graphic>
+                    <a:graphicData uri="http://schemas.openxmlformats.org/drawingml/2006/picture">
+                      <pic:pic>
+                        <pic:nvPicPr>
+                          <pic:cNvPr id="0" name="standalone-mac-logout.png"/>
+                          <pic:cNvPicPr/>
+                        </pic:nvPicPr>
+                        <pic:blipFill>
+                          <a:blip r:embed="rId36"/>
+                          <a:stretch>
+                            <a:fillRect/>
+                          </a:stretch>
+                        </pic:blipFill>
+                        <pic:spPr>
+                          <a:xfrm>
+                            <a:off x="0" y="0"/>
+                            <a:ext cx="2880360" cy="1853576"/>
+                          </a:xfrm>
+                          <a:prstGeom prst="rect"/>
+                        </pic:spPr>
+                      </pic:pic>
+                    </a:graphicData>
+                  </a:graphic>
+                </wp:inline>
+              </w:drawing>
+            </w:r>
+            <w:r>
+              <w:rPr>
+                <w:rFonts w:ascii="Microsoft YaHei" w:hAnsi="Microsoft YaHei" w:eastAsia="Microsoft YaHei"/>
+              </w:rPr>
+              <w:br/>
+            </w:r>
+            <w:r>
+              <w:rPr>
+                <w:rFonts w:ascii="Microsoft YaHei" w:hAnsi="Microsoft YaHei" w:eastAsia="Microsoft YaHei"/>
+                <w:b w:val="0"/>
+                <w:i/>
+              </w:rPr>
+              <w:t>图3-20b：当前工作区上方显示退出登录确认框。</w:t>
+            </w:r>
+            <w:r>
+              <w:rPr>
+                <w:rFonts w:ascii="Microsoft YaHei" w:hAnsi="Microsoft YaHei" w:eastAsia="Microsoft YaHei"/>
+              </w:rPr>
+              <w:br/>
+            </w:r>
+            <w:r>
+              <w:rPr>
+                <w:rFonts w:ascii="Microsoft YaHei" w:hAnsi="Microsoft YaHei" w:eastAsia="Microsoft YaHei"/>
                 <w:b/>
                 <w:i w:val="0"/>
               </w:rPr>
@@ -18110,7 +18377,7 @@
                 <w:b w:val="0"/>
                 <w:i w:val="0"/>
               </w:rPr>
-              <w:t>3. 账户面板显示静态头像、当前昵称和脱敏盖世账号，昵称右侧显示“退出登录”，不在面板底部重复放退出入口。头像不显示可点击反馈；当前Demo用演示头像，正式资料由盖世账号体系提供。</w:t>
+              <w:t>3. 账户面板显示静态头像、当前昵称和脱敏盖世账号，昵称右侧只显示退出图标，不显示退出文字；图标按钮的aria-label和title均为“退出登录”，不在面板底部重复放退出入口。头像不显示可点击反馈；当前Demo用演示头像，正式资料由盖世账号体系提供。</w:t>
             </w:r>
             <w:r>
               <w:rPr>
@@ -18166,7 +18433,21 @@
                 <w:b w:val="0"/>
                 <w:i w:val="0"/>
               </w:rPr>
-              <w:t>3. 点击账户面板昵称右侧的退出登录，结束本端会话、未完成授权和任务，清设备、选中目标、临时授权及账号缓存，回登录页并隐藏账户和更多；不退出盖世App或其他电脑；已看过的新版首次引导不重弹。再次登录按UID取数据，不恢复旧连接。</w:t>
+              <w:t>3. 点击账户面板昵称右侧退出图标，显示二次确认框：标题“退出登录？”，说明“退出后需重新登录才能访问你的设备。”，按钮“取消”和“退出登录”。打开确认框不退出账号、不清理任务。</w:t>
+            </w:r>
+            <w:r>
+              <w:rPr>
+                <w:rFonts w:ascii="Microsoft YaHei" w:hAnsi="Microsoft YaHei" w:eastAsia="Microsoft YaHei"/>
+              </w:rPr>
+              <w:br/>
+            </w:r>
+            <w:r>
+              <w:rPr>
+                <w:rFonts w:ascii="Microsoft YaHei" w:hAnsi="Microsoft YaHei" w:eastAsia="Microsoft YaHei"/>
+                <w:b w:val="0"/>
+                <w:i w:val="0"/>
+              </w:rPr>
+              <w:t>4. 点击取消或按Esc关闭确认框，保留当前账号、原工作区及进行中的任务。点击确认框的退出登录后，才结束本端会话、未完成授权和任务，清设备、选中目标、临时授权及账号缓存，回登录页并隐藏账户和更多；不退出盖世App或其他电脑；已看过的新版首次引导不重弹。再次登录按UID取数据，不恢复旧连接。</w:t>
             </w:r>
           </w:p>
         </w:tc>
@@ -18231,7 +18512,7 @@
                 <w:b w:val="0"/>
                 <w:i w:val="0"/>
               </w:rPr>
-              <w:t>进入所选页面、显示当前个人账号，或完成本端退出后显示登录页。</w:t>
+              <w:t>取消退出保留原账号、页面与任务；确认退出后显示登录页。其他入口进入所选页面或显示当前个人账号。</w:t>
             </w:r>
           </w:p>
         </w:tc>
@@ -18297,6 +18578,20 @@
                 <w:i w:val="0"/>
               </w:rPr>
               <w:t>1. 真实会话撤销、传输清理和退出后的离线记录仍待接入；页面清空不等于服务端解绑。未登录时不显示个人设备或旧账号资料。</w:t>
+            </w:r>
+            <w:r>
+              <w:rPr>
+                <w:rFonts w:ascii="Microsoft YaHei" w:hAnsi="Microsoft YaHei" w:eastAsia="Microsoft YaHei"/>
+              </w:rPr>
+              <w:br/>
+            </w:r>
+            <w:r>
+              <w:rPr>
+                <w:rFonts w:ascii="Microsoft YaHei" w:hAnsi="Microsoft YaHei" w:eastAsia="Microsoft YaHei"/>
+                <w:b w:val="0"/>
+                <w:i w:val="0"/>
+              </w:rPr>
+              <w:t>2. 本确认仅用于退出账号；退出远控会话与退出主程序继续沿用各自原规则。退出主程序不退出账号，窗口关闭仍按既有偏好执行，不新增该确认框。</w:t>
             </w:r>
           </w:p>
         </w:tc>
@@ -18522,7 +18817,7 @@
               <w:drawing>
                 <wp:inline xmlns:a="http://schemas.openxmlformats.org/drawingml/2006/main" xmlns:pic="http://schemas.openxmlformats.org/drawingml/2006/picture">
                   <wp:extent cx="2880360" cy="1853576"/>
-                  <wp:docPr id="27" name="Picture 27"/>
+                  <wp:docPr id="29" name="Picture 29"/>
                   <wp:cNvGraphicFramePr>
                     <a:graphicFrameLocks noChangeAspect="1"/>
                   </wp:cNvGraphicFramePr>
@@ -18534,7 +18829,7 @@
                           <pic:cNvPicPr/>
                         </pic:nvPicPr>
                         <pic:blipFill>
-                          <a:blip r:embed="rId35"/>
+                          <a:blip r:embed="rId37"/>
                           <a:stretch>
                             <a:fillRect/>
                           </a:stretch>
@@ -19276,7 +19571,7 @@
               <w:drawing>
                 <wp:inline xmlns:a="http://schemas.openxmlformats.org/drawingml/2006/main" xmlns:pic="http://schemas.openxmlformats.org/drawingml/2006/picture">
                   <wp:extent cx="2880360" cy="1853576"/>
-                  <wp:docPr id="28" name="Picture 28"/>
+                  <wp:docPr id="30" name="Picture 30"/>
                   <wp:cNvGraphicFramePr>
                     <a:graphicFrameLocks noChangeAspect="1"/>
                   </wp:cNvGraphicFramePr>
@@ -19288,7 +19583,7 @@
                           <pic:cNvPicPr/>
                         </pic:nvPicPr>
                         <pic:blipFill>
-                          <a:blip r:embed="rId36"/>
+                          <a:blip r:embed="rId38"/>
                           <a:stretch>
                             <a:fillRect/>
                           </a:stretch>
@@ -19905,7 +20200,7 @@
               <w:drawing>
                 <wp:inline xmlns:a="http://schemas.openxmlformats.org/drawingml/2006/main" xmlns:pic="http://schemas.openxmlformats.org/drawingml/2006/picture">
                   <wp:extent cx="2880360" cy="1853576"/>
-                  <wp:docPr id="29" name="Picture 29"/>
+                  <wp:docPr id="31" name="Picture 31"/>
                   <wp:cNvGraphicFramePr>
                     <a:graphicFrameLocks noChangeAspect="1"/>
                   </wp:cNvGraphicFramePr>
@@ -19917,7 +20212,7 @@
                           <pic:cNvPicPr/>
                         </pic:nvPicPr>
                         <pic:blipFill>
-                          <a:blip r:embed="rId37"/>
+                          <a:blip r:embed="rId39"/>
                           <a:stretch>
                             <a:fillRect/>
                           </a:stretch>
@@ -20520,7 +20815,7 @@
               <w:drawing>
                 <wp:inline xmlns:a="http://schemas.openxmlformats.org/drawingml/2006/main" xmlns:pic="http://schemas.openxmlformats.org/drawingml/2006/picture">
                   <wp:extent cx="2880360" cy="1853576"/>
-                  <wp:docPr id="30" name="Picture 30"/>
+                  <wp:docPr id="32" name="Picture 32"/>
                   <wp:cNvGraphicFramePr>
                     <a:graphicFrameLocks noChangeAspect="1"/>
                   </wp:cNvGraphicFramePr>
@@ -20532,7 +20827,7 @@
                           <pic:cNvPicPr/>
                         </pic:nvPicPr>
                         <pic:blipFill>
-                          <a:blip r:embed="rId38"/>
+                          <a:blip r:embed="rId40"/>
                           <a:stretch>
                             <a:fillRect/>
                           </a:stretch>
@@ -21494,7 +21789,7 @@
                 <w:b w:val="0"/>
                 <w:i w:val="0"/>
               </w:rPr>
-              <w:t>同意协议且真正发起验证码登录、Google/跨App授权或二维码生成请求时上报；仅阅读协议、未同意或未通过校验不记录开始，重试使用新尝试标识。</w:t>
+              <w:t>同意协议且真正提交验证码登录、发起Google/跨App授权或扫码确认请求时上报；仅输入、获取验证码、展示/扫描二维码、阅读协议或未同意拦截不记录开始，重试使用新尝试标识。</w:t>
             </w:r>
           </w:p>
         </w:tc>
@@ -22961,7 +23256,7 @@
                 <w:b w:val="0"/>
                 <w:i w:val="0"/>
               </w:rPr>
-              <w:t>国内展示用户协议、隐私协议、中国移动认证服务协议；海外用户协议及隐私协议。默认未同意；二维码可先展示，发码、授权、提交及扫码结果领取仍受本次有效同意约束；点击协议或官网下载链接不自动同意。</w:t>
+              <w:t>国内展示用户协议、隐私协议、中国移动认证服务协议；海外用户协议及隐私协议。默认未同意；允许输入、获取验证码和扫描有效二维码进入确认。登录/第三方授权入口可点击，未同意提示“请先勾选协议”且不提交或发起授权；扫码确认也受电脑端本次有效同意约束。异步完成和扫码领取前再次校验，撤勾/切区/退出隔离旧请求；点击协议或官网下载链接不自动同意。</w:t>
             </w:r>
           </w:p>
         </w:tc>
@@ -24801,7 +25096,7 @@
                 <w:b w:val="0"/>
                 <w:i w:val="0"/>
               </w:rPr>
-              <w:t>独立远程电脑-产品形态与登录链路-评审稿.md；远程电脑状态卡.md D-049～D-055</w:t>
+              <w:t>独立远程电脑-产品形态与登录链路-评审稿.md；远程电脑状态卡.md D-049～D-067</w:t>
             </w:r>
           </w:p>
         </w:tc>

</xml_diff>

<commit_message>
feat(remote): add Chinese English preview switch and simplify profile header
</commit_message>
<xml_diff>
--- a/public/streaming-mvp/独立远程电脑PRD-飞书导入版.docx
+++ b/public/streaming-mvp/独立远程电脑PRD-飞书导入版.docx
@@ -7,7 +7,7 @@
         <w:pStyle w:val="Title"/>
       </w:pPr>
       <w:r>
-        <w:t>盖世远程独立客户端与移动 App PRD V4.7</w:t>
+        <w:t>盖世远程独立客户端与移动 App PRD V4.8</w:t>
       </w:r>
     </w:p>
     <w:p>
@@ -37,7 +37,7 @@
           <w:b/>
           <w:i w:val="0"/>
         </w:rPr>
-        <w:t>飞书导入说明（2026.10.26）</w:t>
+        <w:t>飞书导入说明（2026.10.28）</w:t>
       </w:r>
       <w:r>
         <w:rPr>
@@ -1222,6 +1222,131 @@
           </w:p>
         </w:tc>
       </w:tr>
+      <w:tr>
+        <w:trPr>
+          <w:cantSplit/>
+        </w:trPr>
+        <w:tc>
+          <w:tcPr>
+            <w:tcW w:type="dxa" w:w="2592"/>
+            <w:vAlign w:val="top"/>
+            <w:tcMar>
+              <w:top w:w="80" w:type="dxa"/>
+              <w:start w:w="100" w:type="dxa"/>
+              <w:bottom w:w="80" w:type="dxa"/>
+              <w:end w:w="100" w:type="dxa"/>
+            </w:tcMar>
+          </w:tcPr>
+          <w:p>
+            <w:pPr>
+              <w:spacing w:after="40"/>
+            </w:pPr>
+            <w:r>
+              <w:rPr>
+                <w:rFonts w:ascii="Microsoft YaHei" w:hAnsi="Microsoft YaHei" w:eastAsia="Microsoft YaHei"/>
+              </w:rPr>
+            </w:r>
+            <w:r>
+              <w:rPr>
+                <w:rFonts w:ascii="Microsoft YaHei" w:hAnsi="Microsoft YaHei" w:eastAsia="Microsoft YaHei"/>
+                <w:b w:val="0"/>
+                <w:i w:val="0"/>
+              </w:rPr>
+              <w:t>2026/10/28</w:t>
+            </w:r>
+          </w:p>
+        </w:tc>
+        <w:tc>
+          <w:tcPr>
+            <w:tcW w:type="dxa" w:w="2592"/>
+            <w:vAlign w:val="top"/>
+            <w:tcMar>
+              <w:top w:w="80" w:type="dxa"/>
+              <w:start w:w="100" w:type="dxa"/>
+              <w:bottom w:w="80" w:type="dxa"/>
+              <w:end w:w="100" w:type="dxa"/>
+            </w:tcMar>
+          </w:tcPr>
+          <w:p>
+            <w:pPr>
+              <w:spacing w:after="40"/>
+            </w:pPr>
+            <w:r>
+              <w:rPr>
+                <w:rFonts w:ascii="Microsoft YaHei" w:hAnsi="Microsoft YaHei" w:eastAsia="Microsoft YaHei"/>
+              </w:rPr>
+            </w:r>
+            <w:r>
+              <w:rPr>
+                <w:rFonts w:ascii="Microsoft YaHei" w:hAnsi="Microsoft YaHei" w:eastAsia="Microsoft YaHei"/>
+                <w:b w:val="0"/>
+                <w:i w:val="0"/>
+              </w:rPr>
+              <w:t>双端Demo顶部常驻中文/English评审按钮，语言与地区独立并保持业务状态；统一模拟登录说明；移动我的移除顶部标题栏，扫一扫留右上、退出图标紧挨昵称</w:t>
+            </w:r>
+          </w:p>
+        </w:tc>
+        <w:tc>
+          <w:tcPr>
+            <w:tcW w:type="dxa" w:w="2592"/>
+            <w:vAlign w:val="top"/>
+            <w:tcMar>
+              <w:top w:w="80" w:type="dxa"/>
+              <w:start w:w="100" w:type="dxa"/>
+              <w:bottom w:w="80" w:type="dxa"/>
+              <w:end w:w="100" w:type="dxa"/>
+            </w:tcMar>
+          </w:tcPr>
+          <w:p>
+            <w:pPr>
+              <w:spacing w:after="40"/>
+            </w:pPr>
+            <w:r>
+              <w:rPr>
+                <w:rFonts w:ascii="Microsoft YaHei" w:hAnsi="Microsoft YaHei" w:eastAsia="Microsoft YaHei"/>
+              </w:rPr>
+            </w:r>
+            <w:r>
+              <w:rPr>
+                <w:rFonts w:ascii="Microsoft YaHei" w:hAnsi="Microsoft YaHei" w:eastAsia="Microsoft YaHei"/>
+                <w:b w:val="0"/>
+                <w:i w:val="0"/>
+              </w:rPr>
+              <w:t>V4.8-Draft</w:t>
+            </w:r>
+          </w:p>
+        </w:tc>
+        <w:tc>
+          <w:tcPr>
+            <w:tcW w:type="dxa" w:w="2592"/>
+            <w:vAlign w:val="top"/>
+            <w:tcMar>
+              <w:top w:w="80" w:type="dxa"/>
+              <w:start w:w="100" w:type="dxa"/>
+              <w:bottom w:w="80" w:type="dxa"/>
+              <w:end w:w="100" w:type="dxa"/>
+            </w:tcMar>
+          </w:tcPr>
+          <w:p>
+            <w:pPr>
+              <w:spacing w:after="40"/>
+            </w:pPr>
+            <w:r>
+              <w:rPr>
+                <w:rFonts w:ascii="Microsoft YaHei" w:hAnsi="Microsoft YaHei" w:eastAsia="Microsoft YaHei"/>
+              </w:rPr>
+            </w:r>
+            <w:r>
+              <w:rPr>
+                <w:rFonts w:ascii="Microsoft YaHei" w:hAnsi="Microsoft YaHei" w:eastAsia="Microsoft YaHei"/>
+                <w:b w:val="0"/>
+                <w:i w:val="0"/>
+              </w:rPr>
+              <w:t>产品</w:t>
+            </w:r>
+          </w:p>
+        </w:tc>
+      </w:tr>
     </w:tbl>
     <w:p>
       <w:pPr>
@@ -1237,7 +1362,7 @@
           <w:b w:val="0"/>
           <w:i w:val="0"/>
         </w:rPr>
-        <w:t>备注：搜2026.10.26修改（两Tab、我的、扫一扫、更新通知、昵称旁退出图标、退出二次确认、未勾协议可操作及电脑默认登录）。本稿替代 V3.10 中的游戏库入口、盖世 Mac 侧栏、默认沿用盖世登录态及首次安装引导。工作名为“盖世远程”。本期为 MVP，保留现有 Demo 远控能力，补登录、登录协议、电脑端新手引导、我的与帮助入口。国内手机号验证码、海外邮箱验证码/Google、电脑端扫码已确认；移动端保留盖世游戏 App 拉起登录，并在我的Tab提供扫一扫，用于扫描电脑端登录码，不展示供本机扫描的二维码。配图为本地 Demo，不代表登录服务或远控引擎已经接通。</w:t>
+        <w:t>备注：搜2026.10.28修改（中文/English切换、模拟登录示例与我的页布局）；搜2026.10.26修改（两Tab、我的、扫一扫、更新通知、昵称旁退出图标、退出二次确认、未勾协议可操作及电脑默认登录）。本稿替代 V3.10 中的游戏库入口、盖世 Mac 侧栏、默认沿用盖世登录态及首次安装引导。工作名为“盖世远程”。本期为 MVP，保留现有 Demo 远控能力，补登录、登录协议、电脑端新手引导、我的与帮助入口。国内手机号验证码、海外邮箱验证码/Google、电脑端扫码已确认；移动端保留盖世游戏 App 拉起登录，并在我的Tab提供扫一扫，用于扫描电脑端登录码，不展示供本机扫描的二维码。配图为本地 Demo，不代表登录服务或远控引擎已经接通。</w:t>
       </w:r>
     </w:p>
     <w:p>
@@ -1621,7 +1746,7 @@
                 <w:b w:val="0"/>
                 <w:i w:val="0"/>
               </w:rPr>
-              <w:t>无新增运营后台、商业化或地区切换设置。地区由对应发行版本/账号配置确定；Demo 的地区切换仅位于评审工具。盖世游戏 App 下载链接使用对应地区官网；独立盖世远程的正式品牌素材、下载指向与协议主体需接入。</w:t>
+              <w:t>无新增运营后台、商业化或地区切换设置。地区由对应发行版本/账号配置确定；Demo的地区切换仅位于评审工具。Demo顶部常驻“中文”“English”按钮属于外部评审控件，只切换界面语言，不切换国内/海外，不新增正式语言或地区设置页。盖世游戏 App 下载链接使用对应地区官网；独立盖世远程的正式品牌素材、下载指向与协议主体需接入。</w:t>
             </w:r>
           </w:p>
         </w:tc>
@@ -3045,6 +3170,63 @@
             <w:r>
               <w:rPr>
                 <w:rFonts w:ascii="Microsoft YaHei" w:hAnsi="Microsoft YaHei" w:eastAsia="Microsoft YaHei"/>
+              </w:rPr>
+              <w:drawing>
+                <wp:inline xmlns:a="http://schemas.openxmlformats.org/drawingml/2006/main" xmlns:pic="http://schemas.openxmlformats.org/drawingml/2006/picture">
+                  <wp:extent cx="1666190" cy="3657600"/>
+                  <wp:docPr id="4" name="Picture 4"/>
+                  <wp:cNvGraphicFramePr>
+                    <a:graphicFrameLocks noChangeAspect="1"/>
+                  </wp:cNvGraphicFramePr>
+                  <a:graphic>
+                    <a:graphicData uri="http://schemas.openxmlformats.org/drawingml/2006/picture">
+                      <pic:pic>
+                        <pic:nvPicPr>
+                          <pic:cNvPr id="0" name="standalone-mobile-login-en.png"/>
+                          <pic:cNvPicPr/>
+                        </pic:nvPicPr>
+                        <pic:blipFill>
+                          <a:blip r:embed="rId12"/>
+                          <a:stretch>
+                            <a:fillRect/>
+                          </a:stretch>
+                        </pic:blipFill>
+                        <pic:spPr>
+                          <a:xfrm>
+                            <a:off x="0" y="0"/>
+                            <a:ext cx="1666190" cy="3657600"/>
+                          </a:xfrm>
+                          <a:prstGeom prst="rect"/>
+                        </pic:spPr>
+                      </pic:pic>
+                    </a:graphicData>
+                  </a:graphic>
+                </wp:inline>
+              </w:drawing>
+            </w:r>
+            <w:r>
+              <w:rPr>
+                <w:rFonts w:ascii="Microsoft YaHei" w:hAnsi="Microsoft YaHei" w:eastAsia="Microsoft YaHei"/>
+              </w:rPr>
+              <w:br/>
+            </w:r>
+            <w:r>
+              <w:rPr>
+                <w:rFonts w:ascii="Microsoft YaHei" w:hAnsi="Microsoft YaHei" w:eastAsia="Microsoft YaHei"/>
+                <w:b w:val="0"/>
+                <w:i/>
+              </w:rPr>
+              <w:t>图3-2a：英文界面演示；登录渠道仍由独立地区配置决定。</w:t>
+            </w:r>
+            <w:r>
+              <w:rPr>
+                <w:rFonts w:ascii="Microsoft YaHei" w:hAnsi="Microsoft YaHei" w:eastAsia="Microsoft YaHei"/>
+              </w:rPr>
+              <w:br/>
+            </w:r>
+            <w:r>
+              <w:rPr>
+                <w:rFonts w:ascii="Microsoft YaHei" w:hAnsi="Microsoft YaHei" w:eastAsia="Microsoft YaHei"/>
                 <w:b/>
                 <w:i w:val="0"/>
               </w:rPr>
@@ -3076,7 +3258,7 @@
                 <w:b w:val="0"/>
                 <w:i w:val="0"/>
               </w:rPr>
-              <w:t>1. 顶部只显示盖世游戏 Logo 和“盖世远程”，删除电脑插画、宣传标题/副文案，不显示原游戏、社区、游戏库底部栏。</w:t>
+              <w:t>1. 产品登录页品牌区只显示盖世游戏 Logo 和“盖世远程”，删除电脑插画、宣传标题/副文案，不显示原游戏、社区、游戏库底部栏。</w:t>
             </w:r>
             <w:r>
               <w:rPr>
@@ -3332,7 +3514,7 @@
                 <w:b w:val="0"/>
                 <w:i w:val="0"/>
               </w:rPr>
-              <w:t>3. Demo 样例码123456，不发送短信或邮件。254字符等为演示限制，正式国家码、长度、邮箱大小写、注册判断、发送间隔和有效期需与盖世账号组件核对。</w:t>
+              <w:t>3. 统一演示示例：国内手机号13600008000，海外邮箱player@example.com，验证码123456。填写对应地区账号→点击获取验证码→填写验证码→勾选协议→点击登录；这是推荐演示顺序，未勾选时可获取验证码的规则不变。手机号/邮箱只需符合当前格式校验，不设示例账号白名单，不发送短信或邮件。254字符等为演示限制，正式国家码、长度、邮箱大小写、注册判断、发送间隔和有效期需与盖世账号组件核对。</w:t>
             </w:r>
             <w:r>
               <w:rPr>
@@ -3719,7 +3901,7 @@
               <w:drawing>
                 <wp:inline xmlns:a="http://schemas.openxmlformats.org/drawingml/2006/main" xmlns:pic="http://schemas.openxmlformats.org/drawingml/2006/picture">
                   <wp:extent cx="1790932" cy="3657600"/>
-                  <wp:docPr id="4" name="Picture 4"/>
+                  <wp:docPr id="5" name="Picture 5"/>
                   <wp:cNvGraphicFramePr>
                     <a:graphicFrameLocks noChangeAspect="1"/>
                   </wp:cNvGraphicFramePr>
@@ -3731,7 +3913,7 @@
                           <pic:cNvPicPr/>
                         </pic:nvPicPr>
                         <pic:blipFill>
-                          <a:blip r:embed="rId12"/>
+                          <a:blip r:embed="rId13"/>
                           <a:stretch>
                             <a:fillRect/>
                           </a:stretch>
@@ -4390,7 +4572,7 @@
               <w:drawing>
                 <wp:inline xmlns:a="http://schemas.openxmlformats.org/drawingml/2006/main" xmlns:pic="http://schemas.openxmlformats.org/drawingml/2006/picture">
                   <wp:extent cx="1666190" cy="3657600"/>
-                  <wp:docPr id="5" name="Picture 5"/>
+                  <wp:docPr id="6" name="Picture 6"/>
                   <wp:cNvGraphicFramePr>
                     <a:graphicFrameLocks noChangeAspect="1"/>
                   </wp:cNvGraphicFramePr>
@@ -4402,7 +4584,7 @@
                           <pic:cNvPicPr/>
                         </pic:nvPicPr>
                         <pic:blipFill>
-                          <a:blip r:embed="rId13"/>
+                          <a:blip r:embed="rId14"/>
                           <a:stretch>
                             <a:fillRect/>
                           </a:stretch>
@@ -5075,7 +5257,7 @@
               <w:drawing>
                 <wp:inline xmlns:a="http://schemas.openxmlformats.org/drawingml/2006/main" xmlns:pic="http://schemas.openxmlformats.org/drawingml/2006/picture">
                   <wp:extent cx="1790932" cy="3657600"/>
-                  <wp:docPr id="6" name="Picture 6"/>
+                  <wp:docPr id="7" name="Picture 7"/>
                   <wp:cNvGraphicFramePr>
                     <a:graphicFrameLocks noChangeAspect="1"/>
                   </wp:cNvGraphicFramePr>
@@ -5087,7 +5269,7 @@
                           <pic:cNvPicPr/>
                         </pic:nvPicPr>
                         <pic:blipFill>
-                          <a:blip r:embed="rId14"/>
+                          <a:blip r:embed="rId15"/>
                           <a:stretch>
                             <a:fillRect/>
                           </a:stretch>
@@ -6421,7 +6603,7 @@
               <w:drawing>
                 <wp:inline xmlns:a="http://schemas.openxmlformats.org/drawingml/2006/main" xmlns:pic="http://schemas.openxmlformats.org/drawingml/2006/picture">
                   <wp:extent cx="1790932" cy="3657600"/>
-                  <wp:docPr id="7" name="Picture 7"/>
+                  <wp:docPr id="8" name="Picture 8"/>
                   <wp:cNvGraphicFramePr>
                     <a:graphicFrameLocks noChangeAspect="1"/>
                   </wp:cNvGraphicFramePr>
@@ -6433,7 +6615,7 @@
                           <pic:cNvPicPr/>
                         </pic:nvPicPr>
                         <pic:blipFill>
-                          <a:blip r:embed="rId15"/>
+                          <a:blip r:embed="rId16"/>
                           <a:stretch>
                             <a:fillRect/>
                           </a:stretch>
@@ -6959,7 +7141,7 @@
               <w:drawing>
                 <wp:inline xmlns:a="http://schemas.openxmlformats.org/drawingml/2006/main" xmlns:pic="http://schemas.openxmlformats.org/drawingml/2006/picture">
                   <wp:extent cx="1790932" cy="3657600"/>
-                  <wp:docPr id="8" name="Picture 8"/>
+                  <wp:docPr id="9" name="Picture 9"/>
                   <wp:cNvGraphicFramePr>
                     <a:graphicFrameLocks noChangeAspect="1"/>
                   </wp:cNvGraphicFramePr>
@@ -6971,7 +7153,7 @@
                           <pic:cNvPicPr/>
                         </pic:nvPicPr>
                         <pic:blipFill>
-                          <a:blip r:embed="rId16"/>
+                          <a:blip r:embed="rId17"/>
                           <a:stretch>
                             <a:fillRect/>
                           </a:stretch>
@@ -7476,7 +7658,7 @@
               <w:drawing>
                 <wp:inline xmlns:a="http://schemas.openxmlformats.org/drawingml/2006/main" xmlns:pic="http://schemas.openxmlformats.org/drawingml/2006/picture">
                   <wp:extent cx="1790932" cy="3657600"/>
-                  <wp:docPr id="9" name="Picture 9"/>
+                  <wp:docPr id="10" name="Picture 10"/>
                   <wp:cNvGraphicFramePr>
                     <a:graphicFrameLocks noChangeAspect="1"/>
                   </wp:cNvGraphicFramePr>
@@ -7488,7 +7670,7 @@
                           <pic:cNvPicPr/>
                         </pic:nvPicPr>
                         <pic:blipFill>
-                          <a:blip r:embed="rId17"/>
+                          <a:blip r:embed="rId18"/>
                           <a:stretch>
                             <a:fillRect/>
                           </a:stretch>
@@ -8119,7 +8301,7 @@
               <w:drawing>
                 <wp:inline xmlns:a="http://schemas.openxmlformats.org/drawingml/2006/main" xmlns:pic="http://schemas.openxmlformats.org/drawingml/2006/picture">
                   <wp:extent cx="1666190" cy="3657600"/>
-                  <wp:docPr id="10" name="Picture 10"/>
+                  <wp:docPr id="11" name="Picture 11"/>
                   <wp:cNvGraphicFramePr>
                     <a:graphicFrameLocks noChangeAspect="1"/>
                   </wp:cNvGraphicFramePr>
@@ -8128,63 +8310,6 @@
                       <pic:pic>
                         <pic:nvPicPr>
                           <pic:cNvPr id="0" name="standalone-mobile-profile.png"/>
-                          <pic:cNvPicPr/>
-                        </pic:nvPicPr>
-                        <pic:blipFill>
-                          <a:blip r:embed="rId18"/>
-                          <a:stretch>
-                            <a:fillRect/>
-                          </a:stretch>
-                        </pic:blipFill>
-                        <pic:spPr>
-                          <a:xfrm>
-                            <a:off x="0" y="0"/>
-                            <a:ext cx="1666190" cy="3657600"/>
-                          </a:xfrm>
-                          <a:prstGeom prst="rect"/>
-                        </pic:spPr>
-                      </pic:pic>
-                    </a:graphicData>
-                  </a:graphic>
-                </wp:inline>
-              </w:drawing>
-            </w:r>
-            <w:r>
-              <w:rPr>
-                <w:rFonts w:ascii="Microsoft YaHei" w:hAnsi="Microsoft YaHei" w:eastAsia="Microsoft YaHei"/>
-              </w:rPr>
-              <w:br/>
-            </w:r>
-            <w:r>
-              <w:rPr>
-                <w:rFonts w:ascii="Microsoft YaHei" w:hAnsi="Microsoft YaHei" w:eastAsia="Microsoft YaHei"/>
-                <w:b w:val="0"/>
-                <w:i/>
-              </w:rPr>
-              <w:t>图3-10：我的；昵称右侧退出图标、右上扫一扫，以及帮助中心、检查更新和关于。</w:t>
-            </w:r>
-            <w:r>
-              <w:rPr>
-                <w:rFonts w:ascii="Microsoft YaHei" w:hAnsi="Microsoft YaHei" w:eastAsia="Microsoft YaHei"/>
-              </w:rPr>
-              <w:br/>
-            </w:r>
-            <w:r>
-              <w:rPr>
-                <w:rFonts w:ascii="Microsoft YaHei" w:hAnsi="Microsoft YaHei" w:eastAsia="Microsoft YaHei"/>
-              </w:rPr>
-              <w:drawing>
-                <wp:inline xmlns:a="http://schemas.openxmlformats.org/drawingml/2006/main" xmlns:pic="http://schemas.openxmlformats.org/drawingml/2006/picture">
-                  <wp:extent cx="1666190" cy="3657600"/>
-                  <wp:docPr id="11" name="Picture 11"/>
-                  <wp:cNvGraphicFramePr>
-                    <a:graphicFrameLocks noChangeAspect="1"/>
-                  </wp:cNvGraphicFramePr>
-                  <a:graphic>
-                    <a:graphicData uri="http://schemas.openxmlformats.org/drawingml/2006/picture">
-                      <pic:pic>
-                        <pic:nvPicPr>
-                          <pic:cNvPr id="0" name="standalone-mobile-logout.png"/>
                           <pic:cNvPicPr/>
                         </pic:nvPicPr>
                         <pic:blipFill>
@@ -8218,6 +8343,63 @@
                 <w:b w:val="0"/>
                 <w:i/>
               </w:rPr>
+              <w:t>图3-10：我的；无顶部标题栏，退出图标紧挨昵称右侧、扫一扫位于右上，其下为帮助中心、检查更新和关于。</w:t>
+            </w:r>
+            <w:r>
+              <w:rPr>
+                <w:rFonts w:ascii="Microsoft YaHei" w:hAnsi="Microsoft YaHei" w:eastAsia="Microsoft YaHei"/>
+              </w:rPr>
+              <w:br/>
+            </w:r>
+            <w:r>
+              <w:rPr>
+                <w:rFonts w:ascii="Microsoft YaHei" w:hAnsi="Microsoft YaHei" w:eastAsia="Microsoft YaHei"/>
+              </w:rPr>
+              <w:drawing>
+                <wp:inline xmlns:a="http://schemas.openxmlformats.org/drawingml/2006/main" xmlns:pic="http://schemas.openxmlformats.org/drawingml/2006/picture">
+                  <wp:extent cx="1666190" cy="3657600"/>
+                  <wp:docPr id="12" name="Picture 12"/>
+                  <wp:cNvGraphicFramePr>
+                    <a:graphicFrameLocks noChangeAspect="1"/>
+                  </wp:cNvGraphicFramePr>
+                  <a:graphic>
+                    <a:graphicData uri="http://schemas.openxmlformats.org/drawingml/2006/picture">
+                      <pic:pic>
+                        <pic:nvPicPr>
+                          <pic:cNvPr id="0" name="standalone-mobile-logout.png"/>
+                          <pic:cNvPicPr/>
+                        </pic:nvPicPr>
+                        <pic:blipFill>
+                          <a:blip r:embed="rId20"/>
+                          <a:stretch>
+                            <a:fillRect/>
+                          </a:stretch>
+                        </pic:blipFill>
+                        <pic:spPr>
+                          <a:xfrm>
+                            <a:off x="0" y="0"/>
+                            <a:ext cx="1666190" cy="3657600"/>
+                          </a:xfrm>
+                          <a:prstGeom prst="rect"/>
+                        </pic:spPr>
+                      </pic:pic>
+                    </a:graphicData>
+                  </a:graphic>
+                </wp:inline>
+              </w:drawing>
+            </w:r>
+            <w:r>
+              <w:rPr>
+                <w:rFonts w:ascii="Microsoft YaHei" w:hAnsi="Microsoft YaHei" w:eastAsia="Microsoft YaHei"/>
+              </w:rPr>
+              <w:br/>
+            </w:r>
+            <w:r>
+              <w:rPr>
+                <w:rFonts w:ascii="Microsoft YaHei" w:hAnsi="Microsoft YaHei" w:eastAsia="Microsoft YaHei"/>
+                <w:b w:val="0"/>
+                <w:i/>
+              </w:rPr>
               <w:t>图3-10a：我的页上方显示退出登录确认框。</w:t>
             </w:r>
             <w:r>
@@ -8260,7 +8442,7 @@
                 <w:b w:val="0"/>
                 <w:i w:val="0"/>
               </w:rPr>
-              <w:t>1. 页面标题为“我的”，右上显示扫一扫；账号区显示头像、昵称和脱敏账号，昵称右侧只显示退出图标，不显示退出文字；图标按钮的aria-label和title均为“退出登录”。除退出按钮外，头像和账号资料静态展示，不显示右箭头，不作为按钮或入口。</w:t>
+              <w:t>1. 不显示顶部“我的”标题及其标题栏，右上保留扫一扫；账号区显示头像、昵称和脱敏账号，退出图标紧挨昵称右侧，不放在整行最右端，不显示退出文字；图标按钮的aria-label和title均为“退出登录”。除退出按钮外，头像和账号资料静态展示，不显示右箭头，不作为按钮或入口。</w:t>
             </w:r>
             <w:r>
               <w:rPr>
@@ -8756,7 +8938,7 @@
               <w:drawing>
                 <wp:inline xmlns:a="http://schemas.openxmlformats.org/drawingml/2006/main" xmlns:pic="http://schemas.openxmlformats.org/drawingml/2006/picture">
                   <wp:extent cx="1666190" cy="3657600"/>
-                  <wp:docPr id="12" name="Picture 12"/>
+                  <wp:docPr id="13" name="Picture 13"/>
                   <wp:cNvGraphicFramePr>
                     <a:graphicFrameLocks noChangeAspect="1"/>
                   </wp:cNvGraphicFramePr>
@@ -8768,7 +8950,7 @@
                           <pic:cNvPicPr/>
                         </pic:nvPicPr>
                         <pic:blipFill>
-                          <a:blip r:embed="rId20"/>
+                          <a:blip r:embed="rId21"/>
                           <a:stretch>
                             <a:fillRect/>
                           </a:stretch>
@@ -9315,7 +9497,7 @@
               <w:drawing>
                 <wp:inline xmlns:a="http://schemas.openxmlformats.org/drawingml/2006/main" xmlns:pic="http://schemas.openxmlformats.org/drawingml/2006/picture">
                   <wp:extent cx="1666190" cy="3657600"/>
-                  <wp:docPr id="13" name="Picture 13"/>
+                  <wp:docPr id="14" name="Picture 14"/>
                   <wp:cNvGraphicFramePr>
                     <a:graphicFrameLocks noChangeAspect="1"/>
                   </wp:cNvGraphicFramePr>
@@ -9327,7 +9509,7 @@
                           <pic:cNvPicPr/>
                         </pic:nvPicPr>
                         <pic:blipFill>
-                          <a:blip r:embed="rId21"/>
+                          <a:blip r:embed="rId22"/>
                           <a:stretch>
                             <a:fillRect/>
                           </a:stretch>
@@ -9958,7 +10140,7 @@
               <w:drawing>
                 <wp:inline xmlns:a="http://schemas.openxmlformats.org/drawingml/2006/main" xmlns:pic="http://schemas.openxmlformats.org/drawingml/2006/picture">
                   <wp:extent cx="1666190" cy="3657600"/>
-                  <wp:docPr id="14" name="Picture 14"/>
+                  <wp:docPr id="15" name="Picture 15"/>
                   <wp:cNvGraphicFramePr>
                     <a:graphicFrameLocks noChangeAspect="1"/>
                   </wp:cNvGraphicFramePr>
@@ -9970,7 +10152,7 @@
                           <pic:cNvPicPr/>
                         </pic:nvPicPr>
                         <pic:blipFill>
-                          <a:blip r:embed="rId22"/>
+                          <a:blip r:embed="rId23"/>
                           <a:stretch>
                             <a:fillRect/>
                           </a:stretch>
@@ -10573,7 +10755,7 @@
               <w:drawing>
                 <wp:inline xmlns:a="http://schemas.openxmlformats.org/drawingml/2006/main" xmlns:pic="http://schemas.openxmlformats.org/drawingml/2006/picture">
                   <wp:extent cx="1666190" cy="3657600"/>
-                  <wp:docPr id="15" name="Picture 15"/>
+                  <wp:docPr id="16" name="Picture 16"/>
                   <wp:cNvGraphicFramePr>
                     <a:graphicFrameLocks noChangeAspect="1"/>
                   </wp:cNvGraphicFramePr>
@@ -10585,7 +10767,7 @@
                           <pic:cNvPicPr/>
                         </pic:nvPicPr>
                         <pic:blipFill>
-                          <a:blip r:embed="rId23"/>
+                          <a:blip r:embed="rId24"/>
                           <a:stretch>
                             <a:fillRect/>
                           </a:stretch>
@@ -11188,7 +11370,7 @@
               <w:drawing>
                 <wp:inline xmlns:a="http://schemas.openxmlformats.org/drawingml/2006/main" xmlns:pic="http://schemas.openxmlformats.org/drawingml/2006/picture">
                   <wp:extent cx="1666190" cy="3657600"/>
-                  <wp:docPr id="16" name="Picture 16"/>
+                  <wp:docPr id="17" name="Picture 17"/>
                   <wp:cNvGraphicFramePr>
                     <a:graphicFrameLocks noChangeAspect="1"/>
                   </wp:cNvGraphicFramePr>
@@ -11200,7 +11382,7 @@
                           <pic:cNvPicPr/>
                         </pic:nvPicPr>
                         <pic:blipFill>
-                          <a:blip r:embed="rId24"/>
+                          <a:blip r:embed="rId25"/>
                           <a:stretch>
                             <a:fillRect/>
                           </a:stretch>
@@ -11245,7 +11427,7 @@
               <w:drawing>
                 <wp:inline xmlns:a="http://schemas.openxmlformats.org/drawingml/2006/main" xmlns:pic="http://schemas.openxmlformats.org/drawingml/2006/picture">
                   <wp:extent cx="1666190" cy="3657600"/>
-                  <wp:docPr id="17" name="Picture 17"/>
+                  <wp:docPr id="18" name="Picture 18"/>
                   <wp:cNvGraphicFramePr>
                     <a:graphicFrameLocks noChangeAspect="1"/>
                   </wp:cNvGraphicFramePr>
@@ -11257,7 +11439,7 @@
                           <pic:cNvPicPr/>
                         </pic:nvPicPr>
                         <pic:blipFill>
-                          <a:blip r:embed="rId25"/>
+                          <a:blip r:embed="rId26"/>
                           <a:stretch>
                             <a:fillRect/>
                           </a:stretch>
@@ -11928,7 +12110,7 @@
               <w:drawing>
                 <wp:inline xmlns:a="http://schemas.openxmlformats.org/drawingml/2006/main" xmlns:pic="http://schemas.openxmlformats.org/drawingml/2006/picture">
                   <wp:extent cx="2880360" cy="1853576"/>
-                  <wp:docPr id="18" name="Picture 18"/>
+                  <wp:docPr id="19" name="Picture 19"/>
                   <wp:cNvGraphicFramePr>
                     <a:graphicFrameLocks noChangeAspect="1"/>
                   </wp:cNvGraphicFramePr>
@@ -11937,63 +12119,6 @@
                       <pic:pic>
                         <pic:nvPicPr>
                           <pic:cNvPr id="0" name="standalone-desktop-login.png"/>
-                          <pic:cNvPicPr/>
-                        </pic:nvPicPr>
-                        <pic:blipFill>
-                          <a:blip r:embed="rId26"/>
-                          <a:stretch>
-                            <a:fillRect/>
-                          </a:stretch>
-                        </pic:blipFill>
-                        <pic:spPr>
-                          <a:xfrm>
-                            <a:off x="0" y="0"/>
-                            <a:ext cx="2880360" cy="1853576"/>
-                          </a:xfrm>
-                          <a:prstGeom prst="rect"/>
-                        </pic:spPr>
-                      </pic:pic>
-                    </a:graphicData>
-                  </a:graphic>
-                </wp:inline>
-              </w:drawing>
-            </w:r>
-            <w:r>
-              <w:rPr>
-                <w:rFonts w:ascii="Microsoft YaHei" w:hAnsi="Microsoft YaHei" w:eastAsia="Microsoft YaHei"/>
-              </w:rPr>
-              <w:br/>
-            </w:r>
-            <w:r>
-              <w:rPr>
-                <w:rFonts w:ascii="Microsoft YaHei" w:hAnsi="Microsoft YaHei" w:eastAsia="Microsoft YaHei"/>
-                <w:b w:val="0"/>
-                <w:i/>
-              </w:rPr>
-              <w:t>图3-13 国内电脑登录</w:t>
-            </w:r>
-            <w:r>
-              <w:rPr>
-                <w:rFonts w:ascii="Microsoft YaHei" w:hAnsi="Microsoft YaHei" w:eastAsia="Microsoft YaHei"/>
-              </w:rPr>
-              <w:br/>
-            </w:r>
-            <w:r>
-              <w:rPr>
-                <w:rFonts w:ascii="Microsoft YaHei" w:hAnsi="Microsoft YaHei" w:eastAsia="Microsoft YaHei"/>
-              </w:rPr>
-              <w:drawing>
-                <wp:inline xmlns:a="http://schemas.openxmlformats.org/drawingml/2006/main" xmlns:pic="http://schemas.openxmlformats.org/drawingml/2006/picture">
-                  <wp:extent cx="2880360" cy="1853576"/>
-                  <wp:docPr id="19" name="Picture 19"/>
-                  <wp:cNvGraphicFramePr>
-                    <a:graphicFrameLocks noChangeAspect="1"/>
-                  </wp:cNvGraphicFramePr>
-                  <a:graphic>
-                    <a:graphicData uri="http://schemas.openxmlformats.org/drawingml/2006/picture">
-                      <pic:pic>
-                        <pic:nvPicPr>
-                          <pic:cNvPr id="0" name="standalone-desktop-login-overseas.png"/>
                           <pic:cNvPicPr/>
                         </pic:nvPicPr>
                         <pic:blipFill>
@@ -12027,6 +12152,63 @@
                 <w:b w:val="0"/>
                 <w:i/>
               </w:rPr>
+              <w:t>图3-13 国内电脑登录</w:t>
+            </w:r>
+            <w:r>
+              <w:rPr>
+                <w:rFonts w:ascii="Microsoft YaHei" w:hAnsi="Microsoft YaHei" w:eastAsia="Microsoft YaHei"/>
+              </w:rPr>
+              <w:br/>
+            </w:r>
+            <w:r>
+              <w:rPr>
+                <w:rFonts w:ascii="Microsoft YaHei" w:hAnsi="Microsoft YaHei" w:eastAsia="Microsoft YaHei"/>
+              </w:rPr>
+              <w:drawing>
+                <wp:inline xmlns:a="http://schemas.openxmlformats.org/drawingml/2006/main" xmlns:pic="http://schemas.openxmlformats.org/drawingml/2006/picture">
+                  <wp:extent cx="2880360" cy="1853576"/>
+                  <wp:docPr id="20" name="Picture 20"/>
+                  <wp:cNvGraphicFramePr>
+                    <a:graphicFrameLocks noChangeAspect="1"/>
+                  </wp:cNvGraphicFramePr>
+                  <a:graphic>
+                    <a:graphicData uri="http://schemas.openxmlformats.org/drawingml/2006/picture">
+                      <pic:pic>
+                        <pic:nvPicPr>
+                          <pic:cNvPr id="0" name="standalone-desktop-login-overseas.png"/>
+                          <pic:cNvPicPr/>
+                        </pic:nvPicPr>
+                        <pic:blipFill>
+                          <a:blip r:embed="rId28"/>
+                          <a:stretch>
+                            <a:fillRect/>
+                          </a:stretch>
+                        </pic:blipFill>
+                        <pic:spPr>
+                          <a:xfrm>
+                            <a:off x="0" y="0"/>
+                            <a:ext cx="2880360" cy="1853576"/>
+                          </a:xfrm>
+                          <a:prstGeom prst="rect"/>
+                        </pic:spPr>
+                      </pic:pic>
+                    </a:graphicData>
+                  </a:graphic>
+                </wp:inline>
+              </w:drawing>
+            </w:r>
+            <w:r>
+              <w:rPr>
+                <w:rFonts w:ascii="Microsoft YaHei" w:hAnsi="Microsoft YaHei" w:eastAsia="Microsoft YaHei"/>
+              </w:rPr>
+              <w:br/>
+            </w:r>
+            <w:r>
+              <w:rPr>
+                <w:rFonts w:ascii="Microsoft YaHei" w:hAnsi="Microsoft YaHei" w:eastAsia="Microsoft YaHei"/>
+                <w:b w:val="0"/>
+                <w:i/>
+              </w:rPr>
               <w:t>图3-14 海外电脑登录</w:t>
             </w:r>
             <w:r>
@@ -12038,6 +12220,63 @@
             <w:r>
               <w:rPr>
                 <w:rFonts w:ascii="Microsoft YaHei" w:hAnsi="Microsoft YaHei" w:eastAsia="Microsoft YaHei"/>
+              </w:rPr>
+              <w:drawing>
+                <wp:inline xmlns:a="http://schemas.openxmlformats.org/drawingml/2006/main" xmlns:pic="http://schemas.openxmlformats.org/drawingml/2006/picture">
+                  <wp:extent cx="2880360" cy="1853576"/>
+                  <wp:docPr id="21" name="Picture 21"/>
+                  <wp:cNvGraphicFramePr>
+                    <a:graphicFrameLocks noChangeAspect="1"/>
+                  </wp:cNvGraphicFramePr>
+                  <a:graphic>
+                    <a:graphicData uri="http://schemas.openxmlformats.org/drawingml/2006/picture">
+                      <pic:pic>
+                        <pic:nvPicPr>
+                          <pic:cNvPr id="0" name="standalone-desktop-login-en.png"/>
+                          <pic:cNvPicPr/>
+                        </pic:nvPicPr>
+                        <pic:blipFill>
+                          <a:blip r:embed="rId29"/>
+                          <a:stretch>
+                            <a:fillRect/>
+                          </a:stretch>
+                        </pic:blipFill>
+                        <pic:spPr>
+                          <a:xfrm>
+                            <a:off x="0" y="0"/>
+                            <a:ext cx="2880360" cy="1853576"/>
+                          </a:xfrm>
+                          <a:prstGeom prst="rect"/>
+                        </pic:spPr>
+                      </pic:pic>
+                    </a:graphicData>
+                  </a:graphic>
+                </wp:inline>
+              </w:drawing>
+            </w:r>
+            <w:r>
+              <w:rPr>
+                <w:rFonts w:ascii="Microsoft YaHei" w:hAnsi="Microsoft YaHei" w:eastAsia="Microsoft YaHei"/>
+              </w:rPr>
+              <w:br/>
+            </w:r>
+            <w:r>
+              <w:rPr>
+                <w:rFonts w:ascii="Microsoft YaHei" w:hAnsi="Microsoft YaHei" w:eastAsia="Microsoft YaHei"/>
+                <w:b w:val="0"/>
+                <w:i/>
+              </w:rPr>
+              <w:t>图3-14a：英文界面演示；语言切换不改变地区、二维码或表单状态。</w:t>
+            </w:r>
+            <w:r>
+              <w:rPr>
+                <w:rFonts w:ascii="Microsoft YaHei" w:hAnsi="Microsoft YaHei" w:eastAsia="Microsoft YaHei"/>
+              </w:rPr>
+              <w:br/>
+            </w:r>
+            <w:r>
+              <w:rPr>
+                <w:rFonts w:ascii="Microsoft YaHei" w:hAnsi="Microsoft YaHei" w:eastAsia="Microsoft YaHei"/>
                 <w:b/>
                 <w:i w:val="0"/>
               </w:rPr>
@@ -12125,7 +12364,7 @@
                 <w:b w:val="0"/>
                 <w:i w:val="0"/>
               </w:rPr>
-              <w:t>2. 国内Demo为+86、11位手机号；海外邮箱最多254字符，去首尾空格后校验格式；验证码最多6位数字。空值/格式错不发送、不提交；未发送、错误或失效不登录。样例码123456，不发送短信邮件；正式规则复用盖世组件并核对。</w:t>
+              <w:t>2. 国内Demo为+86、11位手机号；海外邮箱最多254字符，去首尾空格后校验格式；验证码最多6位数字。空值/格式错不发送、不提交；未发送、错误或失效不登录。统一演示使用国内手机号13600008000或海外邮箱player@example.com，先获取验证码、填写123456、勾选协议再登录；不发送短信邮件，符合当前格式的其他手机号/邮箱也可模拟登录，不设账号白名单。Mac既有sr-fill填入的13800138000/demo@gamehub.test同样可用。正式规则复用盖世组件并核对。</w:t>
             </w:r>
             <w:r>
               <w:rPr>
@@ -13457,7 +13696,7 @@
               <w:drawing>
                 <wp:inline xmlns:a="http://schemas.openxmlformats.org/drawingml/2006/main" xmlns:pic="http://schemas.openxmlformats.org/drawingml/2006/picture">
                   <wp:extent cx="2880360" cy="1853576"/>
-                  <wp:docPr id="20" name="Picture 20"/>
+                  <wp:docPr id="22" name="Picture 22"/>
                   <wp:cNvGraphicFramePr>
                     <a:graphicFrameLocks noChangeAspect="1"/>
                   </wp:cNvGraphicFramePr>
@@ -13469,7 +13708,7 @@
                           <pic:cNvPicPr/>
                         </pic:nvPicPr>
                         <pic:blipFill>
-                          <a:blip r:embed="rId28"/>
+                          <a:blip r:embed="rId30"/>
                           <a:stretch>
                             <a:fillRect/>
                           </a:stretch>
@@ -14114,7 +14353,7 @@
               <w:drawing>
                 <wp:inline xmlns:a="http://schemas.openxmlformats.org/drawingml/2006/main" xmlns:pic="http://schemas.openxmlformats.org/drawingml/2006/picture">
                   <wp:extent cx="2880360" cy="1853576"/>
-                  <wp:docPr id="21" name="Picture 21"/>
+                  <wp:docPr id="23" name="Picture 23"/>
                   <wp:cNvGraphicFramePr>
                     <a:graphicFrameLocks noChangeAspect="1"/>
                   </wp:cNvGraphicFramePr>
@@ -14126,7 +14365,7 @@
                           <pic:cNvPicPr/>
                         </pic:nvPicPr>
                         <pic:blipFill>
-                          <a:blip r:embed="rId29"/>
+                          <a:blip r:embed="rId31"/>
                           <a:stretch>
                             <a:fillRect/>
                           </a:stretch>
@@ -14813,7 +15052,7 @@
               <w:drawing>
                 <wp:inline xmlns:a="http://schemas.openxmlformats.org/drawingml/2006/main" xmlns:pic="http://schemas.openxmlformats.org/drawingml/2006/picture">
                   <wp:extent cx="2880360" cy="1853576"/>
-                  <wp:docPr id="22" name="Picture 22"/>
+                  <wp:docPr id="24" name="Picture 24"/>
                   <wp:cNvGraphicFramePr>
                     <a:graphicFrameLocks noChangeAspect="1"/>
                   </wp:cNvGraphicFramePr>
@@ -14825,7 +15064,7 @@
                           <pic:cNvPicPr/>
                         </pic:nvPicPr>
                         <pic:blipFill>
-                          <a:blip r:embed="rId30"/>
+                          <a:blip r:embed="rId32"/>
                           <a:stretch>
                             <a:fillRect/>
                           </a:stretch>
@@ -15825,7 +16064,7 @@
               <w:drawing>
                 <wp:inline xmlns:a="http://schemas.openxmlformats.org/drawingml/2006/main" xmlns:pic="http://schemas.openxmlformats.org/drawingml/2006/picture">
                   <wp:extent cx="2880360" cy="1853576"/>
-                  <wp:docPr id="23" name="Picture 23"/>
+                  <wp:docPr id="25" name="Picture 25"/>
                   <wp:cNvGraphicFramePr>
                     <a:graphicFrameLocks noChangeAspect="1"/>
                   </wp:cNvGraphicFramePr>
@@ -15837,7 +16076,7 @@
                           <pic:cNvPicPr/>
                         </pic:nvPicPr>
                         <pic:blipFill>
-                          <a:blip r:embed="rId31"/>
+                          <a:blip r:embed="rId33"/>
                           <a:stretch>
                             <a:fillRect/>
                           </a:stretch>
@@ -16865,7 +17104,7 @@
               <w:drawing>
                 <wp:inline xmlns:a="http://schemas.openxmlformats.org/drawingml/2006/main" xmlns:pic="http://schemas.openxmlformats.org/drawingml/2006/picture">
                   <wp:extent cx="2880360" cy="1853576"/>
-                  <wp:docPr id="24" name="Picture 24"/>
+                  <wp:docPr id="26" name="Picture 26"/>
                   <wp:cNvGraphicFramePr>
                     <a:graphicFrameLocks noChangeAspect="1"/>
                   </wp:cNvGraphicFramePr>
@@ -16877,7 +17116,7 @@
                           <pic:cNvPicPr/>
                         </pic:nvPicPr>
                         <pic:blipFill>
-                          <a:blip r:embed="rId32"/>
+                          <a:blip r:embed="rId34"/>
                           <a:stretch>
                             <a:fillRect/>
                           </a:stretch>
@@ -17508,7 +17747,7 @@
               <w:drawing>
                 <wp:inline xmlns:a="http://schemas.openxmlformats.org/drawingml/2006/main" xmlns:pic="http://schemas.openxmlformats.org/drawingml/2006/picture">
                   <wp:extent cx="2880360" cy="1853576"/>
-                  <wp:docPr id="25" name="Picture 25"/>
+                  <wp:docPr id="27" name="Picture 27"/>
                   <wp:cNvGraphicFramePr>
                     <a:graphicFrameLocks noChangeAspect="1"/>
                   </wp:cNvGraphicFramePr>
@@ -17520,7 +17759,7 @@
                           <pic:cNvPicPr/>
                         </pic:nvPicPr>
                         <pic:blipFill>
-                          <a:blip r:embed="rId33"/>
+                          <a:blip r:embed="rId35"/>
                           <a:stretch>
                             <a:fillRect/>
                           </a:stretch>
@@ -18151,7 +18390,7 @@
               <w:drawing>
                 <wp:inline xmlns:a="http://schemas.openxmlformats.org/drawingml/2006/main" xmlns:pic="http://schemas.openxmlformats.org/drawingml/2006/picture">
                   <wp:extent cx="2880360" cy="1853576"/>
-                  <wp:docPr id="26" name="Picture 26"/>
+                  <wp:docPr id="28" name="Picture 28"/>
                   <wp:cNvGraphicFramePr>
                     <a:graphicFrameLocks noChangeAspect="1"/>
                   </wp:cNvGraphicFramePr>
@@ -18163,7 +18402,7 @@
                           <pic:cNvPicPr/>
                         </pic:nvPicPr>
                         <pic:blipFill>
-                          <a:blip r:embed="rId34"/>
+                          <a:blip r:embed="rId36"/>
                           <a:stretch>
                             <a:fillRect/>
                           </a:stretch>
@@ -18208,7 +18447,7 @@
               <w:drawing>
                 <wp:inline xmlns:a="http://schemas.openxmlformats.org/drawingml/2006/main" xmlns:pic="http://schemas.openxmlformats.org/drawingml/2006/picture">
                   <wp:extent cx="2880360" cy="1853576"/>
-                  <wp:docPr id="27" name="Picture 27"/>
+                  <wp:docPr id="29" name="Picture 29"/>
                   <wp:cNvGraphicFramePr>
                     <a:graphicFrameLocks noChangeAspect="1"/>
                   </wp:cNvGraphicFramePr>
@@ -18220,7 +18459,7 @@
                           <pic:cNvPicPr/>
                         </pic:nvPicPr>
                         <pic:blipFill>
-                          <a:blip r:embed="rId35"/>
+                          <a:blip r:embed="rId37"/>
                           <a:stretch>
                             <a:fillRect/>
                           </a:stretch>
@@ -18265,7 +18504,7 @@
               <w:drawing>
                 <wp:inline xmlns:a="http://schemas.openxmlformats.org/drawingml/2006/main" xmlns:pic="http://schemas.openxmlformats.org/drawingml/2006/picture">
                   <wp:extent cx="2880360" cy="1853576"/>
-                  <wp:docPr id="28" name="Picture 28"/>
+                  <wp:docPr id="30" name="Picture 30"/>
                   <wp:cNvGraphicFramePr>
                     <a:graphicFrameLocks noChangeAspect="1"/>
                   </wp:cNvGraphicFramePr>
@@ -18277,7 +18516,7 @@
                           <pic:cNvPicPr/>
                         </pic:nvPicPr>
                         <pic:blipFill>
-                          <a:blip r:embed="rId36"/>
+                          <a:blip r:embed="rId38"/>
                           <a:stretch>
                             <a:fillRect/>
                           </a:stretch>
@@ -18817,7 +19056,7 @@
               <w:drawing>
                 <wp:inline xmlns:a="http://schemas.openxmlformats.org/drawingml/2006/main" xmlns:pic="http://schemas.openxmlformats.org/drawingml/2006/picture">
                   <wp:extent cx="2880360" cy="1853576"/>
-                  <wp:docPr id="29" name="Picture 29"/>
+                  <wp:docPr id="31" name="Picture 31"/>
                   <wp:cNvGraphicFramePr>
                     <a:graphicFrameLocks noChangeAspect="1"/>
                   </wp:cNvGraphicFramePr>
@@ -18829,7 +19068,7 @@
                           <pic:cNvPicPr/>
                         </pic:nvPicPr>
                         <pic:blipFill>
-                          <a:blip r:embed="rId37"/>
+                          <a:blip r:embed="rId39"/>
                           <a:stretch>
                             <a:fillRect/>
                           </a:stretch>
@@ -19571,7 +19810,7 @@
               <w:drawing>
                 <wp:inline xmlns:a="http://schemas.openxmlformats.org/drawingml/2006/main" xmlns:pic="http://schemas.openxmlformats.org/drawingml/2006/picture">
                   <wp:extent cx="2880360" cy="1853576"/>
-                  <wp:docPr id="30" name="Picture 30"/>
+                  <wp:docPr id="32" name="Picture 32"/>
                   <wp:cNvGraphicFramePr>
                     <a:graphicFrameLocks noChangeAspect="1"/>
                   </wp:cNvGraphicFramePr>
@@ -19583,7 +19822,7 @@
                           <pic:cNvPicPr/>
                         </pic:nvPicPr>
                         <pic:blipFill>
-                          <a:blip r:embed="rId38"/>
+                          <a:blip r:embed="rId40"/>
                           <a:stretch>
                             <a:fillRect/>
                           </a:stretch>
@@ -20200,7 +20439,7 @@
               <w:drawing>
                 <wp:inline xmlns:a="http://schemas.openxmlformats.org/drawingml/2006/main" xmlns:pic="http://schemas.openxmlformats.org/drawingml/2006/picture">
                   <wp:extent cx="2880360" cy="1853576"/>
-                  <wp:docPr id="31" name="Picture 31"/>
+                  <wp:docPr id="33" name="Picture 33"/>
                   <wp:cNvGraphicFramePr>
                     <a:graphicFrameLocks noChangeAspect="1"/>
                   </wp:cNvGraphicFramePr>
@@ -20212,7 +20451,7 @@
                           <pic:cNvPicPr/>
                         </pic:nvPicPr>
                         <pic:blipFill>
-                          <a:blip r:embed="rId39"/>
+                          <a:blip r:embed="rId41"/>
                           <a:stretch>
                             <a:fillRect/>
                           </a:stretch>
@@ -20815,7 +21054,7 @@
               <w:drawing>
                 <wp:inline xmlns:a="http://schemas.openxmlformats.org/drawingml/2006/main" xmlns:pic="http://schemas.openxmlformats.org/drawingml/2006/picture">
                   <wp:extent cx="2880360" cy="1853576"/>
-                  <wp:docPr id="32" name="Picture 32"/>
+                  <wp:docPr id="34" name="Picture 34"/>
                   <wp:cNvGraphicFramePr>
                     <a:graphicFrameLocks noChangeAspect="1"/>
                   </wp:cNvGraphicFramePr>
@@ -20827,7 +21066,7 @@
                           <pic:cNvPicPr/>
                         </pic:nvPicPr>
                         <pic:blipFill>
-                          <a:blip r:embed="rId40"/>
+                          <a:blip r:embed="rId42"/>
                           <a:stretch>
                             <a:fillRect/>
                           </a:stretch>
@@ -23291,6 +23530,71 @@
                 <w:b w:val="0"/>
                 <w:i w:val="0"/>
               </w:rPr>
+              <w:t>Demo语言</w:t>
+            </w:r>
+          </w:p>
+        </w:tc>
+        <w:tc>
+          <w:tcPr>
+            <w:tcW w:type="dxa" w:w="5184"/>
+            <w:vAlign w:val="top"/>
+            <w:tcMar>
+              <w:top w:w="80" w:type="dxa"/>
+              <w:start w:w="100" w:type="dxa"/>
+              <w:bottom w:w="80" w:type="dxa"/>
+              <w:end w:w="100" w:type="dxa"/>
+            </w:tcMar>
+          </w:tcPr>
+          <w:p>
+            <w:pPr>
+              <w:spacing w:after="40"/>
+            </w:pPr>
+            <w:r>
+              <w:rPr>
+                <w:rFonts w:ascii="Microsoft YaHei" w:hAnsi="Microsoft YaHei" w:eastAsia="Microsoft YaHei"/>
+              </w:rPr>
+            </w:r>
+            <w:r>
+              <w:rPr>
+                <w:rFonts w:ascii="Microsoft YaHei" w:hAnsi="Microsoft YaHei" w:eastAsia="Microsoft YaHei"/>
+                <w:b w:val="0"/>
+                <w:i w:val="0"/>
+              </w:rPr>
+              <w:t>双端Demo顶部外部评审区常驻“中文”“English”按钮，点击即时切换当前界面文案并记忆选择，刷新或再次打开沿用已选语言。语言与国内/海外地区独立：国内继续手机号渠道，海外继续邮箱/Google，扫码及盖世授权规则不变；切换语言不改输入、协议勾选、账号登录态、当前页面、请求/验证码/二维码和进行中任务，不重新发起或作废请求。按钮不是正式产品地区入口，不新增设置页。本文界面文案以中文为例，英文提供对应含义；用户输入、手机号、邮箱、验证码及业务标识不随语言改写。</w:t>
+            </w:r>
+          </w:p>
+        </w:tc>
+      </w:tr>
+      <w:tr>
+        <w:trPr>
+          <w:cantSplit/>
+        </w:trPr>
+        <w:tc>
+          <w:tcPr>
+            <w:tcW w:type="dxa" w:w="5184"/>
+            <w:vAlign w:val="top"/>
+            <w:tcMar>
+              <w:top w:w="80" w:type="dxa"/>
+              <w:start w:w="100" w:type="dxa"/>
+              <w:bottom w:w="80" w:type="dxa"/>
+              <w:end w:w="100" w:type="dxa"/>
+            </w:tcMar>
+          </w:tcPr>
+          <w:p>
+            <w:pPr>
+              <w:spacing w:after="40"/>
+            </w:pPr>
+            <w:r>
+              <w:rPr>
+                <w:rFonts w:ascii="Microsoft YaHei" w:hAnsi="Microsoft YaHei" w:eastAsia="Microsoft YaHei"/>
+              </w:rPr>
+            </w:r>
+            <w:r>
+              <w:rPr>
+                <w:rFonts w:ascii="Microsoft YaHei" w:hAnsi="Microsoft YaHei" w:eastAsia="Microsoft YaHei"/>
+                <w:b w:val="0"/>
+                <w:i w:val="0"/>
+              </w:rPr>
               <w:t>正式配置</w:t>
             </w:r>
           </w:p>
@@ -25096,7 +25400,7 @@
                 <w:b w:val="0"/>
                 <w:i w:val="0"/>
               </w:rPr>
-              <w:t>独立远程电脑-产品形态与登录链路-评审稿.md；远程电脑状态卡.md D-049～D-067</w:t>
+              <w:t>独立远程电脑-产品形态与登录链路-评审稿.md；远程电脑状态卡.md D-049～D-069</w:t>
             </w:r>
           </w:p>
         </w:tc>

</xml_diff>

<commit_message>
feat(remote): add key layout editing and cloud share demo with review updates
</commit_message>
<xml_diff>
--- a/public/streaming-mvp/独立远程电脑PRD-飞书导入版.docx
+++ b/public/streaming-mvp/独立远程电脑PRD-飞书导入版.docx
@@ -7,7 +7,7 @@
         <w:pStyle w:val="Title"/>
       </w:pPr>
       <w:r>
-        <w:t>盖世远程独立客户端与移动 App PRD V4.8</w:t>
+        <w:t>盖世远程独立客户端与移动 App PRD V4.9</w:t>
       </w:r>
     </w:p>
     <w:p>
@@ -1347,6 +1347,131 @@
           </w:p>
         </w:tc>
       </w:tr>
+      <w:tr>
+        <w:trPr>
+          <w:cantSplit/>
+        </w:trPr>
+        <w:tc>
+          <w:tcPr>
+            <w:tcW w:type="dxa" w:w="2592"/>
+            <w:vAlign w:val="top"/>
+            <w:tcMar>
+              <w:top w:w="80" w:type="dxa"/>
+              <w:start w:w="100" w:type="dxa"/>
+              <w:bottom w:w="80" w:type="dxa"/>
+              <w:end w:w="100" w:type="dxa"/>
+            </w:tcMar>
+          </w:tcPr>
+          <w:p>
+            <w:pPr>
+              <w:spacing w:after="40"/>
+            </w:pPr>
+            <w:r>
+              <w:rPr>
+                <w:rFonts w:ascii="Microsoft YaHei" w:hAnsi="Microsoft YaHei" w:eastAsia="Microsoft YaHei"/>
+              </w:rPr>
+            </w:r>
+            <w:r>
+              <w:rPr>
+                <w:rFonts w:ascii="Microsoft YaHei" w:hAnsi="Microsoft YaHei" w:eastAsia="Microsoft YaHei"/>
+                <w:b w:val="0"/>
+                <w:i w:val="0"/>
+              </w:rPr>
+              <w:t>2026/10/28</w:t>
+            </w:r>
+          </w:p>
+        </w:tc>
+        <w:tc>
+          <w:tcPr>
+            <w:tcW w:type="dxa" w:w="2592"/>
+            <w:vAlign w:val="top"/>
+            <w:tcMar>
+              <w:top w:w="80" w:type="dxa"/>
+              <w:start w:w="100" w:type="dxa"/>
+              <w:bottom w:w="80" w:type="dxa"/>
+              <w:end w:w="100" w:type="dxa"/>
+            </w:tcMar>
+          </w:tcPr>
+          <w:p>
+            <w:pPr>
+              <w:spacing w:after="40"/>
+            </w:pPr>
+            <w:r>
+              <w:rPr>
+                <w:rFonts w:ascii="Microsoft YaHei" w:hAnsi="Microsoft YaHei" w:eastAsia="Microsoft YaHei"/>
+              </w:rPr>
+            </w:r>
+            <w:r>
+              <w:rPr>
+                <w:rFonts w:ascii="Microsoft YaHei" w:hAnsi="Microsoft YaHei" w:eastAsia="Microsoft YaHei"/>
+                <w:b w:val="0"/>
+                <w:i w:val="0"/>
+              </w:rPr>
+              <w:t>按二次评审纳入一期公网，补登录即注册、UID、注销H5、旧版盖世更新及双App扫码；明确正式语言包、静态内容与独立更新配置，补虚拟按键编辑和云分享</w:t>
+            </w:r>
+          </w:p>
+        </w:tc>
+        <w:tc>
+          <w:tcPr>
+            <w:tcW w:type="dxa" w:w="2592"/>
+            <w:vAlign w:val="top"/>
+            <w:tcMar>
+              <w:top w:w="80" w:type="dxa"/>
+              <w:start w:w="100" w:type="dxa"/>
+              <w:bottom w:w="80" w:type="dxa"/>
+              <w:end w:w="100" w:type="dxa"/>
+            </w:tcMar>
+          </w:tcPr>
+          <w:p>
+            <w:pPr>
+              <w:spacing w:after="40"/>
+            </w:pPr>
+            <w:r>
+              <w:rPr>
+                <w:rFonts w:ascii="Microsoft YaHei" w:hAnsi="Microsoft YaHei" w:eastAsia="Microsoft YaHei"/>
+              </w:rPr>
+            </w:r>
+            <w:r>
+              <w:rPr>
+                <w:rFonts w:ascii="Microsoft YaHei" w:hAnsi="Microsoft YaHei" w:eastAsia="Microsoft YaHei"/>
+                <w:b w:val="0"/>
+                <w:i w:val="0"/>
+              </w:rPr>
+              <w:t>V4.9-Draft</w:t>
+            </w:r>
+          </w:p>
+        </w:tc>
+        <w:tc>
+          <w:tcPr>
+            <w:tcW w:type="dxa" w:w="2592"/>
+            <w:vAlign w:val="top"/>
+            <w:tcMar>
+              <w:top w:w="80" w:type="dxa"/>
+              <w:start w:w="100" w:type="dxa"/>
+              <w:bottom w:w="80" w:type="dxa"/>
+              <w:end w:w="100" w:type="dxa"/>
+            </w:tcMar>
+          </w:tcPr>
+          <w:p>
+            <w:pPr>
+              <w:spacing w:after="40"/>
+            </w:pPr>
+            <w:r>
+              <w:rPr>
+                <w:rFonts w:ascii="Microsoft YaHei" w:hAnsi="Microsoft YaHei" w:eastAsia="Microsoft YaHei"/>
+              </w:rPr>
+            </w:r>
+            <w:r>
+              <w:rPr>
+                <w:rFonts w:ascii="Microsoft YaHei" w:hAnsi="Microsoft YaHei" w:eastAsia="Microsoft YaHei"/>
+                <w:b w:val="0"/>
+                <w:i w:val="0"/>
+              </w:rPr>
+              <w:t>产品</w:t>
+            </w:r>
+          </w:p>
+        </w:tc>
+      </w:tr>
     </w:tbl>
     <w:p>
       <w:pPr>
@@ -1362,7 +1487,7 @@
           <w:b w:val="0"/>
           <w:i w:val="0"/>
         </w:rPr>
-        <w:t>备注：搜2026.10.28修改（中文/English切换、模拟登录示例与我的页布局）；搜2026.10.26修改（两Tab、我的、扫一扫、更新通知、昵称旁退出图标、退出二次确认、未勾协议可操作及电脑默认登录）。本稿替代 V3.10 中的游戏库入口、盖世 Mac 侧栏、默认沿用盖世登录态及首次安装引导。工作名为“盖世远程”。本期为 MVP，保留现有 Demo 远控能力，补登录、登录协议、电脑端新手引导、我的与帮助入口。国内手机号验证码、海外邮箱验证码/Google、电脑端扫码已确认；移动端保留盖世游戏 App 拉起登录，并在我的Tab提供扫一扫，用于扫描电脑端登录码，不展示供本机扫描的二维码。配图为本地 Demo，不代表登录服务或远控引擎已经接通。</w:t>
+        <w:t>备注：搜2026.10.28二次评审（公网、UID、注销、双App扫码、语言包与按键云分享）；搜2026.10.28修改（中文/English切换、模拟登录示例与我的页布局）；搜2026.10.26修改（两Tab、我的、扫一扫、更新通知、昵称旁退出图标、退出二次确认、未勾协议可操作及电脑默认登录）。本稿替代 V3.10 中的游戏库入口、盖世 Mac 侧栏、默认沿用盖世登录态及首次安装引导。工作名为“盖世远程”。本期为 MVP，保留现有 Demo 远控能力，补登录、登录协议、电脑端新手引导、我的与帮助入口。国内手机号验证码、海外邮箱验证码/Google、电脑端扫码已确认；移动端保留盖世游戏 App 拉起登录，并在我的Tab提供扫一扫，用于扫描电脑端登录码，不展示供本机扫描的二维码。配图为本地 Demo，不代表登录服务或远控引擎已经接通。</w:t>
       </w:r>
     </w:p>
     <w:p>
@@ -1551,7 +1676,7 @@
                 <w:b w:val="0"/>
                 <w:i w:val="0"/>
               </w:rPr>
-              <w:t>独立移动 App 的竖屏界面、独立电脑客户端；本轮移除横竖屏切换入口，不扩展横屏工作区。电脑 Demo 使用 Mac 视觉和已有模块；Windows 的发版时间不由 Demo 推定。</w:t>
+              <w:t>独立移动App及Windows/Mac电脑客户端。设备列表等普通页面首期采用竖屏，不设横竖屏切换入口；仅进入游戏且游戏已启动的远控会话保留横屏适配与虚拟按键，其余页面保持竖屏。折叠屏等专门适配后续处理；精确系统版本和处理器架构待确认，Mac Demo不代替Windows实机验收。</w:t>
             </w:r>
           </w:p>
         </w:tc>
@@ -1616,7 +1741,7 @@
                 <w:b w:val="0"/>
                 <w:i w:val="0"/>
               </w:rPr>
-              <w:t>现有 Demo 的同账号电脑列表、详情、本机被控设置、连接与退出，以及既有观看、输入、文件、电源、快捷启动；本轮补登录、协议同意、电脑端登录后首次使用引导、移动端我的及双端帮助、版本和关于入口。两端统一浅色模式，不提供黑夜模式。国内手机号验证码+盖世授权，海外邮箱验证码+Google+盖世授权；移动端拉起盖世游戏 App 或从我的Tab扫一扫，电脑端展示登录二维码。连接范围仍沿用一期局域网。</w:t>
+              <w:t>现有 Demo 的同账号电脑列表、详情、本机被控设置、连接与退出，以及既有观看、输入、文件、电源、快捷启动；本轮补登录、协议同意、电脑端登录后首次使用引导、移动端我的及双端帮助、版本和关于入口。两端统一浅色模式，不提供黑夜模式。国内手机号验证码+盖世授权，海外邮箱验证码+Google+盖世授权；移动端拉起盖世游戏 App 或从我的Tab扫一扫，电脑端展示登录二维码。一期同时覆盖局域网与公网远程自己的电脑；公网连接方案与资源限制待确认，不新增远程协助或收费流程。</w:t>
             </w:r>
           </w:p>
         </w:tc>
@@ -1746,7 +1871,7 @@
                 <w:b w:val="0"/>
                 <w:i w:val="0"/>
               </w:rPr>
-              <w:t>无新增运营后台、商业化或地区切换设置。地区由对应发行版本/账号配置确定；Demo的地区切换仅位于评审工具。Demo顶部常驻“中文”“English”按钮属于外部评审控件，只切换界面语言，不切换国内/海外，不新增正式语言或地区设置页。盖世游戏 App 下载链接使用对应地区官网；独立盖世远程的正式品牌素材、下载指向与协议主体需接入。</w:t>
+              <w:t>一期不新增文章/协议运营配置页面及商业化入口；独立产品的更新和后续配置需与盖世游戏区分，后台账号权限可复用。地区由对应发行版本/账号配置确定；Demo的地区切换仅位于评审工具。Demo顶部常驻“中文”“English”按钮属于外部评审控件，只切换界面语言，不切换国内/海外，不新增正式语言或地区设置页。正式产品一期中英文随官网下载包提供，安装后不设语言切换入口；官网应露出盖世远程的移动与电脑下载入口，语言对应安装包。正式品牌、各平台包地址及协议内容需接入。</w:t>
             </w:r>
           </w:p>
         </w:tc>
@@ -1811,7 +1936,7 @@
                 <w:b w:val="0"/>
                 <w:i w:val="0"/>
               </w:rPr>
-              <w:t>产品与设计确认页面和规则；移动/电脑客户端承接登录、设备与远控交互，账号服务提供盖世身份、独立会话与授权，设备/远控服务处理设备状态与会话；测试按端和地区核对，数据核对事件及历史映射。无新增运营后台。</w:t>
+              <w:t>产品与设计确认页面和规则；移动/电脑客户端承接登录、设备与远控交互，账号服务提供盖世身份、独立会话与授权，设备/远控服务处理设备状态与会话；测试按端和地区核对，数据核对事件及历史映射。服务端承接静态H5、账号与独立更新配置，客户端提供H5打开与返回能力；一期不新增内容配置页面。</w:t>
             </w:r>
           </w:p>
         </w:tc>
@@ -2535,7 +2660,7 @@
                 <w:b w:val="0"/>
                 <w:i w:val="0"/>
               </w:rPr>
-              <w:t>手机或另一台电脑作为主控；一期仍限局域网，目标电脑完成独立客户端登录及被控权限。</w:t>
+              <w:t>手机或另一台电脑作为主控，在家、公司或其他网络连接自己的电脑；支持局域网与公网，目标电脑完成独立客户端登录及被控权限。</w:t>
             </w:r>
           </w:p>
         </w:tc>
@@ -2600,7 +2725,7 @@
                 <w:b w:val="0"/>
                 <w:i w:val="0"/>
               </w:rPr>
-              <w:t>地区登录和授权衔接同账号设备、详情及远控；移动端底部为我的设备/我的，扫一扫、帮助中心、检查更新、关于集中在我的，退出位于昵称右侧；电脑更多下拉承接教程、帮助、原页检查更新及关于；退出位于账户面板昵称右侧，设置保留左侧入口。双端采用浅色模式，远控沿用当前 Demo 的输入、观看、文件、电源与快捷启动。</w:t>
+              <w:t>地区登录和授权衔接同账号设备、详情及远控；移动端底部为我的设备/我的，扫一扫、帮助中心、检查更新、关于集中在我的，退出位于昵称右侧；电脑更多下拉承接教程、帮助、原页检查更新及关于；退出位于账户面板昵称右侧，设置保留左侧入口。双端采用浅色模式，远控沿用当前Demo的输入、观看、文件、电源与快捷启动；移动端游戏会话增加按键布局编辑、云分享和布局码导入。</w:t>
             </w:r>
           </w:p>
         </w:tc>
@@ -3342,7 +3467,7 @@
                 <w:b w:val="0"/>
                 <w:i w:val="0"/>
               </w:rPr>
-              <w:t>3. 勾选同意后保留本次输入和仍有效的验证码，无需因勾选重新发码；点击“登录”校验本次验证码及协议，取得并核实有效会话后获取当前盖世UID设备。已同意时点击App/Google入口进入本次授权；异步成功前再次核对本次同意及尝试仍有效。</w:t>
+              <w:t>3. 勾选同意后保留本次输入和仍有效的验证码，无需因勾选重新发码；点击“登录”校验本次验证码及协议，首次使用且无既有账号时按盖世账号体系完成登录即注册，不新增独立注册页；取得并核实有效会话后获取当前盖世UID设备。已同意时点击App/Google入口进入本次授权；异步成功前再次核对本次同意及尝试仍有效。</w:t>
             </w:r>
             <w:r>
               <w:rPr>
@@ -3954,6 +4079,63 @@
             <w:r>
               <w:rPr>
                 <w:rFonts w:ascii="Microsoft YaHei" w:hAnsi="Microsoft YaHei" w:eastAsia="Microsoft YaHei"/>
+              </w:rPr>
+              <w:drawing>
+                <wp:inline xmlns:a="http://schemas.openxmlformats.org/drawingml/2006/main" xmlns:pic="http://schemas.openxmlformats.org/drawingml/2006/picture">
+                  <wp:extent cx="1790932" cy="3657600"/>
+                  <wp:docPr id="6" name="Picture 6"/>
+                  <wp:cNvGraphicFramePr>
+                    <a:graphicFrameLocks noChangeAspect="1"/>
+                  </wp:cNvGraphicFramePr>
+                  <a:graphic>
+                    <a:graphicData uri="http://schemas.openxmlformats.org/drawingml/2006/picture">
+                      <pic:pic>
+                        <pic:nvPicPr>
+                          <pic:cNvPr id="0" name="standalone-mobile-old-gamehub.png"/>
+                          <pic:cNvPicPr/>
+                        </pic:nvPicPr>
+                        <pic:blipFill>
+                          <a:blip r:embed="rId14"/>
+                          <a:stretch>
+                            <a:fillRect/>
+                          </a:stretch>
+                        </pic:blipFill>
+                        <pic:spPr>
+                          <a:xfrm>
+                            <a:off x="0" y="0"/>
+                            <a:ext cx="1790932" cy="3657600"/>
+                          </a:xfrm>
+                          <a:prstGeom prst="rect"/>
+                        </pic:spPr>
+                      </pic:pic>
+                    </a:graphicData>
+                  </a:graphic>
+                </wp:inline>
+              </w:drawing>
+            </w:r>
+            <w:r>
+              <w:rPr>
+                <w:rFonts w:ascii="Microsoft YaHei" w:hAnsi="Microsoft YaHei" w:eastAsia="Microsoft YaHei"/>
+              </w:rPr>
+              <w:br/>
+            </w:r>
+            <w:r>
+              <w:rPr>
+                <w:rFonts w:ascii="Microsoft YaHei" w:hAnsi="Microsoft YaHei" w:eastAsia="Microsoft YaHei"/>
+                <w:b w:val="0"/>
+                <w:i/>
+              </w:rPr>
+              <w:t>图3-3a：已安装盖世版本不支持授权时，提示先更新，不进入成功态。</w:t>
+            </w:r>
+            <w:r>
+              <w:rPr>
+                <w:rFonts w:ascii="Microsoft YaHei" w:hAnsi="Microsoft YaHei" w:eastAsia="Microsoft YaHei"/>
+              </w:rPr>
+              <w:br/>
+            </w:r>
+            <w:r>
+              <w:rPr>
+                <w:rFonts w:ascii="Microsoft YaHei" w:hAnsi="Microsoft YaHei" w:eastAsia="Microsoft YaHei"/>
                 <w:b/>
                 <w:i w:val="0"/>
               </w:rPr>
@@ -4013,7 +4195,7 @@
                 <w:b w:val="0"/>
                 <w:i w:val="0"/>
               </w:rPr>
-              <w:t>1. 盖世 App 已登录时确认本次授权；未登录/失效时先完成盖世原登录，再继续仍有效授权。</w:t>
+              <w:t>1. 盖世App版本支持且已登录时确认本次授权；未登录/失效时先完成盖世原登录/注册，再继续仍有效授权。本期仅支持从盖世远程拉起盖世游戏授权，不新增反向授权入口。</w:t>
             </w:r>
             <w:r>
               <w:rPr>
@@ -4185,7 +4367,7 @@
                 <w:b w:val="0"/>
                 <w:i w:val="0"/>
               </w:rPr>
-              <w:t>2. 未安装/无法拉起时留在登录页；国内可用手机号，海外可用邮箱/Google，不跳虚构下载地址。</w:t>
+              <w:t>2. 未安装/无法拉起时留在登录页；国内可用手机号，海外可用邮箱/Google，不跳虚构下载地址。已安装但盖世版本不支持本次授权时，提示先更新盖世游戏，不进入授权或完成登录；更新完成后用户重新发起本次授权，不复用失效请求。最低支持版本及更新地址待接入，不编造版本号。</w:t>
             </w:r>
             <w:r>
               <w:rPr>
@@ -4572,7 +4754,7 @@
               <w:drawing>
                 <wp:inline xmlns:a="http://schemas.openxmlformats.org/drawingml/2006/main" xmlns:pic="http://schemas.openxmlformats.org/drawingml/2006/picture">
                   <wp:extent cx="1666190" cy="3657600"/>
-                  <wp:docPr id="6" name="Picture 6"/>
+                  <wp:docPr id="7" name="Picture 7"/>
                   <wp:cNvGraphicFramePr>
                     <a:graphicFrameLocks noChangeAspect="1"/>
                   </wp:cNvGraphicFramePr>
@@ -4584,7 +4766,7 @@
                           <pic:cNvPicPr/>
                         </pic:nvPicPr>
                         <pic:blipFill>
-                          <a:blip r:embed="rId14"/>
+                          <a:blip r:embed="rId15"/>
                           <a:stretch>
                             <a:fillRect/>
                           </a:stretch>
@@ -5257,7 +5439,7 @@
               <w:drawing>
                 <wp:inline xmlns:a="http://schemas.openxmlformats.org/drawingml/2006/main" xmlns:pic="http://schemas.openxmlformats.org/drawingml/2006/picture">
                   <wp:extent cx="1790932" cy="3657600"/>
-                  <wp:docPr id="7" name="Picture 7"/>
+                  <wp:docPr id="8" name="Picture 8"/>
                   <wp:cNvGraphicFramePr>
                     <a:graphicFrameLocks noChangeAspect="1"/>
                   </wp:cNvGraphicFramePr>
@@ -5269,7 +5451,7 @@
                           <pic:cNvPicPr/>
                         </pic:nvPicPr>
                         <pic:blipFill>
-                          <a:blip r:embed="rId15"/>
+                          <a:blip r:embed="rId16"/>
                           <a:stretch>
                             <a:fillRect/>
                           </a:stretch>
@@ -5397,7 +5579,7 @@
                 <w:b w:val="0"/>
                 <w:i w:val="0"/>
               </w:rPr>
-              <w:t>1. 点击进入桌面或观看，核对实时在线、权限、同一局域网及占用；符合后显示连接中，避免重复发起。首帧可显示且会话可用才算连接成功。</w:t>
+              <w:t>1. 点击进入桌面或观看，核对实时在线、权限、网络可达性及占用；符合后显示连接中，避免重复发起。首帧可显示且会话可用才算连接成功。</w:t>
             </w:r>
             <w:r>
               <w:rPr>
@@ -5411,7 +5593,7 @@
                 <w:b w:val="0"/>
                 <w:i w:val="0"/>
               </w:rPr>
-              <w:t>2. 占用时确认接管才发起；取消不影响原会话。连接中取消回详情，失败/超时留在原流程，可检查设备后重试。非同一局域网阻止连接，教程可查看条件。</w:t>
+              <w:t>2. 占用时确认接管才发起；取消不影响原会话。连接中取消回详情，失败/超时留在原流程，可检查设备后重试。跨网络不因非同一局域网而直接阻止；实际连接失败或超时保留原失败/重试路径，不显示连接成功。</w:t>
             </w:r>
             <w:r>
               <w:rPr>
@@ -6035,7 +6217,7 @@
                 <w:b w:val="0"/>
                 <w:i w:val="0"/>
               </w:rPr>
-              <w:t>1. 按设备隔离应用列表，手机一排四项、超出换行；游戏保留既有虚拟按键开关/布局；本轮不提供横竖屏切换；仅观看时隐藏可操作虚拟按键。</w:t>
+              <w:t>1. 按设备隔离应用列表，手机一排四项、超出换行；游戏保留既有虚拟按键开关/布局，仅游戏已启动的远控会话支持横屏；其他页面保持竖屏；仅观看时隐藏可操作虚拟按键。</w:t>
             </w:r>
             <w:r>
               <w:rPr>
@@ -6603,7 +6785,7 @@
               <w:drawing>
                 <wp:inline xmlns:a="http://schemas.openxmlformats.org/drawingml/2006/main" xmlns:pic="http://schemas.openxmlformats.org/drawingml/2006/picture">
                   <wp:extent cx="1790932" cy="3657600"/>
-                  <wp:docPr id="8" name="Picture 8"/>
+                  <wp:docPr id="9" name="Picture 9"/>
                   <wp:cNvGraphicFramePr>
                     <a:graphicFrameLocks noChangeAspect="1"/>
                   </wp:cNvGraphicFramePr>
@@ -6615,7 +6797,7 @@
                           <pic:cNvPicPr/>
                         </pic:nvPicPr>
                         <pic:blipFill>
-                          <a:blip r:embed="rId16"/>
+                          <a:blip r:embed="rId17"/>
                           <a:stretch>
                             <a:fillRect/>
                           </a:stretch>
@@ -6687,7 +6869,7 @@
                 <w:b w:val="0"/>
                 <w:i w:val="0"/>
               </w:rPr>
-              <w:t>1. 画面按原比例；竖屏16:9居中、上下留黑，不拉伸。本轮不显示横竖屏切换入口。</w:t>
+              <w:t>1. 画面按原比例；竖屏16:9居中、上下留黑，不拉伸。仅当前为远控会话且游戏已启动时支持横屏适配；普通远控桌面及其他页面保持竖屏。</w:t>
             </w:r>
             <w:r>
               <w:rPr>
@@ -7141,7 +7323,7 @@
               <w:drawing>
                 <wp:inline xmlns:a="http://schemas.openxmlformats.org/drawingml/2006/main" xmlns:pic="http://schemas.openxmlformats.org/drawingml/2006/picture">
                   <wp:extent cx="1790932" cy="3657600"/>
-                  <wp:docPr id="9" name="Picture 9"/>
+                  <wp:docPr id="10" name="Picture 10"/>
                   <wp:cNvGraphicFramePr>
                     <a:graphicFrameLocks noChangeAspect="1"/>
                   </wp:cNvGraphicFramePr>
@@ -7153,7 +7335,7 @@
                           <pic:cNvPicPr/>
                         </pic:nvPicPr>
                         <pic:blipFill>
-                          <a:blip r:embed="rId17"/>
+                          <a:blip r:embed="rId18"/>
                           <a:stretch>
                             <a:fillRect/>
                           </a:stretch>
@@ -7286,6 +7468,173 @@
                 <w:i w:val="0"/>
               </w:rPr>
               <w:t>1. 左右滑动或点分页换页，保留组合模式和修饰键选择；中文候选确认后提交，组合中不重复发送，回车换行不代替远端发送。组合默认关；开启后选修饰键再点目标键，发送一次释放选择、模式保持开；关闭模式/键盘、失焦/退出释放选择，仅观看禁输入。输入长度和长文本发送沿用V3.10对应规则，本轮不新增上限。</w:t>
+            </w:r>
+          </w:p>
+        </w:tc>
+      </w:tr>
+      <w:tr>
+        <w:trPr>
+          <w:cantSplit/>
+        </w:trPr>
+        <w:tc>
+          <w:tcPr>
+            <w:tcW w:type="dxa" w:w="2592"/>
+            <w:vAlign w:val="top"/>
+            <w:tcMar>
+              <w:top w:w="80" w:type="dxa"/>
+              <w:start w:w="100" w:type="dxa"/>
+              <w:bottom w:w="80" w:type="dxa"/>
+              <w:end w:w="100" w:type="dxa"/>
+            </w:tcMar>
+          </w:tcPr>
+          <w:p>
+            <w:pPr>
+              <w:spacing w:after="40"/>
+            </w:pPr>
+            <w:r>
+              <w:rPr>
+                <w:rFonts w:ascii="Microsoft YaHei" w:hAnsi="Microsoft YaHei" w:eastAsia="Microsoft YaHei"/>
+              </w:rPr>
+            </w:r>
+            <w:r>
+              <w:rPr>
+                <w:rFonts w:ascii="Microsoft YaHei" w:hAnsi="Microsoft YaHei" w:eastAsia="Microsoft YaHei"/>
+                <w:b w:val="0"/>
+                <w:i w:val="0"/>
+              </w:rPr>
+              <w:t>虚拟按键方案</w:t>
+            </w:r>
+          </w:p>
+        </w:tc>
+        <w:tc>
+          <w:tcPr>
+            <w:tcW w:type="dxa" w:w="2592"/>
+            <w:vAlign w:val="top"/>
+            <w:tcMar>
+              <w:top w:w="80" w:type="dxa"/>
+              <w:start w:w="100" w:type="dxa"/>
+              <w:bottom w:w="80" w:type="dxa"/>
+              <w:end w:w="100" w:type="dxa"/>
+            </w:tcMar>
+          </w:tcPr>
+          <w:p>
+            <w:pPr>
+              <w:spacing w:after="40"/>
+            </w:pPr>
+            <w:r>
+              <w:rPr>
+                <w:rFonts w:ascii="Microsoft YaHei" w:hAnsi="Microsoft YaHei" w:eastAsia="Microsoft YaHei"/>
+              </w:rPr>
+            </w:r>
+            <w:r>
+              <w:rPr>
+                <w:rFonts w:ascii="Microsoft YaHei" w:hAnsi="Microsoft YaHei" w:eastAsia="Microsoft YaHei"/>
+                <w:b w:val="0"/>
+                <w:i w:val="0"/>
+              </w:rPr>
+              <w:t>游戏布局库见图3-31，编辑器见图3-35</w:t>
+            </w:r>
+          </w:p>
+        </w:tc>
+        <w:tc>
+          <w:tcPr>
+            <w:tcW w:type="dxa" w:w="2592"/>
+            <w:vAlign w:val="top"/>
+            <w:tcMar>
+              <w:top w:w="80" w:type="dxa"/>
+              <w:start w:w="100" w:type="dxa"/>
+              <w:bottom w:w="80" w:type="dxa"/>
+              <w:end w:w="100" w:type="dxa"/>
+            </w:tcMar>
+          </w:tcPr>
+          <w:p>
+            <w:pPr>
+              <w:spacing w:after="40"/>
+            </w:pPr>
+            <w:r>
+              <w:rPr>
+                <w:rFonts w:ascii="Microsoft YaHei" w:hAnsi="Microsoft YaHei" w:eastAsia="Microsoft YaHei"/>
+              </w:rPr>
+            </w:r>
+            <w:r>
+              <w:rPr>
+                <w:rFonts w:ascii="Microsoft YaHei" w:hAnsi="Microsoft YaHei" w:eastAsia="Microsoft YaHei"/>
+                <w:b w:val="0"/>
+                <w:i w:val="0"/>
+              </w:rPr>
+              <w:t>从原切换虚拟按键布局/映射方案入口管理方案。</w:t>
+            </w:r>
+          </w:p>
+        </w:tc>
+        <w:tc>
+          <w:tcPr>
+            <w:tcW w:type="dxa" w:w="2592"/>
+            <w:vAlign w:val="top"/>
+            <w:tcMar>
+              <w:top w:w="80" w:type="dxa"/>
+              <w:start w:w="100" w:type="dxa"/>
+              <w:bottom w:w="80" w:type="dxa"/>
+              <w:end w:w="100" w:type="dxa"/>
+            </w:tcMar>
+          </w:tcPr>
+          <w:p>
+            <w:pPr>
+              <w:spacing w:after="40"/>
+            </w:pPr>
+            <w:r>
+              <w:rPr>
+                <w:rFonts w:ascii="Microsoft YaHei" w:hAnsi="Microsoft YaHei" w:eastAsia="Microsoft YaHei"/>
+              </w:rPr>
+            </w:r>
+            <w:r>
+              <w:rPr>
+                <w:rFonts w:ascii="Microsoft YaHei" w:hAnsi="Microsoft YaHei" w:eastAsia="Microsoft YaHei"/>
+                <w:b/>
+                <w:i w:val="0"/>
+              </w:rPr>
+              <w:t>展示说明：</w:t>
+            </w:r>
+            <w:r>
+              <w:rPr>
+                <w:rFonts w:ascii="Microsoft YaHei" w:hAnsi="Microsoft YaHei" w:eastAsia="Microsoft YaHei"/>
+              </w:rPr>
+              <w:br/>
+            </w:r>
+            <w:r>
+              <w:rPr>
+                <w:rFonts w:ascii="Microsoft YaHei" w:hAnsi="Microsoft YaHei" w:eastAsia="Microsoft YaHei"/>
+                <w:b w:val="0"/>
+                <w:i w:val="0"/>
+              </w:rPr>
+              <w:t>1. 入口承接推荐、我的方案与我的云分享，不新增设备页或账号设置入口。</w:t>
+            </w:r>
+            <w:r>
+              <w:rPr>
+                <w:rFonts w:ascii="Microsoft YaHei" w:hAnsi="Microsoft YaHei" w:eastAsia="Microsoft YaHei"/>
+              </w:rPr>
+              <w:br/>
+            </w:r>
+            <w:r>
+              <w:rPr>
+                <w:rFonts w:ascii="Microsoft YaHei" w:hAnsi="Microsoft YaHei" w:eastAsia="Microsoft YaHei"/>
+                <w:b/>
+                <w:i w:val="0"/>
+              </w:rPr>
+              <w:t>交互说明：</w:t>
+            </w:r>
+            <w:r>
+              <w:rPr>
+                <w:rFonts w:ascii="Microsoft YaHei" w:hAnsi="Microsoft YaHei" w:eastAsia="Microsoft YaHei"/>
+              </w:rPr>
+              <w:br/>
+            </w:r>
+            <w:r>
+              <w:rPr>
+                <w:rFonts w:ascii="Microsoft YaHei" w:hAnsi="Microsoft YaHei" w:eastAsia="Microsoft YaHei"/>
+                <w:b w:val="0"/>
+                <w:i w:val="0"/>
+              </w:rPr>
+              <w:t>1. 打开布局库不结束会话；编辑/导入/发布规则见3.1.12～3.1.13。应用方案后按保存坐标展示，退出账号仍清理当前账号临时态。</w:t>
             </w:r>
           </w:p>
         </w:tc>
@@ -7658,7 +8007,7 @@
               <w:drawing>
                 <wp:inline xmlns:a="http://schemas.openxmlformats.org/drawingml/2006/main" xmlns:pic="http://schemas.openxmlformats.org/drawingml/2006/picture">
                   <wp:extent cx="1790932" cy="3657600"/>
-                  <wp:docPr id="10" name="Picture 10"/>
+                  <wp:docPr id="11" name="Picture 11"/>
                   <wp:cNvGraphicFramePr>
                     <a:graphicFrameLocks noChangeAspect="1"/>
                   </wp:cNvGraphicFramePr>
@@ -7670,7 +8019,7 @@
                           <pic:cNvPicPr/>
                         </pic:nvPicPr>
                         <pic:blipFill>
-                          <a:blip r:embed="rId18"/>
+                          <a:blip r:embed="rId19"/>
                           <a:stretch>
                             <a:fillRect/>
                           </a:stretch>
@@ -8219,7 +8568,7 @@
                 <w:b w:val="0"/>
                 <w:i w:val="0"/>
               </w:rPr>
-              <w:t>当前独立App盖世会话有效；头像、昵称和账号由当前盖世身份提供。</w:t>
+              <w:t>当前独立App盖世会话有效；头像、昵称和UID由当前盖世身份提供。</w:t>
             </w:r>
           </w:p>
         </w:tc>
@@ -8293,63 +8642,6 @@
                 <w:i w:val="0"/>
               </w:rPr>
               <w:t xml:space="preserve"> </w:t>
-            </w:r>
-            <w:r>
-              <w:rPr>
-                <w:rFonts w:ascii="Microsoft YaHei" w:hAnsi="Microsoft YaHei" w:eastAsia="Microsoft YaHei"/>
-              </w:rPr>
-              <w:drawing>
-                <wp:inline xmlns:a="http://schemas.openxmlformats.org/drawingml/2006/main" xmlns:pic="http://schemas.openxmlformats.org/drawingml/2006/picture">
-                  <wp:extent cx="1666190" cy="3657600"/>
-                  <wp:docPr id="11" name="Picture 11"/>
-                  <wp:cNvGraphicFramePr>
-                    <a:graphicFrameLocks noChangeAspect="1"/>
-                  </wp:cNvGraphicFramePr>
-                  <a:graphic>
-                    <a:graphicData uri="http://schemas.openxmlformats.org/drawingml/2006/picture">
-                      <pic:pic>
-                        <pic:nvPicPr>
-                          <pic:cNvPr id="0" name="standalone-mobile-profile.png"/>
-                          <pic:cNvPicPr/>
-                        </pic:nvPicPr>
-                        <pic:blipFill>
-                          <a:blip r:embed="rId19"/>
-                          <a:stretch>
-                            <a:fillRect/>
-                          </a:stretch>
-                        </pic:blipFill>
-                        <pic:spPr>
-                          <a:xfrm>
-                            <a:off x="0" y="0"/>
-                            <a:ext cx="1666190" cy="3657600"/>
-                          </a:xfrm>
-                          <a:prstGeom prst="rect"/>
-                        </pic:spPr>
-                      </pic:pic>
-                    </a:graphicData>
-                  </a:graphic>
-                </wp:inline>
-              </w:drawing>
-            </w:r>
-            <w:r>
-              <w:rPr>
-                <w:rFonts w:ascii="Microsoft YaHei" w:hAnsi="Microsoft YaHei" w:eastAsia="Microsoft YaHei"/>
-              </w:rPr>
-              <w:br/>
-            </w:r>
-            <w:r>
-              <w:rPr>
-                <w:rFonts w:ascii="Microsoft YaHei" w:hAnsi="Microsoft YaHei" w:eastAsia="Microsoft YaHei"/>
-                <w:b w:val="0"/>
-                <w:i/>
-              </w:rPr>
-              <w:t>图3-10：我的；无顶部标题栏，退出图标紧挨昵称右侧、扫一扫位于右上，其下为帮助中心、检查更新和关于。</w:t>
-            </w:r>
-            <w:r>
-              <w:rPr>
-                <w:rFonts w:ascii="Microsoft YaHei" w:hAnsi="Microsoft YaHei" w:eastAsia="Microsoft YaHei"/>
-              </w:rPr>
-              <w:br/>
             </w:r>
             <w:r>
               <w:rPr>
@@ -8366,7 +8658,7 @@
                     <a:graphicData uri="http://schemas.openxmlformats.org/drawingml/2006/picture">
                       <pic:pic>
                         <pic:nvPicPr>
-                          <pic:cNvPr id="0" name="standalone-mobile-logout.png"/>
+                          <pic:cNvPr id="0" name="standalone-mobile-profile.png"/>
                           <pic:cNvPicPr/>
                         </pic:nvPicPr>
                         <pic:blipFill>
@@ -8400,6 +8692,63 @@
                 <w:b w:val="0"/>
                 <w:i/>
               </w:rPr>
+              <w:t>图3-10：我的；无顶部标题栏，退出图标紧挨昵称右侧、扫一扫位于右上，其下为帮助中心、检查更新和关于。</w:t>
+            </w:r>
+            <w:r>
+              <w:rPr>
+                <w:rFonts w:ascii="Microsoft YaHei" w:hAnsi="Microsoft YaHei" w:eastAsia="Microsoft YaHei"/>
+              </w:rPr>
+              <w:br/>
+            </w:r>
+            <w:r>
+              <w:rPr>
+                <w:rFonts w:ascii="Microsoft YaHei" w:hAnsi="Microsoft YaHei" w:eastAsia="Microsoft YaHei"/>
+              </w:rPr>
+              <w:drawing>
+                <wp:inline xmlns:a="http://schemas.openxmlformats.org/drawingml/2006/main" xmlns:pic="http://schemas.openxmlformats.org/drawingml/2006/picture">
+                  <wp:extent cx="1666190" cy="3657600"/>
+                  <wp:docPr id="13" name="Picture 13"/>
+                  <wp:cNvGraphicFramePr>
+                    <a:graphicFrameLocks noChangeAspect="1"/>
+                  </wp:cNvGraphicFramePr>
+                  <a:graphic>
+                    <a:graphicData uri="http://schemas.openxmlformats.org/drawingml/2006/picture">
+                      <pic:pic>
+                        <pic:nvPicPr>
+                          <pic:cNvPr id="0" name="standalone-mobile-logout.png"/>
+                          <pic:cNvPicPr/>
+                        </pic:nvPicPr>
+                        <pic:blipFill>
+                          <a:blip r:embed="rId21"/>
+                          <a:stretch>
+                            <a:fillRect/>
+                          </a:stretch>
+                        </pic:blipFill>
+                        <pic:spPr>
+                          <a:xfrm>
+                            <a:off x="0" y="0"/>
+                            <a:ext cx="1666190" cy="3657600"/>
+                          </a:xfrm>
+                          <a:prstGeom prst="rect"/>
+                        </pic:spPr>
+                      </pic:pic>
+                    </a:graphicData>
+                  </a:graphic>
+                </wp:inline>
+              </w:drawing>
+            </w:r>
+            <w:r>
+              <w:rPr>
+                <w:rFonts w:ascii="Microsoft YaHei" w:hAnsi="Microsoft YaHei" w:eastAsia="Microsoft YaHei"/>
+              </w:rPr>
+              <w:br/>
+            </w:r>
+            <w:r>
+              <w:rPr>
+                <w:rFonts w:ascii="Microsoft YaHei" w:hAnsi="Microsoft YaHei" w:eastAsia="Microsoft YaHei"/>
+                <w:b w:val="0"/>
+                <w:i/>
+              </w:rPr>
               <w:t>图3-10a：我的页上方显示退出登录确认框。</w:t>
             </w:r>
             <w:r>
@@ -8442,7 +8791,7 @@
                 <w:b w:val="0"/>
                 <w:i w:val="0"/>
               </w:rPr>
-              <w:t>1. 不显示顶部“我的”标题及其标题栏，右上保留扫一扫；账号区显示头像、昵称和脱敏账号，退出图标紧挨昵称右侧，不放在整行最右端，不显示退出文字；图标按钮的aria-label和title均为“退出登录”。除退出按钮外，头像和账号资料静态展示，不显示右箭头，不作为按钮或入口。</w:t>
+              <w:t>1. 不显示顶部“我的”标题及其标题栏，右上保留扫一扫；账号区显示静态头像、昵称，下方显示当前盖世UID，退出图标紧挨昵称右侧，不放在整行最右端，不显示退出文字；图标按钮的aria-label和title均为“退出登录”。除退出按钮外，头像和账号资料静态展示，不显示右箭头，不作为按钮或入口。</w:t>
             </w:r>
             <w:r>
               <w:rPr>
@@ -8470,7 +8819,7 @@
                 <w:b w:val="0"/>
                 <w:i w:val="0"/>
               </w:rPr>
-              <w:t>3. 页面使用浅色样式，不提供风格、浅色模式或黑夜模式选项。Demo显示演示头像、昵称和“MVP 演示版”；正式账号资料与版本来自当前账号和安装包。</w:t>
+              <w:t>3. 页面使用浅色样式，不提供风格、浅色模式或黑夜模式选项。Demo显示演示头像、昵称和“MVP 演示版”；正式账号资料与版本来自当前账号和安装包。新账号使用账号体系提供的默认头像/昵称；用户在盖世游戏修改后，本端重新获取账号资料时同步，不开放本端编辑。Demo的UID为按账号派生的稳定演示编号，同账号跨端一致；真实UID待账号服务接入。</w:t>
             </w:r>
             <w:r>
               <w:rPr>
@@ -8938,7 +9287,7 @@
               <w:drawing>
                 <wp:inline xmlns:a="http://schemas.openxmlformats.org/drawingml/2006/main" xmlns:pic="http://schemas.openxmlformats.org/drawingml/2006/picture">
                   <wp:extent cx="1666190" cy="3657600"/>
-                  <wp:docPr id="13" name="Picture 13"/>
+                  <wp:docPr id="14" name="Picture 14"/>
                   <wp:cNvGraphicFramePr>
                     <a:graphicFrameLocks noChangeAspect="1"/>
                   </wp:cNvGraphicFramePr>
@@ -8950,7 +9299,7 @@
                           <pic:cNvPicPr/>
                         </pic:nvPicPr>
                         <pic:blipFill>
-                          <a:blip r:embed="rId21"/>
+                          <a:blip r:embed="rId22"/>
                           <a:stretch>
                             <a:fillRect/>
                           </a:stretch>
@@ -9497,7 +9846,7 @@
               <w:drawing>
                 <wp:inline xmlns:a="http://schemas.openxmlformats.org/drawingml/2006/main" xmlns:pic="http://schemas.openxmlformats.org/drawingml/2006/picture">
                   <wp:extent cx="1666190" cy="3657600"/>
-                  <wp:docPr id="14" name="Picture 14"/>
+                  <wp:docPr id="15" name="Picture 15"/>
                   <wp:cNvGraphicFramePr>
                     <a:graphicFrameLocks noChangeAspect="1"/>
                   </wp:cNvGraphicFramePr>
@@ -9509,7 +9858,7 @@
                           <pic:cNvPicPr/>
                         </pic:nvPicPr>
                         <pic:blipFill>
-                          <a:blip r:embed="rId22"/>
+                          <a:blip r:embed="rId23"/>
                           <a:stretch>
                             <a:fillRect/>
                           </a:stretch>
@@ -9767,7 +10116,7 @@
                 <w:b w:val="0"/>
                 <w:i w:val="0"/>
               </w:rPr>
-              <w:t>1. 当前内容为演示内置文章，不新增反馈提交或客服流程；正式文章内容、更新来源与审核责任待运营确认。</w:t>
+              <w:t>1. 当前Demo为内置文章；正式内容采用静态H5，由运营提供并审核、服务端维护，客户端打开，更新文章不新增运营配置页。不新增反馈提交或客服流程。</w:t>
             </w:r>
           </w:p>
         </w:tc>
@@ -10140,7 +10489,7 @@
               <w:drawing>
                 <wp:inline xmlns:a="http://schemas.openxmlformats.org/drawingml/2006/main" xmlns:pic="http://schemas.openxmlformats.org/drawingml/2006/picture">
                   <wp:extent cx="1666190" cy="3657600"/>
-                  <wp:docPr id="15" name="Picture 15"/>
+                  <wp:docPr id="16" name="Picture 16"/>
                   <wp:cNvGraphicFramePr>
                     <a:graphicFrameLocks noChangeAspect="1"/>
                   </wp:cNvGraphicFramePr>
@@ -10152,7 +10501,7 @@
                           <pic:cNvPicPr/>
                         </pic:nvPicPr>
                         <pic:blipFill>
-                          <a:blip r:embed="rId23"/>
+                          <a:blip r:embed="rId24"/>
                           <a:stretch>
                             <a:fillRect/>
                           </a:stretch>
@@ -10543,7 +10892,7 @@
                 <w:b w:val="0"/>
                 <w:i w:val="0"/>
               </w:rPr>
-              <w:t>阅读用户协议、隐私协议及信息清单入口。</w:t>
+              <w:t>阅读用户协议、隐私协议及信息清单，提供账号注销入口。</w:t>
             </w:r>
           </w:p>
         </w:tc>
@@ -10755,7 +11104,7 @@
               <w:drawing>
                 <wp:inline xmlns:a="http://schemas.openxmlformats.org/drawingml/2006/main" xmlns:pic="http://schemas.openxmlformats.org/drawingml/2006/picture">
                   <wp:extent cx="1666190" cy="3657600"/>
-                  <wp:docPr id="16" name="Picture 16"/>
+                  <wp:docPr id="17" name="Picture 17"/>
                   <wp:cNvGraphicFramePr>
                     <a:graphicFrameLocks noChangeAspect="1"/>
                   </wp:cNvGraphicFramePr>
@@ -10767,7 +11116,7 @@
                           <pic:cNvPicPr/>
                         </pic:nvPicPr>
                         <pic:blipFill>
-                          <a:blip r:embed="rId24"/>
+                          <a:blip r:embed="rId25"/>
                           <a:stretch>
                             <a:fillRect/>
                           </a:stretch>
@@ -10797,7 +11146,7 @@
                 <w:b w:val="0"/>
                 <w:i/>
               </w:rPr>
-              <w:t>图3-25：移动端关于；仅协议与信息清单入口。</w:t>
+              <w:t>图3-25：移动端关于；协议/信息清单及已登录时的注销账号入口。</w:t>
             </w:r>
             <w:r>
               <w:rPr>
@@ -10808,6 +11157,63 @@
             <w:r>
               <w:rPr>
                 <w:rFonts w:ascii="Microsoft YaHei" w:hAnsi="Microsoft YaHei" w:eastAsia="Microsoft YaHei"/>
+              </w:rPr>
+              <w:drawing>
+                <wp:inline xmlns:a="http://schemas.openxmlformats.org/drawingml/2006/main" xmlns:pic="http://schemas.openxmlformats.org/drawingml/2006/picture">
+                  <wp:extent cx="1790932" cy="3657600"/>
+                  <wp:docPr id="18" name="Picture 18"/>
+                  <wp:cNvGraphicFramePr>
+                    <a:graphicFrameLocks noChangeAspect="1"/>
+                  </wp:cNvGraphicFramePr>
+                  <a:graphic>
+                    <a:graphicData uri="http://schemas.openxmlformats.org/drawingml/2006/picture">
+                      <pic:pic>
+                        <pic:nvPicPr>
+                          <pic:cNvPr id="0" name="standalone-mobile-account-deletion.png"/>
+                          <pic:cNvPicPr/>
+                        </pic:nvPicPr>
+                        <pic:blipFill>
+                          <a:blip r:embed="rId26"/>
+                          <a:stretch>
+                            <a:fillRect/>
+                          </a:stretch>
+                        </pic:blipFill>
+                        <pic:spPr>
+                          <a:xfrm>
+                            <a:off x="0" y="0"/>
+                            <a:ext cx="1790932" cy="3657600"/>
+                          </a:xfrm>
+                          <a:prstGeom prst="rect"/>
+                        </pic:spPr>
+                      </pic:pic>
+                    </a:graphicData>
+                  </a:graphic>
+                </wp:inline>
+              </w:drawing>
+            </w:r>
+            <w:r>
+              <w:rPr>
+                <w:rFonts w:ascii="Microsoft YaHei" w:hAnsi="Microsoft YaHei" w:eastAsia="Microsoft YaHei"/>
+              </w:rPr>
+              <w:br/>
+            </w:r>
+            <w:r>
+              <w:rPr>
+                <w:rFonts w:ascii="Microsoft YaHei" w:hAnsi="Microsoft YaHei" w:eastAsia="Microsoft YaHei"/>
+                <w:b w:val="0"/>
+                <w:i/>
+              </w:rPr>
+              <w:t>图3-25a：点击注销账号后在原页显示待接入说明，不模拟注销完成。</w:t>
+            </w:r>
+            <w:r>
+              <w:rPr>
+                <w:rFonts w:ascii="Microsoft YaHei" w:hAnsi="Microsoft YaHei" w:eastAsia="Microsoft YaHei"/>
+              </w:rPr>
+              <w:br/>
+            </w:r>
+            <w:r>
+              <w:rPr>
+                <w:rFonts w:ascii="Microsoft YaHei" w:hAnsi="Microsoft YaHei" w:eastAsia="Microsoft YaHei"/>
                 <w:b/>
                 <w:i w:val="0"/>
               </w:rPr>
@@ -10839,7 +11245,7 @@
                 <w:b w:val="0"/>
                 <w:i w:val="0"/>
               </w:rPr>
-              <w:t>1. 页面标题为“关于盖世远程”；内容仅显示用户协议、隐私协议、个人信息收集清单、第三方信息共享清单四项，不放检查更新、当前版本、Logo或产品介绍。</w:t>
+              <w:t>1. 页面标题为“关于盖世远程”；显示用户协议、隐私协议、个人信息收集清单、第三方信息共享清单四项；仅登录时在其后显示“注销账号”。不放检查更新、当前版本、Logo或产品介绍。</w:t>
             </w:r>
             <w:r>
               <w:rPr>
@@ -10868,6 +11274,20 @@
                 <w:i w:val="0"/>
               </w:rPr>
               <w:t>1. 点击协议或清单，当前Demo只就地显示“正式内容与地址待接入，当前 Demo 仅展示入口。”，不显示编造正文，不改变登录同意状态。返回回我的。</w:t>
+            </w:r>
+            <w:r>
+              <w:rPr>
+                <w:rFonts w:ascii="Microsoft YaHei" w:hAnsi="Microsoft YaHei" w:eastAsia="Microsoft YaHei"/>
+              </w:rPr>
+              <w:br/>
+            </w:r>
+            <w:r>
+              <w:rPr>
+                <w:rFonts w:ascii="Microsoft YaHei" w:hAnsi="Microsoft YaHei" w:eastAsia="Microsoft YaHei"/>
+                <w:b w:val="0"/>
+                <w:i w:val="0"/>
+              </w:rPr>
+              <w:t>2. 点击注销账号，正式版本打开盖世账号注销H5流程；当前无正式地址时在现有说明区域显示“注销账号页面待接入，正式版本将打开盖世账号注销流程。”，不跳虚构网址、不退出账号或模拟注销成功。</w:t>
             </w:r>
           </w:p>
         </w:tc>
@@ -10932,7 +11352,7 @@
                 <w:b w:val="0"/>
                 <w:i w:val="0"/>
               </w:rPr>
-              <w:t>显示四项条款/清单入口及对应待接入说明。</w:t>
+              <w:t>显示四项条款/清单及登录态下的注销入口；未接入时显示相应说明，不改变账号状态。</w:t>
             </w:r>
           </w:p>
         </w:tc>
@@ -10998,6 +11418,20 @@
                 <w:i w:val="0"/>
               </w:rPr>
               <w:t>1. 关于页中的协议阅读不代表同意登录协议；中国移动认证服务协议仍在国内适用登录场景展示。</w:t>
+            </w:r>
+            <w:r>
+              <w:rPr>
+                <w:rFonts w:ascii="Microsoft YaHei" w:hAnsi="Microsoft YaHei" w:eastAsia="Microsoft YaHei"/>
+              </w:rPr>
+              <w:br/>
+            </w:r>
+            <w:r>
+              <w:rPr>
+                <w:rFonts w:ascii="Microsoft YaHei" w:hAnsi="Microsoft YaHei" w:eastAsia="Microsoft YaHei"/>
+                <w:b w:val="0"/>
+                <w:i w:val="0"/>
+              </w:rPr>
+              <w:t>2. 注销复用账号体系的既有H5，资格、确认步骤、生效及回传由该流程提供，不另拟规则；真实地址及结果衔接未接入前不宣称可完成注销。</w:t>
             </w:r>
           </w:p>
         </w:tc>
@@ -11370,7 +11804,7 @@
               <w:drawing>
                 <wp:inline xmlns:a="http://schemas.openxmlformats.org/drawingml/2006/main" xmlns:pic="http://schemas.openxmlformats.org/drawingml/2006/picture">
                   <wp:extent cx="1666190" cy="3657600"/>
-                  <wp:docPr id="17" name="Picture 17"/>
+                  <wp:docPr id="19" name="Picture 19"/>
                   <wp:cNvGraphicFramePr>
                     <a:graphicFrameLocks noChangeAspect="1"/>
                   </wp:cNvGraphicFramePr>
@@ -11382,7 +11816,7 @@
                           <pic:cNvPicPr/>
                         </pic:nvPicPr>
                         <pic:blipFill>
-                          <a:blip r:embed="rId25"/>
+                          <a:blip r:embed="rId27"/>
                           <a:stretch>
                             <a:fillRect/>
                           </a:stretch>
@@ -11427,7 +11861,7 @@
               <w:drawing>
                 <wp:inline xmlns:a="http://schemas.openxmlformats.org/drawingml/2006/main" xmlns:pic="http://schemas.openxmlformats.org/drawingml/2006/picture">
                   <wp:extent cx="1666190" cy="3657600"/>
-                  <wp:docPr id="18" name="Picture 18"/>
+                  <wp:docPr id="20" name="Picture 20"/>
                   <wp:cNvGraphicFramePr>
                     <a:graphicFrameLocks noChangeAspect="1"/>
                   </wp:cNvGraphicFramePr>
@@ -11439,7 +11873,7 @@
                           <pic:cNvPicPr/>
                         </pic:nvPicPr>
                         <pic:blipFill>
-                          <a:blip r:embed="rId26"/>
+                          <a:blip r:embed="rId28"/>
                           <a:stretch>
                             <a:fillRect/>
                           </a:stretch>
@@ -11726,6 +12160,2265 @@
                 <w:i w:val="0"/>
               </w:rPr>
               <w:t>2. Demo二维码为同源本地记录，只在共享同源存储的演示页面间模拟状态；真实跨设备身份认证未接通。外部评审模拟入口不属于正式App功能；不能用该按钮证明真实扫码服务成功。</w:t>
+            </w:r>
+          </w:p>
+        </w:tc>
+      </w:tr>
+    </w:tbl>
+    <w:p>
+      <w:pPr>
+        <w:spacing w:after="20"/>
+      </w:pPr>
+    </w:p>
+    <w:p>
+      <w:pPr>
+        <w:pStyle w:val="Heading3"/>
+      </w:pPr>
+      <w:r>
+        <w:rPr>
+          <w:b w:val="0"/>
+          <w:i w:val="0"/>
+        </w:rPr>
+        <w:t>3.1.12 按键布局库</w:t>
+      </w:r>
+    </w:p>
+    <w:tbl>
+      <w:tblPr>
+        <w:tblStyle w:val="TableGrid"/>
+        <w:tblW w:type="auto" w:w="0"/>
+        <w:tblLayout w:type="autofit"/>
+        <w:tblLook w:firstColumn="1" w:firstRow="1" w:lastColumn="0" w:lastRow="0" w:noHBand="0" w:noVBand="1" w:val="04A0"/>
+      </w:tblPr>
+      <w:tblGrid>
+        <w:gridCol w:w="5184"/>
+        <w:gridCol w:w="5184"/>
+      </w:tblGrid>
+      <w:tr>
+        <w:trPr>
+          <w:cantSplit/>
+        </w:trPr>
+        <w:tc>
+          <w:tcPr>
+            <w:tcW w:type="dxa" w:w="5184"/>
+            <w:vAlign w:val="top"/>
+            <w:tcMar>
+              <w:top w:w="80" w:type="dxa"/>
+              <w:start w:w="100" w:type="dxa"/>
+              <w:bottom w:w="80" w:type="dxa"/>
+              <w:end w:w="100" w:type="dxa"/>
+            </w:tcMar>
+            <w:shd w:fill="E9EDF2"/>
+          </w:tcPr>
+          <w:p>
+            <w:pPr>
+              <w:spacing w:after="40"/>
+            </w:pPr>
+            <w:r>
+              <w:rPr>
+                <w:rFonts w:ascii="Microsoft YaHei" w:hAnsi="Microsoft YaHei" w:eastAsia="Microsoft YaHei"/>
+              </w:rPr>
+            </w:r>
+            <w:r>
+              <w:rPr>
+                <w:rFonts w:ascii="Microsoft YaHei" w:hAnsi="Microsoft YaHei" w:eastAsia="Microsoft YaHei"/>
+                <w:b w:val="0"/>
+                <w:i w:val="0"/>
+              </w:rPr>
+              <w:t>要素</w:t>
+            </w:r>
+          </w:p>
+        </w:tc>
+        <w:tc>
+          <w:tcPr>
+            <w:tcW w:type="dxa" w:w="5184"/>
+            <w:vAlign w:val="top"/>
+            <w:tcMar>
+              <w:top w:w="80" w:type="dxa"/>
+              <w:start w:w="100" w:type="dxa"/>
+              <w:bottom w:w="80" w:type="dxa"/>
+              <w:end w:w="100" w:type="dxa"/>
+            </w:tcMar>
+            <w:shd w:fill="E9EDF2"/>
+          </w:tcPr>
+          <w:p>
+            <w:pPr>
+              <w:spacing w:after="40"/>
+            </w:pPr>
+            <w:r>
+              <w:rPr>
+                <w:rFonts w:ascii="Microsoft YaHei" w:hAnsi="Microsoft YaHei" w:eastAsia="Microsoft YaHei"/>
+              </w:rPr>
+            </w:r>
+            <w:r>
+              <w:rPr>
+                <w:rFonts w:ascii="Microsoft YaHei" w:hAnsi="Microsoft YaHei" w:eastAsia="Microsoft YaHei"/>
+                <w:b w:val="0"/>
+                <w:i w:val="0"/>
+              </w:rPr>
+              <w:t>内容说明</w:t>
+            </w:r>
+          </w:p>
+        </w:tc>
+      </w:tr>
+      <w:tr>
+        <w:trPr>
+          <w:cantSplit/>
+        </w:trPr>
+        <w:tc>
+          <w:tcPr>
+            <w:tcW w:type="dxa" w:w="5184"/>
+            <w:vAlign w:val="top"/>
+            <w:tcMar>
+              <w:top w:w="80" w:type="dxa"/>
+              <w:start w:w="100" w:type="dxa"/>
+              <w:bottom w:w="80" w:type="dxa"/>
+              <w:end w:w="100" w:type="dxa"/>
+            </w:tcMar>
+          </w:tcPr>
+          <w:p>
+            <w:pPr>
+              <w:spacing w:after="40"/>
+            </w:pPr>
+            <w:r>
+              <w:rPr>
+                <w:rFonts w:ascii="Microsoft YaHei" w:hAnsi="Microsoft YaHei" w:eastAsia="Microsoft YaHei"/>
+              </w:rPr>
+            </w:r>
+            <w:r>
+              <w:rPr>
+                <w:rFonts w:ascii="Microsoft YaHei" w:hAnsi="Microsoft YaHei" w:eastAsia="Microsoft YaHei"/>
+                <w:b w:val="0"/>
+                <w:i w:val="0"/>
+              </w:rPr>
+              <w:t>功能简介</w:t>
+            </w:r>
+          </w:p>
+        </w:tc>
+        <w:tc>
+          <w:tcPr>
+            <w:tcW w:type="dxa" w:w="5184"/>
+            <w:vAlign w:val="top"/>
+            <w:tcMar>
+              <w:top w:w="80" w:type="dxa"/>
+              <w:start w:w="100" w:type="dxa"/>
+              <w:bottom w:w="80" w:type="dxa"/>
+              <w:end w:w="100" w:type="dxa"/>
+            </w:tcMar>
+          </w:tcPr>
+          <w:p>
+            <w:pPr>
+              <w:spacing w:after="40"/>
+            </w:pPr>
+            <w:r>
+              <w:rPr>
+                <w:rFonts w:ascii="Microsoft YaHei" w:hAnsi="Microsoft YaHei" w:eastAsia="Microsoft YaHei"/>
+              </w:rPr>
+            </w:r>
+            <w:r>
+              <w:rPr>
+                <w:rFonts w:ascii="Microsoft YaHei" w:hAnsi="Microsoft YaHei" w:eastAsia="Microsoft YaHei"/>
+                <w:b w:val="0"/>
+                <w:i w:val="0"/>
+              </w:rPr>
+              <w:t>查找、应用、编辑和复制按键方案，发布云分享并通过布局码导入。</w:t>
+            </w:r>
+          </w:p>
+        </w:tc>
+      </w:tr>
+      <w:tr>
+        <w:trPr>
+          <w:cantSplit/>
+        </w:trPr>
+        <w:tc>
+          <w:tcPr>
+            <w:tcW w:type="dxa" w:w="5184"/>
+            <w:vAlign w:val="top"/>
+            <w:tcMar>
+              <w:top w:w="80" w:type="dxa"/>
+              <w:start w:w="100" w:type="dxa"/>
+              <w:bottom w:w="80" w:type="dxa"/>
+              <w:end w:w="100" w:type="dxa"/>
+            </w:tcMar>
+          </w:tcPr>
+          <w:p>
+            <w:pPr>
+              <w:spacing w:after="40"/>
+            </w:pPr>
+            <w:r>
+              <w:rPr>
+                <w:rFonts w:ascii="Microsoft YaHei" w:hAnsi="Microsoft YaHei" w:eastAsia="Microsoft YaHei"/>
+              </w:rPr>
+            </w:r>
+            <w:r>
+              <w:rPr>
+                <w:rFonts w:ascii="Microsoft YaHei" w:hAnsi="Microsoft YaHei" w:eastAsia="Microsoft YaHei"/>
+                <w:b w:val="0"/>
+                <w:i w:val="0"/>
+              </w:rPr>
+              <w:t>场景描述</w:t>
+            </w:r>
+          </w:p>
+        </w:tc>
+        <w:tc>
+          <w:tcPr>
+            <w:tcW w:type="dxa" w:w="5184"/>
+            <w:vAlign w:val="top"/>
+            <w:tcMar>
+              <w:top w:w="80" w:type="dxa"/>
+              <w:start w:w="100" w:type="dxa"/>
+              <w:bottom w:w="80" w:type="dxa"/>
+              <w:end w:w="100" w:type="dxa"/>
+            </w:tcMar>
+          </w:tcPr>
+          <w:p>
+            <w:pPr>
+              <w:spacing w:after="40"/>
+            </w:pPr>
+            <w:r>
+              <w:rPr>
+                <w:rFonts w:ascii="Microsoft YaHei" w:hAnsi="Microsoft YaHei" w:eastAsia="Microsoft YaHei"/>
+              </w:rPr>
+            </w:r>
+            <w:r>
+              <w:rPr>
+                <w:rFonts w:ascii="Microsoft YaHei" w:hAnsi="Microsoft YaHei" w:eastAsia="Microsoft YaHei"/>
+                <w:b w:val="0"/>
+                <w:i w:val="0"/>
+              </w:rPr>
+              <w:t>移动端控制会话中，从原“切换虚拟按键布局／映射方案”入口打开布局库；普通桌面会话也可提前编辑和应用，之后进入游戏时生效。</w:t>
+            </w:r>
+          </w:p>
+        </w:tc>
+      </w:tr>
+      <w:tr>
+        <w:trPr>
+          <w:cantSplit/>
+        </w:trPr>
+        <w:tc>
+          <w:tcPr>
+            <w:tcW w:type="dxa" w:w="5184"/>
+            <w:vAlign w:val="top"/>
+            <w:tcMar>
+              <w:top w:w="80" w:type="dxa"/>
+              <w:start w:w="100" w:type="dxa"/>
+              <w:bottom w:w="80" w:type="dxa"/>
+              <w:end w:w="100" w:type="dxa"/>
+            </w:tcMar>
+          </w:tcPr>
+          <w:p>
+            <w:pPr>
+              <w:spacing w:after="40"/>
+            </w:pPr>
+            <w:r>
+              <w:rPr>
+                <w:rFonts w:ascii="Microsoft YaHei" w:hAnsi="Microsoft YaHei" w:eastAsia="Microsoft YaHei"/>
+              </w:rPr>
+            </w:r>
+            <w:r>
+              <w:rPr>
+                <w:rFonts w:ascii="Microsoft YaHei" w:hAnsi="Microsoft YaHei" w:eastAsia="Microsoft YaHei"/>
+                <w:b w:val="0"/>
+                <w:i w:val="0"/>
+              </w:rPr>
+              <w:t>输入／前置条件</w:t>
+            </w:r>
+          </w:p>
+        </w:tc>
+        <w:tc>
+          <w:tcPr>
+            <w:tcW w:type="dxa" w:w="5184"/>
+            <w:vAlign w:val="top"/>
+            <w:tcMar>
+              <w:top w:w="80" w:type="dxa"/>
+              <w:start w:w="100" w:type="dxa"/>
+              <w:bottom w:w="80" w:type="dxa"/>
+              <w:end w:w="100" w:type="dxa"/>
+            </w:tcMar>
+          </w:tcPr>
+          <w:p>
+            <w:pPr>
+              <w:spacing w:after="40"/>
+            </w:pPr>
+            <w:r>
+              <w:rPr>
+                <w:rFonts w:ascii="Microsoft YaHei" w:hAnsi="Microsoft YaHei" w:eastAsia="Microsoft YaHei"/>
+              </w:rPr>
+            </w:r>
+            <w:r>
+              <w:rPr>
+                <w:rFonts w:ascii="Microsoft YaHei" w:hAnsi="Microsoft YaHei" w:eastAsia="Microsoft YaHei"/>
+                <w:b w:val="0"/>
+                <w:i w:val="0"/>
+              </w:rPr>
+              <w:t>当前账号已登录且控制会话有效；仅观看不能打开布局库、编辑或应用。游戏布局关联当前游戏，通用布局可跨游戏；账号归属单独隔离。</w:t>
+            </w:r>
+          </w:p>
+        </w:tc>
+      </w:tr>
+      <w:tr>
+        <w:trPr>
+          <w:cantSplit/>
+        </w:trPr>
+        <w:tc>
+          <w:tcPr>
+            <w:tcW w:type="dxa" w:w="5184"/>
+            <w:vAlign w:val="top"/>
+            <w:tcMar>
+              <w:top w:w="80" w:type="dxa"/>
+              <w:start w:w="100" w:type="dxa"/>
+              <w:bottom w:w="80" w:type="dxa"/>
+              <w:end w:w="100" w:type="dxa"/>
+            </w:tcMar>
+          </w:tcPr>
+          <w:p>
+            <w:pPr>
+              <w:spacing w:after="40"/>
+            </w:pPr>
+            <w:r>
+              <w:rPr>
+                <w:rFonts w:ascii="Microsoft YaHei" w:hAnsi="Microsoft YaHei" w:eastAsia="Microsoft YaHei"/>
+              </w:rPr>
+            </w:r>
+            <w:r>
+              <w:rPr>
+                <w:rFonts w:ascii="Microsoft YaHei" w:hAnsi="Microsoft YaHei" w:eastAsia="Microsoft YaHei"/>
+                <w:b w:val="0"/>
+                <w:i w:val="0"/>
+              </w:rPr>
+              <w:t>需求描述</w:t>
+            </w:r>
+          </w:p>
+        </w:tc>
+        <w:tc>
+          <w:tcPr>
+            <w:tcW w:type="dxa" w:w="5184"/>
+            <w:vAlign w:val="top"/>
+            <w:tcMar>
+              <w:top w:w="80" w:type="dxa"/>
+              <w:start w:w="100" w:type="dxa"/>
+              <w:bottom w:w="80" w:type="dxa"/>
+              <w:end w:w="100" w:type="dxa"/>
+            </w:tcMar>
+          </w:tcPr>
+          <w:p>
+            <w:pPr>
+              <w:spacing w:after="40"/>
+            </w:pPr>
+            <w:r>
+              <w:rPr>
+                <w:rFonts w:ascii="Microsoft YaHei" w:hAnsi="Microsoft YaHei" w:eastAsia="Microsoft YaHei"/>
+              </w:rPr>
+            </w:r>
+            <w:r>
+              <w:rPr>
+                <w:rFonts w:ascii="Microsoft YaHei" w:hAnsi="Microsoft YaHei" w:eastAsia="Microsoft YaHei"/>
+                <w:b/>
+                <w:i w:val="0"/>
+              </w:rPr>
+              <w:t>图示：</w:t>
+            </w:r>
+            <w:r>
+              <w:rPr>
+                <w:rFonts w:ascii="Microsoft YaHei" w:hAnsi="Microsoft YaHei" w:eastAsia="Microsoft YaHei"/>
+                <w:b w:val="0"/>
+                <w:i w:val="0"/>
+              </w:rPr>
+              <w:t xml:space="preserve"> </w:t>
+            </w:r>
+            <w:r>
+              <w:rPr>
+                <w:rFonts w:ascii="Microsoft YaHei" w:hAnsi="Microsoft YaHei" w:eastAsia="Microsoft YaHei"/>
+              </w:rPr>
+              <w:drawing>
+                <wp:inline xmlns:a="http://schemas.openxmlformats.org/drawingml/2006/main" xmlns:pic="http://schemas.openxmlformats.org/drawingml/2006/picture">
+                  <wp:extent cx="2880360" cy="1618142"/>
+                  <wp:docPr id="21" name="Picture 21"/>
+                  <wp:cNvGraphicFramePr>
+                    <a:graphicFrameLocks noChangeAspect="1"/>
+                  </wp:cNvGraphicFramePr>
+                  <a:graphic>
+                    <a:graphicData uri="http://schemas.openxmlformats.org/drawingml/2006/picture">
+                      <pic:pic>
+                        <pic:nvPicPr>
+                          <pic:cNvPr id="0" name="standalone-mobile-layout-library.png"/>
+                          <pic:cNvPicPr/>
+                        </pic:nvPicPr>
+                        <pic:blipFill>
+                          <a:blip r:embed="rId29"/>
+                          <a:stretch>
+                            <a:fillRect/>
+                          </a:stretch>
+                        </pic:blipFill>
+                        <pic:spPr>
+                          <a:xfrm>
+                            <a:off x="0" y="0"/>
+                            <a:ext cx="2880360" cy="1618142"/>
+                          </a:xfrm>
+                          <a:prstGeom prst="rect"/>
+                        </pic:spPr>
+                      </pic:pic>
+                    </a:graphicData>
+                  </a:graphic>
+                </wp:inline>
+              </w:drawing>
+            </w:r>
+            <w:r>
+              <w:rPr>
+                <w:rFonts w:ascii="Microsoft YaHei" w:hAnsi="Microsoft YaHei" w:eastAsia="Microsoft YaHei"/>
+              </w:rPr>
+              <w:br/>
+            </w:r>
+            <w:r>
+              <w:rPr>
+                <w:rFonts w:ascii="Microsoft YaHei" w:hAnsi="Microsoft YaHei" w:eastAsia="Microsoft YaHei"/>
+                <w:b w:val="0"/>
+                <w:i/>
+              </w:rPr>
+              <w:t>图3-31：移动端控制会话中的按键布局库，推荐／我的方案／我的云分享。</w:t>
+            </w:r>
+            <w:r>
+              <w:rPr>
+                <w:rFonts w:ascii="Microsoft YaHei" w:hAnsi="Microsoft YaHei" w:eastAsia="Microsoft YaHei"/>
+              </w:rPr>
+              <w:br/>
+            </w:r>
+            <w:r>
+              <w:rPr>
+                <w:rFonts w:ascii="Microsoft YaHei" w:hAnsi="Microsoft YaHei" w:eastAsia="Microsoft YaHei"/>
+                <w:b/>
+                <w:i w:val="0"/>
+              </w:rPr>
+              <w:t>详细说明：</w:t>
+            </w:r>
+            <w:r>
+              <w:rPr>
+                <w:rFonts w:ascii="Microsoft YaHei" w:hAnsi="Microsoft YaHei" w:eastAsia="Microsoft YaHei"/>
+              </w:rPr>
+              <w:br/>
+            </w:r>
+            <w:r>
+              <w:rPr>
+                <w:rFonts w:ascii="Microsoft YaHei" w:hAnsi="Microsoft YaHei" w:eastAsia="Microsoft YaHei"/>
+                <w:b/>
+                <w:i w:val="0"/>
+              </w:rPr>
+              <w:t>展示说明：</w:t>
+            </w:r>
+            <w:r>
+              <w:rPr>
+                <w:rFonts w:ascii="Microsoft YaHei" w:hAnsi="Microsoft YaHei" w:eastAsia="Microsoft YaHei"/>
+              </w:rPr>
+              <w:br/>
+            </w:r>
+            <w:r>
+              <w:rPr>
+                <w:rFonts w:ascii="Microsoft YaHei" w:hAnsi="Microsoft YaHei" w:eastAsia="Microsoft YaHei"/>
+                <w:b w:val="0"/>
+                <w:i w:val="0"/>
+              </w:rPr>
+              <w:t>1. 同一布局面板提供“推荐”“我的方案”“我的云分享”三个Tab，打开时默认推荐；卡片显示名称、游戏/通用类型、缩略图和使用中状态，详情展示所选方案与可用操作。列表只显示当前游戏及通用方案，Demo当前游戏为《黑神话：悟空》。</w:t>
+            </w:r>
+            <w:r>
+              <w:rPr>
+                <w:rFonts w:ascii="Microsoft YaHei" w:hAnsi="Microsoft YaHei" w:eastAsia="Microsoft YaHei"/>
+              </w:rPr>
+              <w:br/>
+            </w:r>
+            <w:r>
+              <w:rPr>
+                <w:rFonts w:ascii="Microsoft YaHei" w:hAnsi="Microsoft YaHei" w:eastAsia="Microsoft YaHei"/>
+                <w:b w:val="0"/>
+                <w:i w:val="0"/>
+              </w:rPr>
+              <w:t>2. 推荐先显示两个官方示例，再显示本地区其他账号的已分享方案；我的方案/我的云分享仅显示当前账号数据，按新建/发布时间新在前。无数据显示“暂无布局，可新建或导入”，搜索无匹配显示“没有找到相关布局”。不增加排行、下载量、独立官方Tab或图标管理器。正式推荐/云数据由服务端提供，Demo用样例与本机共享目录。</w:t>
+            </w:r>
+            <w:r>
+              <w:rPr>
+                <w:rFonts w:ascii="Microsoft YaHei" w:hAnsi="Microsoft YaHei" w:eastAsia="Microsoft YaHei"/>
+              </w:rPr>
+              <w:br/>
+            </w:r>
+            <w:r>
+              <w:rPr>
+                <w:rFonts w:ascii="Microsoft YaHei" w:hAnsi="Microsoft YaHei" w:eastAsia="Microsoft YaHei"/>
+                <w:b/>
+                <w:i w:val="0"/>
+              </w:rPr>
+              <w:t>交互说明：</w:t>
+            </w:r>
+            <w:r>
+              <w:rPr>
+                <w:rFonts w:ascii="Microsoft YaHei" w:hAnsi="Microsoft YaHei" w:eastAsia="Microsoft YaHei"/>
+              </w:rPr>
+              <w:br/>
+            </w:r>
+            <w:r>
+              <w:rPr>
+                <w:rFonts w:ascii="Microsoft YaHei" w:hAnsi="Microsoft YaHei" w:eastAsia="Microsoft YaHei"/>
+                <w:b w:val="0"/>
+                <w:i w:val="0"/>
+              </w:rPr>
+              <w:t>1. 点击缩略图打开详情；点击应用，保存当前选择并关闭布局库，游戏按键读取已保存坐标。普通桌面会话先保存选择，之后进入适用游戏时生效；打开布局库或详情不应用方案、不重新连接。</w:t>
+            </w:r>
+            <w:r>
+              <w:rPr>
+                <w:rFonts w:ascii="Microsoft YaHei" w:hAnsi="Microsoft YaHei" w:eastAsia="Microsoft YaHei"/>
+              </w:rPr>
+              <w:br/>
+            </w:r>
+            <w:r>
+              <w:rPr>
+                <w:rFonts w:ascii="Microsoft YaHei" w:hAnsi="Microsoft YaHei" w:eastAsia="Microsoft YaHei"/>
+                <w:b w:val="0"/>
+                <w:i w:val="0"/>
+              </w:rPr>
+              <w:t>2. 点击推荐方案的编辑，进入编辑器并保存为当前账号的我的方案副本，不覆盖推荐来源；点击复制，将方案复制到当前账号我的方案。</w:t>
+            </w:r>
+            <w:r>
+              <w:rPr>
+                <w:rFonts w:ascii="Microsoft YaHei" w:hAnsi="Microsoft YaHei" w:eastAsia="Microsoft YaHei"/>
+              </w:rPr>
+              <w:br/>
+            </w:r>
+            <w:r>
+              <w:rPr>
+                <w:rFonts w:ascii="Microsoft YaHei" w:hAnsi="Microsoft YaHei" w:eastAsia="Microsoft YaHei"/>
+                <w:b w:val="0"/>
+                <w:i w:val="0"/>
+              </w:rPr>
+              <w:t>3. 我的方案可以编辑、应用或发布云分享；自己的云方案可编辑名称、类型和按键，保存直接更新原方案及同一码，不再走发布表单。推荐中的官方或他人云方案编辑均保存为我的副本。</w:t>
+            </w:r>
+            <w:r>
+              <w:rPr>
+                <w:rFonts w:ascii="Microsoft YaHei" w:hAnsi="Microsoft YaHei" w:eastAsia="Microsoft YaHei"/>
+              </w:rPr>
+              <w:br/>
+            </w:r>
+            <w:r>
+              <w:rPr>
+                <w:rFonts w:ascii="Microsoft YaHei" w:hAnsi="Microsoft YaHei" w:eastAsia="Microsoft YaHei"/>
+                <w:b w:val="0"/>
+                <w:i w:val="0"/>
+              </w:rPr>
+              <w:t>4. 搜索框不设额外业务长度上限，去首尾空格后按名称包含匹配、忽略英文字母大小写；清空恢复当前列表。切Tab清空搜索，保留各自已保存数据。</w:t>
+            </w:r>
+            <w:r>
+              <w:rPr>
+                <w:rFonts w:ascii="Microsoft YaHei" w:hAnsi="Microsoft YaHei" w:eastAsia="Microsoft YaHei"/>
+              </w:rPr>
+              <w:br/>
+            </w:r>
+            <w:r>
+              <w:rPr>
+                <w:rFonts w:ascii="Microsoft YaHei" w:hAnsi="Microsoft YaHei" w:eastAsia="Microsoft YaHei"/>
+                <w:b w:val="0"/>
+                <w:i w:val="0"/>
+              </w:rPr>
+              <w:t>5. 点击新建布局，填写名称并选择类型，默认游戏布局；创建后进入编辑器。复制继承源类型，默认名称自动避重，用户修改成重名则拒绝。发布/导入规则见本页子功能；本轮不增加删除云方案或注销分享码。</w:t>
+            </w:r>
+          </w:p>
+        </w:tc>
+      </w:tr>
+      <w:tr>
+        <w:trPr>
+          <w:cantSplit/>
+        </w:trPr>
+        <w:tc>
+          <w:tcPr>
+            <w:tcW w:type="dxa" w:w="5184"/>
+            <w:vAlign w:val="top"/>
+            <w:tcMar>
+              <w:top w:w="80" w:type="dxa"/>
+              <w:start w:w="100" w:type="dxa"/>
+              <w:bottom w:w="80" w:type="dxa"/>
+              <w:end w:w="100" w:type="dxa"/>
+            </w:tcMar>
+          </w:tcPr>
+          <w:p>
+            <w:pPr>
+              <w:spacing w:after="40"/>
+            </w:pPr>
+            <w:r>
+              <w:rPr>
+                <w:rFonts w:ascii="Microsoft YaHei" w:hAnsi="Microsoft YaHei" w:eastAsia="Microsoft YaHei"/>
+              </w:rPr>
+            </w:r>
+            <w:r>
+              <w:rPr>
+                <w:rFonts w:ascii="Microsoft YaHei" w:hAnsi="Microsoft YaHei" w:eastAsia="Microsoft YaHei"/>
+                <w:b w:val="0"/>
+                <w:i w:val="0"/>
+              </w:rPr>
+              <w:t>输出／后置条件</w:t>
+            </w:r>
+          </w:p>
+        </w:tc>
+        <w:tc>
+          <w:tcPr>
+            <w:tcW w:type="dxa" w:w="5184"/>
+            <w:vAlign w:val="top"/>
+            <w:tcMar>
+              <w:top w:w="80" w:type="dxa"/>
+              <w:start w:w="100" w:type="dxa"/>
+              <w:bottom w:w="80" w:type="dxa"/>
+              <w:end w:w="100" w:type="dxa"/>
+            </w:tcMar>
+          </w:tcPr>
+          <w:p>
+            <w:pPr>
+              <w:spacing w:after="40"/>
+            </w:pPr>
+            <w:r>
+              <w:rPr>
+                <w:rFonts w:ascii="Microsoft YaHei" w:hAnsi="Microsoft YaHei" w:eastAsia="Microsoft YaHei"/>
+              </w:rPr>
+            </w:r>
+            <w:r>
+              <w:rPr>
+                <w:rFonts w:ascii="Microsoft YaHei" w:hAnsi="Microsoft YaHei" w:eastAsia="Microsoft YaHei"/>
+                <w:b w:val="0"/>
+                <w:i w:val="0"/>
+              </w:rPr>
+              <w:t>应用成功后游戏按键使用所选布局；复制或导入的副本归当前账号，发布成功后可查看并复制本次布局码。</w:t>
+            </w:r>
+          </w:p>
+        </w:tc>
+      </w:tr>
+      <w:tr>
+        <w:trPr>
+          <w:cantSplit/>
+        </w:trPr>
+        <w:tc>
+          <w:tcPr>
+            <w:tcW w:type="dxa" w:w="5184"/>
+            <w:vAlign w:val="top"/>
+            <w:tcMar>
+              <w:top w:w="80" w:type="dxa"/>
+              <w:start w:w="100" w:type="dxa"/>
+              <w:bottom w:w="80" w:type="dxa"/>
+              <w:end w:w="100" w:type="dxa"/>
+            </w:tcMar>
+          </w:tcPr>
+          <w:p>
+            <w:pPr>
+              <w:spacing w:after="40"/>
+            </w:pPr>
+            <w:r>
+              <w:rPr>
+                <w:rFonts w:ascii="Microsoft YaHei" w:hAnsi="Microsoft YaHei" w:eastAsia="Microsoft YaHei"/>
+              </w:rPr>
+            </w:r>
+            <w:r>
+              <w:rPr>
+                <w:rFonts w:ascii="Microsoft YaHei" w:hAnsi="Microsoft YaHei" w:eastAsia="Microsoft YaHei"/>
+                <w:b w:val="0"/>
+                <w:i w:val="0"/>
+              </w:rPr>
+              <w:t>补充说明</w:t>
+            </w:r>
+          </w:p>
+        </w:tc>
+        <w:tc>
+          <w:tcPr>
+            <w:tcW w:type="dxa" w:w="5184"/>
+            <w:vAlign w:val="top"/>
+            <w:tcMar>
+              <w:top w:w="80" w:type="dxa"/>
+              <w:start w:w="100" w:type="dxa"/>
+              <w:bottom w:w="80" w:type="dxa"/>
+              <w:end w:w="100" w:type="dxa"/>
+            </w:tcMar>
+          </w:tcPr>
+          <w:p>
+            <w:pPr>
+              <w:spacing w:after="40"/>
+            </w:pPr>
+            <w:r>
+              <w:rPr>
+                <w:rFonts w:ascii="Microsoft YaHei" w:hAnsi="Microsoft YaHei" w:eastAsia="Microsoft YaHei"/>
+              </w:rPr>
+            </w:r>
+            <w:r>
+              <w:rPr>
+                <w:rFonts w:ascii="Microsoft YaHei" w:hAnsi="Microsoft YaHei" w:eastAsia="Microsoft YaHei"/>
+                <w:b w:val="0"/>
+                <w:i w:val="0"/>
+              </w:rPr>
+              <w:t>1. 账号退出或切换后不得展示上一账号的我的方案/云分享，也不能将旧编辑结果保存到新账号。Demo按地区与当前登录账号隔离私有方案；同一浏览器中的共享目录仅模拟持码跨账号导入，不等于真实跨设备共享。</w:t>
+            </w:r>
+            <w:r>
+              <w:rPr>
+                <w:rFonts w:ascii="Microsoft YaHei" w:hAnsi="Microsoft YaHei" w:eastAsia="Microsoft YaHei"/>
+              </w:rPr>
+              <w:br/>
+            </w:r>
+            <w:r>
+              <w:rPr>
+                <w:rFonts w:ascii="Microsoft YaHei" w:hAnsi="Microsoft YaHei" w:eastAsia="Microsoft YaHei"/>
+                <w:b w:val="0"/>
+                <w:i w:val="0"/>
+              </w:rPr>
+              <w:t>2. 真实服务端推荐、云存储、布局码校验及失败返回仍需接入；Demo存储失败就地提示，保留原有效方案，不标保存/发布成功。仅观看、离开原页面或切换目标后关闭库及编辑，不将旧结果应用给新目标。</w:t>
+            </w:r>
+          </w:p>
+        </w:tc>
+      </w:tr>
+    </w:tbl>
+    <w:p>
+      <w:pPr>
+        <w:spacing w:after="20"/>
+      </w:pPr>
+    </w:p>
+    <w:p>
+      <w:pPr>
+        <w:pStyle w:val="Heading4"/>
+      </w:pPr>
+      <w:r>
+        <w:rPr>
+          <w:b w:val="0"/>
+          <w:i w:val="0"/>
+        </w:rPr>
+        <w:t>页面子功能汇总</w:t>
+      </w:r>
+    </w:p>
+    <w:tbl>
+      <w:tblPr>
+        <w:tblStyle w:val="TableGrid"/>
+        <w:tblW w:type="auto" w:w="0"/>
+        <w:tblLayout w:type="autofit"/>
+        <w:tblLook w:firstColumn="1" w:firstRow="1" w:lastColumn="0" w:lastRow="0" w:noHBand="0" w:noVBand="1" w:val="04A0"/>
+      </w:tblPr>
+      <w:tblGrid>
+        <w:gridCol w:w="2592"/>
+        <w:gridCol w:w="2592"/>
+        <w:gridCol w:w="2592"/>
+        <w:gridCol w:w="2592"/>
+      </w:tblGrid>
+      <w:tr>
+        <w:trPr>
+          <w:cantSplit/>
+        </w:trPr>
+        <w:tc>
+          <w:tcPr>
+            <w:tcW w:type="dxa" w:w="2592"/>
+            <w:vAlign w:val="top"/>
+            <w:tcMar>
+              <w:top w:w="80" w:type="dxa"/>
+              <w:start w:w="100" w:type="dxa"/>
+              <w:bottom w:w="80" w:type="dxa"/>
+              <w:end w:w="100" w:type="dxa"/>
+            </w:tcMar>
+            <w:shd w:fill="E9EDF2"/>
+          </w:tcPr>
+          <w:p>
+            <w:pPr>
+              <w:spacing w:after="40"/>
+            </w:pPr>
+            <w:r>
+              <w:rPr>
+                <w:rFonts w:ascii="Microsoft YaHei" w:hAnsi="Microsoft YaHei" w:eastAsia="Microsoft YaHei"/>
+              </w:rPr>
+            </w:r>
+            <w:r>
+              <w:rPr>
+                <w:rFonts w:ascii="Microsoft YaHei" w:hAnsi="Microsoft YaHei" w:eastAsia="Microsoft YaHei"/>
+                <w:b w:val="0"/>
+                <w:i w:val="0"/>
+              </w:rPr>
+              <w:t>类型</w:t>
+            </w:r>
+          </w:p>
+        </w:tc>
+        <w:tc>
+          <w:tcPr>
+            <w:tcW w:type="dxa" w:w="2592"/>
+            <w:vAlign w:val="top"/>
+            <w:tcMar>
+              <w:top w:w="80" w:type="dxa"/>
+              <w:start w:w="100" w:type="dxa"/>
+              <w:bottom w:w="80" w:type="dxa"/>
+              <w:end w:w="100" w:type="dxa"/>
+            </w:tcMar>
+            <w:shd w:fill="E9EDF2"/>
+          </w:tcPr>
+          <w:p>
+            <w:pPr>
+              <w:spacing w:after="40"/>
+            </w:pPr>
+            <w:r>
+              <w:rPr>
+                <w:rFonts w:ascii="Microsoft YaHei" w:hAnsi="Microsoft YaHei" w:eastAsia="Microsoft YaHei"/>
+              </w:rPr>
+            </w:r>
+            <w:r>
+              <w:rPr>
+                <w:rFonts w:ascii="Microsoft YaHei" w:hAnsi="Microsoft YaHei" w:eastAsia="Microsoft YaHei"/>
+                <w:b w:val="0"/>
+                <w:i w:val="0"/>
+              </w:rPr>
+              <w:t>图示</w:t>
+            </w:r>
+          </w:p>
+        </w:tc>
+        <w:tc>
+          <w:tcPr>
+            <w:tcW w:type="dxa" w:w="2592"/>
+            <w:vAlign w:val="top"/>
+            <w:tcMar>
+              <w:top w:w="80" w:type="dxa"/>
+              <w:start w:w="100" w:type="dxa"/>
+              <w:bottom w:w="80" w:type="dxa"/>
+              <w:end w:w="100" w:type="dxa"/>
+            </w:tcMar>
+            <w:shd w:fill="E9EDF2"/>
+          </w:tcPr>
+          <w:p>
+            <w:pPr>
+              <w:spacing w:after="40"/>
+            </w:pPr>
+            <w:r>
+              <w:rPr>
+                <w:rFonts w:ascii="Microsoft YaHei" w:hAnsi="Microsoft YaHei" w:eastAsia="Microsoft YaHei"/>
+              </w:rPr>
+            </w:r>
+            <w:r>
+              <w:rPr>
+                <w:rFonts w:ascii="Microsoft YaHei" w:hAnsi="Microsoft YaHei" w:eastAsia="Microsoft YaHei"/>
+                <w:b w:val="0"/>
+                <w:i w:val="0"/>
+              </w:rPr>
+              <w:t>内容</w:t>
+            </w:r>
+          </w:p>
+        </w:tc>
+        <w:tc>
+          <w:tcPr>
+            <w:tcW w:type="dxa" w:w="2592"/>
+            <w:vAlign w:val="top"/>
+            <w:tcMar>
+              <w:top w:w="80" w:type="dxa"/>
+              <w:start w:w="100" w:type="dxa"/>
+              <w:bottom w:w="80" w:type="dxa"/>
+              <w:end w:w="100" w:type="dxa"/>
+            </w:tcMar>
+            <w:shd w:fill="E9EDF2"/>
+          </w:tcPr>
+          <w:p>
+            <w:pPr>
+              <w:spacing w:after="40"/>
+            </w:pPr>
+            <w:r>
+              <w:rPr>
+                <w:rFonts w:ascii="Microsoft YaHei" w:hAnsi="Microsoft YaHei" w:eastAsia="Microsoft YaHei"/>
+              </w:rPr>
+            </w:r>
+            <w:r>
+              <w:rPr>
+                <w:rFonts w:ascii="Microsoft YaHei" w:hAnsi="Microsoft YaHei" w:eastAsia="Microsoft YaHei"/>
+                <w:b w:val="0"/>
+                <w:i w:val="0"/>
+              </w:rPr>
+              <w:t>说明</w:t>
+            </w:r>
+          </w:p>
+        </w:tc>
+      </w:tr>
+      <w:tr>
+        <w:trPr>
+          <w:cantSplit/>
+        </w:trPr>
+        <w:tc>
+          <w:tcPr>
+            <w:tcW w:type="dxa" w:w="2592"/>
+            <w:vAlign w:val="top"/>
+            <w:tcMar>
+              <w:top w:w="80" w:type="dxa"/>
+              <w:start w:w="100" w:type="dxa"/>
+              <w:bottom w:w="80" w:type="dxa"/>
+              <w:end w:w="100" w:type="dxa"/>
+            </w:tcMar>
+          </w:tcPr>
+          <w:p>
+            <w:pPr>
+              <w:spacing w:after="40"/>
+            </w:pPr>
+            <w:r>
+              <w:rPr>
+                <w:rFonts w:ascii="Microsoft YaHei" w:hAnsi="Microsoft YaHei" w:eastAsia="Microsoft YaHei"/>
+              </w:rPr>
+            </w:r>
+            <w:r>
+              <w:rPr>
+                <w:rFonts w:ascii="Microsoft YaHei" w:hAnsi="Microsoft YaHei" w:eastAsia="Microsoft YaHei"/>
+                <w:b w:val="0"/>
+                <w:i w:val="0"/>
+              </w:rPr>
+              <w:t>发布弹窗</w:t>
+            </w:r>
+          </w:p>
+        </w:tc>
+        <w:tc>
+          <w:tcPr>
+            <w:tcW w:type="dxa" w:w="2592"/>
+            <w:vAlign w:val="top"/>
+            <w:tcMar>
+              <w:top w:w="80" w:type="dxa"/>
+              <w:start w:w="100" w:type="dxa"/>
+              <w:bottom w:w="80" w:type="dxa"/>
+              <w:end w:w="100" w:type="dxa"/>
+            </w:tcMar>
+          </w:tcPr>
+          <w:p>
+            <w:pPr>
+              <w:spacing w:after="40"/>
+            </w:pPr>
+            <w:r>
+              <w:rPr>
+                <w:rFonts w:ascii="Microsoft YaHei" w:hAnsi="Microsoft YaHei" w:eastAsia="Microsoft YaHei"/>
+              </w:rPr>
+            </w:r>
+            <w:r>
+              <w:rPr>
+                <w:rFonts w:ascii="Microsoft YaHei" w:hAnsi="Microsoft YaHei" w:eastAsia="Microsoft YaHei"/>
+              </w:rPr>
+              <w:drawing>
+                <wp:inline xmlns:a="http://schemas.openxmlformats.org/drawingml/2006/main" xmlns:pic="http://schemas.openxmlformats.org/drawingml/2006/picture">
+                  <wp:extent cx="2880360" cy="1618142"/>
+                  <wp:docPr id="22" name="Picture 22"/>
+                  <wp:cNvGraphicFramePr>
+                    <a:graphicFrameLocks noChangeAspect="1"/>
+                  </wp:cNvGraphicFramePr>
+                  <a:graphic>
+                    <a:graphicData uri="http://schemas.openxmlformats.org/drawingml/2006/picture">
+                      <pic:pic>
+                        <pic:nvPicPr>
+                          <pic:cNvPr id="0" name="standalone-mobile-layout-publish.png"/>
+                          <pic:cNvPicPr/>
+                        </pic:nvPicPr>
+                        <pic:blipFill>
+                          <a:blip r:embed="rId30"/>
+                          <a:stretch>
+                            <a:fillRect/>
+                          </a:stretch>
+                        </pic:blipFill>
+                        <pic:spPr>
+                          <a:xfrm>
+                            <a:off x="0" y="0"/>
+                            <a:ext cx="2880360" cy="1618142"/>
+                          </a:xfrm>
+                          <a:prstGeom prst="rect"/>
+                        </pic:spPr>
+                      </pic:pic>
+                    </a:graphicData>
+                  </a:graphic>
+                </wp:inline>
+              </w:drawing>
+            </w:r>
+            <w:r>
+              <w:rPr>
+                <w:rFonts w:ascii="Microsoft YaHei" w:hAnsi="Microsoft YaHei" w:eastAsia="Microsoft YaHei"/>
+              </w:rPr>
+              <w:br/>
+            </w:r>
+            <w:r>
+              <w:rPr>
+                <w:rFonts w:ascii="Microsoft YaHei" w:hAnsi="Microsoft YaHei" w:eastAsia="Microsoft YaHei"/>
+                <w:b w:val="0"/>
+                <w:i/>
+              </w:rPr>
+              <w:t>图3-32：从我的方案发布云分享。</w:t>
+            </w:r>
+          </w:p>
+        </w:tc>
+        <w:tc>
+          <w:tcPr>
+            <w:tcW w:type="dxa" w:w="2592"/>
+            <w:vAlign w:val="top"/>
+            <w:tcMar>
+              <w:top w:w="80" w:type="dxa"/>
+              <w:start w:w="100" w:type="dxa"/>
+              <w:bottom w:w="80" w:type="dxa"/>
+              <w:end w:w="100" w:type="dxa"/>
+            </w:tcMar>
+          </w:tcPr>
+          <w:p>
+            <w:pPr>
+              <w:spacing w:after="40"/>
+            </w:pPr>
+            <w:r>
+              <w:rPr>
+                <w:rFonts w:ascii="Microsoft YaHei" w:hAnsi="Microsoft YaHei" w:eastAsia="Microsoft YaHei"/>
+              </w:rPr>
+            </w:r>
+            <w:r>
+              <w:rPr>
+                <w:rFonts w:ascii="Microsoft YaHei" w:hAnsi="Microsoft YaHei" w:eastAsia="Microsoft YaHei"/>
+                <w:b w:val="0"/>
+                <w:i w:val="0"/>
+              </w:rPr>
+              <w:t>分享名称、游戏/通用类型、取消、确认发布。</w:t>
+            </w:r>
+          </w:p>
+        </w:tc>
+        <w:tc>
+          <w:tcPr>
+            <w:tcW w:type="dxa" w:w="2592"/>
+            <w:vAlign w:val="top"/>
+            <w:tcMar>
+              <w:top w:w="80" w:type="dxa"/>
+              <w:start w:w="100" w:type="dxa"/>
+              <w:bottom w:w="80" w:type="dxa"/>
+              <w:end w:w="100" w:type="dxa"/>
+            </w:tcMar>
+          </w:tcPr>
+          <w:p>
+            <w:pPr>
+              <w:spacing w:after="40"/>
+            </w:pPr>
+            <w:r>
+              <w:rPr>
+                <w:rFonts w:ascii="Microsoft YaHei" w:hAnsi="Microsoft YaHei" w:eastAsia="Microsoft YaHei"/>
+              </w:rPr>
+            </w:r>
+            <w:r>
+              <w:rPr>
+                <w:rFonts w:ascii="Microsoft YaHei" w:hAnsi="Microsoft YaHei" w:eastAsia="Microsoft YaHei"/>
+                <w:b/>
+                <w:i w:val="0"/>
+              </w:rPr>
+              <w:t>展示说明：</w:t>
+            </w:r>
+            <w:r>
+              <w:rPr>
+                <w:rFonts w:ascii="Microsoft YaHei" w:hAnsi="Microsoft YaHei" w:eastAsia="Microsoft YaHei"/>
+              </w:rPr>
+              <w:br/>
+            </w:r>
+            <w:r>
+              <w:rPr>
+                <w:rFonts w:ascii="Microsoft YaHei" w:hAnsi="Microsoft YaHei" w:eastAsia="Microsoft YaHei"/>
+                <w:b w:val="0"/>
+                <w:i w:val="0"/>
+              </w:rPr>
+              <w:t>1. 分享名称去首尾空格后必填，最多20个字符，按字符计数，例如“汉”“A”“😀”各计1；超限不提交。类型默认继承待发布方案，可选游戏布局或通用布局。当前账号的云分享内重名拒绝，不因类型不同而覆盖或放行；本轮不虚构敏感词审核已接入。</w:t>
+            </w:r>
+            <w:r>
+              <w:rPr>
+                <w:rFonts w:ascii="Microsoft YaHei" w:hAnsi="Microsoft YaHei" w:eastAsia="Microsoft YaHei"/>
+              </w:rPr>
+              <w:br/>
+            </w:r>
+            <w:r>
+              <w:rPr>
+                <w:rFonts w:ascii="Microsoft YaHei" w:hAnsi="Microsoft YaHei" w:eastAsia="Microsoft YaHei"/>
+                <w:b/>
+                <w:i w:val="0"/>
+              </w:rPr>
+              <w:t>交互说明：</w:t>
+            </w:r>
+            <w:r>
+              <w:rPr>
+                <w:rFonts w:ascii="Microsoft YaHei" w:hAnsi="Microsoft YaHei" w:eastAsia="Microsoft YaHei"/>
+              </w:rPr>
+              <w:br/>
+            </w:r>
+            <w:r>
+              <w:rPr>
+                <w:rFonts w:ascii="Microsoft YaHei" w:hAnsi="Microsoft YaHei" w:eastAsia="Microsoft YaHei"/>
+                <w:b w:val="0"/>
+                <w:i w:val="0"/>
+              </w:rPr>
+              <w:t>1. 点击确认发布，名称和方案内容有效后发布当前保存的布局；成功后进入我的云分享并提供本次布局码。失败保留原方案并提示，不生成可用的成功结果。当前Demo只写入本机模拟目录，不向真实服务上传。</w:t>
+            </w:r>
+            <w:r>
+              <w:rPr>
+                <w:rFonts w:ascii="Microsoft YaHei" w:hAnsi="Microsoft YaHei" w:eastAsia="Microsoft YaHei"/>
+              </w:rPr>
+              <w:br/>
+            </w:r>
+            <w:r>
+              <w:rPr>
+                <w:rFonts w:ascii="Microsoft YaHei" w:hAnsi="Microsoft YaHei" w:eastAsia="Microsoft YaHei"/>
+                <w:b w:val="0"/>
+                <w:i w:val="0"/>
+              </w:rPr>
+              <w:t>2. 点击取消关闭发布弹窗，不生成布局码、不改变原本地方案。</w:t>
+            </w:r>
+          </w:p>
+        </w:tc>
+      </w:tr>
+      <w:tr>
+        <w:trPr>
+          <w:cantSplit/>
+        </w:trPr>
+        <w:tc>
+          <w:tcPr>
+            <w:tcW w:type="dxa" w:w="2592"/>
+            <w:vAlign w:val="top"/>
+            <w:tcMar>
+              <w:top w:w="80" w:type="dxa"/>
+              <w:start w:w="100" w:type="dxa"/>
+              <w:bottom w:w="80" w:type="dxa"/>
+              <w:end w:w="100" w:type="dxa"/>
+            </w:tcMar>
+          </w:tcPr>
+          <w:p>
+            <w:pPr>
+              <w:spacing w:after="40"/>
+            </w:pPr>
+            <w:r>
+              <w:rPr>
+                <w:rFonts w:ascii="Microsoft YaHei" w:hAnsi="Microsoft YaHei" w:eastAsia="Microsoft YaHei"/>
+              </w:rPr>
+            </w:r>
+            <w:r>
+              <w:rPr>
+                <w:rFonts w:ascii="Microsoft YaHei" w:hAnsi="Microsoft YaHei" w:eastAsia="Microsoft YaHei"/>
+                <w:b w:val="0"/>
+                <w:i w:val="0"/>
+              </w:rPr>
+              <w:t>布局码详情</w:t>
+            </w:r>
+          </w:p>
+        </w:tc>
+        <w:tc>
+          <w:tcPr>
+            <w:tcW w:type="dxa" w:w="2592"/>
+            <w:vAlign w:val="top"/>
+            <w:tcMar>
+              <w:top w:w="80" w:type="dxa"/>
+              <w:start w:w="100" w:type="dxa"/>
+              <w:bottom w:w="80" w:type="dxa"/>
+              <w:end w:w="100" w:type="dxa"/>
+            </w:tcMar>
+          </w:tcPr>
+          <w:p>
+            <w:pPr>
+              <w:spacing w:after="40"/>
+            </w:pPr>
+            <w:r>
+              <w:rPr>
+                <w:rFonts w:ascii="Microsoft YaHei" w:hAnsi="Microsoft YaHei" w:eastAsia="Microsoft YaHei"/>
+              </w:rPr>
+            </w:r>
+            <w:r>
+              <w:rPr>
+                <w:rFonts w:ascii="Microsoft YaHei" w:hAnsi="Microsoft YaHei" w:eastAsia="Microsoft YaHei"/>
+              </w:rPr>
+              <w:drawing>
+                <wp:inline xmlns:a="http://schemas.openxmlformats.org/drawingml/2006/main" xmlns:pic="http://schemas.openxmlformats.org/drawingml/2006/picture">
+                  <wp:extent cx="2880360" cy="1618142"/>
+                  <wp:docPr id="23" name="Picture 23"/>
+                  <wp:cNvGraphicFramePr>
+                    <a:graphicFrameLocks noChangeAspect="1"/>
+                  </wp:cNvGraphicFramePr>
+                  <a:graphic>
+                    <a:graphicData uri="http://schemas.openxmlformats.org/drawingml/2006/picture">
+                      <pic:pic>
+                        <pic:nvPicPr>
+                          <pic:cNvPr id="0" name="standalone-mobile-layout-code.png"/>
+                          <pic:cNvPicPr/>
+                        </pic:nvPicPr>
+                        <pic:blipFill>
+                          <a:blip r:embed="rId31"/>
+                          <a:stretch>
+                            <a:fillRect/>
+                          </a:stretch>
+                        </pic:blipFill>
+                        <pic:spPr>
+                          <a:xfrm>
+                            <a:off x="0" y="0"/>
+                            <a:ext cx="2880360" cy="1618142"/>
+                          </a:xfrm>
+                          <a:prstGeom prst="rect"/>
+                        </pic:spPr>
+                      </pic:pic>
+                    </a:graphicData>
+                  </a:graphic>
+                </wp:inline>
+              </w:drawing>
+            </w:r>
+            <w:r>
+              <w:rPr>
+                <w:rFonts w:ascii="Microsoft YaHei" w:hAnsi="Microsoft YaHei" w:eastAsia="Microsoft YaHei"/>
+              </w:rPr>
+              <w:br/>
+            </w:r>
+            <w:r>
+              <w:rPr>
+                <w:rFonts w:ascii="Microsoft YaHei" w:hAnsi="Microsoft YaHei" w:eastAsia="Microsoft YaHei"/>
+                <w:b w:val="0"/>
+                <w:i/>
+              </w:rPr>
+              <w:t>图3-33：本次方案的布局码。</w:t>
+            </w:r>
+          </w:p>
+        </w:tc>
+        <w:tc>
+          <w:tcPr>
+            <w:tcW w:type="dxa" w:w="2592"/>
+            <w:vAlign w:val="top"/>
+            <w:tcMar>
+              <w:top w:w="80" w:type="dxa"/>
+              <w:start w:w="100" w:type="dxa"/>
+              <w:bottom w:w="80" w:type="dxa"/>
+              <w:end w:w="100" w:type="dxa"/>
+            </w:tcMar>
+          </w:tcPr>
+          <w:p>
+            <w:pPr>
+              <w:spacing w:after="40"/>
+            </w:pPr>
+            <w:r>
+              <w:rPr>
+                <w:rFonts w:ascii="Microsoft YaHei" w:hAnsi="Microsoft YaHei" w:eastAsia="Microsoft YaHei"/>
+              </w:rPr>
+            </w:r>
+            <w:r>
+              <w:rPr>
+                <w:rFonts w:ascii="Microsoft YaHei" w:hAnsi="Microsoft YaHei" w:eastAsia="Microsoft YaHei"/>
+                <w:b w:val="0"/>
+                <w:i w:val="0"/>
+              </w:rPr>
+              <w:t>10位大小写字母与数字组成的布局码，以及复制入口。</w:t>
+            </w:r>
+          </w:p>
+        </w:tc>
+        <w:tc>
+          <w:tcPr>
+            <w:tcW w:type="dxa" w:w="2592"/>
+            <w:vAlign w:val="top"/>
+            <w:tcMar>
+              <w:top w:w="80" w:type="dxa"/>
+              <w:start w:w="100" w:type="dxa"/>
+              <w:bottom w:w="80" w:type="dxa"/>
+              <w:end w:w="100" w:type="dxa"/>
+            </w:tcMar>
+          </w:tcPr>
+          <w:p>
+            <w:pPr>
+              <w:spacing w:after="40"/>
+            </w:pPr>
+            <w:r>
+              <w:rPr>
+                <w:rFonts w:ascii="Microsoft YaHei" w:hAnsi="Microsoft YaHei" w:eastAsia="Microsoft YaHei"/>
+              </w:rPr>
+            </w:r>
+            <w:r>
+              <w:rPr>
+                <w:rFonts w:ascii="Microsoft YaHei" w:hAnsi="Microsoft YaHei" w:eastAsia="Microsoft YaHei"/>
+                <w:b/>
+                <w:i w:val="0"/>
+              </w:rPr>
+              <w:t>展示说明：</w:t>
+            </w:r>
+            <w:r>
+              <w:rPr>
+                <w:rFonts w:ascii="Microsoft YaHei" w:hAnsi="Microsoft YaHei" w:eastAsia="Microsoft YaHei"/>
+              </w:rPr>
+              <w:br/>
+            </w:r>
+            <w:r>
+              <w:rPr>
+                <w:rFonts w:ascii="Microsoft YaHei" w:hAnsi="Microsoft YaHei" w:eastAsia="Microsoft YaHei"/>
+                <w:b w:val="0"/>
+                <w:i w:val="0"/>
+              </w:rPr>
+              <w:t>1. 布局码为10位大小写字母与数字组合，区分大小写，绑定本次分享方案；更新自己的云方案继续使用原码。</w:t>
+            </w:r>
+            <w:r>
+              <w:rPr>
+                <w:rFonts w:ascii="Microsoft YaHei" w:hAnsi="Microsoft YaHei" w:eastAsia="Microsoft YaHei"/>
+              </w:rPr>
+              <w:br/>
+            </w:r>
+            <w:r>
+              <w:rPr>
+                <w:rFonts w:ascii="Microsoft YaHei" w:hAnsi="Microsoft YaHei" w:eastAsia="Microsoft YaHei"/>
+                <w:b/>
+                <w:i w:val="0"/>
+              </w:rPr>
+              <w:t>交互说明：</w:t>
+            </w:r>
+            <w:r>
+              <w:rPr>
+                <w:rFonts w:ascii="Microsoft YaHei" w:hAnsi="Microsoft YaHei" w:eastAsia="Microsoft YaHei"/>
+              </w:rPr>
+              <w:br/>
+            </w:r>
+            <w:r>
+              <w:rPr>
+                <w:rFonts w:ascii="Microsoft YaHei" w:hAnsi="Microsoft YaHei" w:eastAsia="Microsoft YaHei"/>
+                <w:b w:val="0"/>
+                <w:i w:val="0"/>
+              </w:rPr>
+              <w:t>1. 点击复制将布局码写入剪贴板；写入成功才提示已复制，失败提示选中分享码后手动复制。关闭详情不删除分享或退出远控。</w:t>
+            </w:r>
+          </w:p>
+        </w:tc>
+      </w:tr>
+      <w:tr>
+        <w:trPr>
+          <w:cantSplit/>
+        </w:trPr>
+        <w:tc>
+          <w:tcPr>
+            <w:tcW w:type="dxa" w:w="2592"/>
+            <w:vAlign w:val="top"/>
+            <w:tcMar>
+              <w:top w:w="80" w:type="dxa"/>
+              <w:start w:w="100" w:type="dxa"/>
+              <w:bottom w:w="80" w:type="dxa"/>
+              <w:end w:w="100" w:type="dxa"/>
+            </w:tcMar>
+          </w:tcPr>
+          <w:p>
+            <w:pPr>
+              <w:spacing w:after="40"/>
+            </w:pPr>
+            <w:r>
+              <w:rPr>
+                <w:rFonts w:ascii="Microsoft YaHei" w:hAnsi="Microsoft YaHei" w:eastAsia="Microsoft YaHei"/>
+              </w:rPr>
+            </w:r>
+            <w:r>
+              <w:rPr>
+                <w:rFonts w:ascii="Microsoft YaHei" w:hAnsi="Microsoft YaHei" w:eastAsia="Microsoft YaHei"/>
+                <w:b w:val="0"/>
+                <w:i w:val="0"/>
+              </w:rPr>
+              <w:t>布局码导入</w:t>
+            </w:r>
+          </w:p>
+        </w:tc>
+        <w:tc>
+          <w:tcPr>
+            <w:tcW w:type="dxa" w:w="2592"/>
+            <w:vAlign w:val="top"/>
+            <w:tcMar>
+              <w:top w:w="80" w:type="dxa"/>
+              <w:start w:w="100" w:type="dxa"/>
+              <w:bottom w:w="80" w:type="dxa"/>
+              <w:end w:w="100" w:type="dxa"/>
+            </w:tcMar>
+          </w:tcPr>
+          <w:p>
+            <w:pPr>
+              <w:spacing w:after="40"/>
+            </w:pPr>
+            <w:r>
+              <w:rPr>
+                <w:rFonts w:ascii="Microsoft YaHei" w:hAnsi="Microsoft YaHei" w:eastAsia="Microsoft YaHei"/>
+              </w:rPr>
+            </w:r>
+            <w:r>
+              <w:rPr>
+                <w:rFonts w:ascii="Microsoft YaHei" w:hAnsi="Microsoft YaHei" w:eastAsia="Microsoft YaHei"/>
+              </w:rPr>
+              <w:drawing>
+                <wp:inline xmlns:a="http://schemas.openxmlformats.org/drawingml/2006/main" xmlns:pic="http://schemas.openxmlformats.org/drawingml/2006/picture">
+                  <wp:extent cx="2880360" cy="1618142"/>
+                  <wp:docPr id="24" name="Picture 24"/>
+                  <wp:cNvGraphicFramePr>
+                    <a:graphicFrameLocks noChangeAspect="1"/>
+                  </wp:cNvGraphicFramePr>
+                  <a:graphic>
+                    <a:graphicData uri="http://schemas.openxmlformats.org/drawingml/2006/picture">
+                      <pic:pic>
+                        <pic:nvPicPr>
+                          <pic:cNvPr id="0" name="standalone-mobile-layout-imported.png"/>
+                          <pic:cNvPicPr/>
+                        </pic:nvPicPr>
+                        <pic:blipFill>
+                          <a:blip r:embed="rId32"/>
+                          <a:stretch>
+                            <a:fillRect/>
+                          </a:stretch>
+                        </pic:blipFill>
+                        <pic:spPr>
+                          <a:xfrm>
+                            <a:off x="0" y="0"/>
+                            <a:ext cx="2880360" cy="1618142"/>
+                          </a:xfrm>
+                          <a:prstGeom prst="rect"/>
+                        </pic:spPr>
+                      </pic:pic>
+                    </a:graphicData>
+                  </a:graphic>
+                </wp:inline>
+              </w:drawing>
+            </w:r>
+            <w:r>
+              <w:rPr>
+                <w:rFonts w:ascii="Microsoft YaHei" w:hAnsi="Microsoft YaHei" w:eastAsia="Microsoft YaHei"/>
+              </w:rPr>
+              <w:br/>
+            </w:r>
+            <w:r>
+              <w:rPr>
+                <w:rFonts w:ascii="Microsoft YaHei" w:hAnsi="Microsoft YaHei" w:eastAsia="Microsoft YaHei"/>
+                <w:b w:val="0"/>
+                <w:i/>
+              </w:rPr>
+              <w:t>图3-34：通过有效布局码导入当前账号的我的方案。</w:t>
+            </w:r>
+          </w:p>
+        </w:tc>
+        <w:tc>
+          <w:tcPr>
+            <w:tcW w:type="dxa" w:w="2592"/>
+            <w:vAlign w:val="top"/>
+            <w:tcMar>
+              <w:top w:w="80" w:type="dxa"/>
+              <w:start w:w="100" w:type="dxa"/>
+              <w:bottom w:w="80" w:type="dxa"/>
+              <w:end w:w="100" w:type="dxa"/>
+            </w:tcMar>
+          </w:tcPr>
+          <w:p>
+            <w:pPr>
+              <w:spacing w:after="40"/>
+            </w:pPr>
+            <w:r>
+              <w:rPr>
+                <w:rFonts w:ascii="Microsoft YaHei" w:hAnsi="Microsoft YaHei" w:eastAsia="Microsoft YaHei"/>
+              </w:rPr>
+            </w:r>
+            <w:r>
+              <w:rPr>
+                <w:rFonts w:ascii="Microsoft YaHei" w:hAnsi="Microsoft YaHei" w:eastAsia="Microsoft YaHei"/>
+                <w:b w:val="0"/>
+                <w:i w:val="0"/>
+              </w:rPr>
+              <w:t>10位布局分享码。</w:t>
+            </w:r>
+          </w:p>
+        </w:tc>
+        <w:tc>
+          <w:tcPr>
+            <w:tcW w:type="dxa" w:w="2592"/>
+            <w:vAlign w:val="top"/>
+            <w:tcMar>
+              <w:top w:w="80" w:type="dxa"/>
+              <w:start w:w="100" w:type="dxa"/>
+              <w:bottom w:w="80" w:type="dxa"/>
+              <w:end w:w="100" w:type="dxa"/>
+            </w:tcMar>
+          </w:tcPr>
+          <w:p>
+            <w:pPr>
+              <w:spacing w:after="40"/>
+            </w:pPr>
+            <w:r>
+              <w:rPr>
+                <w:rFonts w:ascii="Microsoft YaHei" w:hAnsi="Microsoft YaHei" w:eastAsia="Microsoft YaHei"/>
+              </w:rPr>
+            </w:r>
+            <w:r>
+              <w:rPr>
+                <w:rFonts w:ascii="Microsoft YaHei" w:hAnsi="Microsoft YaHei" w:eastAsia="Microsoft YaHei"/>
+                <w:b/>
+                <w:i w:val="0"/>
+              </w:rPr>
+              <w:t>展示说明：</w:t>
+            </w:r>
+            <w:r>
+              <w:rPr>
+                <w:rFonts w:ascii="Microsoft YaHei" w:hAnsi="Microsoft YaHei" w:eastAsia="Microsoft YaHei"/>
+              </w:rPr>
+              <w:br/>
+            </w:r>
+            <w:r>
+              <w:rPr>
+                <w:rFonts w:ascii="Microsoft YaHei" w:hAnsi="Microsoft YaHei" w:eastAsia="Microsoft YaHei"/>
+                <w:b w:val="0"/>
+                <w:i w:val="0"/>
+              </w:rPr>
+              <w:t>1. 输入10位布局分享码；导入时按来源名称自动生成不超过10个字符的本地名，重复导入自动追加序号并保持总长度不超限，不覆盖已有方案。</w:t>
+            </w:r>
+            <w:r>
+              <w:rPr>
+                <w:rFonts w:ascii="Microsoft YaHei" w:hAnsi="Microsoft YaHei" w:eastAsia="Microsoft YaHei"/>
+              </w:rPr>
+              <w:br/>
+            </w:r>
+            <w:r>
+              <w:rPr>
+                <w:rFonts w:ascii="Microsoft YaHei" w:hAnsi="Microsoft YaHei" w:eastAsia="Microsoft YaHei"/>
+                <w:b/>
+                <w:i w:val="0"/>
+              </w:rPr>
+              <w:t>交互说明：</w:t>
+            </w:r>
+            <w:r>
+              <w:rPr>
+                <w:rFonts w:ascii="Microsoft YaHei" w:hAnsi="Microsoft YaHei" w:eastAsia="Microsoft YaHei"/>
+              </w:rPr>
+              <w:br/>
+            </w:r>
+            <w:r>
+              <w:rPr>
+                <w:rFonts w:ascii="Microsoft YaHei" w:hAnsi="Microsoft YaHei" w:eastAsia="Microsoft YaHei"/>
+                <w:b w:val="0"/>
+                <w:i w:val="0"/>
+              </w:rPr>
+              <w:t>1. 导入有效码时复制方案到当前账号我的方案，并进入可拖动的编辑器；导入即保存初始副本，放弃后续编辑不删除该副本。类型继承来源，不把导入视为应用到游戏，不修改分享者原方案。</w:t>
+            </w:r>
+            <w:r>
+              <w:rPr>
+                <w:rFonts w:ascii="Microsoft YaHei" w:hAnsi="Microsoft YaHei" w:eastAsia="Microsoft YaHei"/>
+              </w:rPr>
+              <w:br/>
+            </w:r>
+            <w:r>
+              <w:rPr>
+                <w:rFonts w:ascii="Microsoft YaHei" w:hAnsi="Microsoft YaHei" w:eastAsia="Microsoft YaHei"/>
+                <w:b w:val="0"/>
+                <w:i w:val="0"/>
+              </w:rPr>
+              <w:t>2. 空值、格式错误、无法获取或不存在的码在原弹窗提示“请输入有效按键布局分享码。”，不创建方案；修正后可重新导入。取消关闭导入弹窗，不改变已有方案。</w:t>
+            </w:r>
+          </w:p>
+        </w:tc>
+      </w:tr>
+    </w:tbl>
+    <w:p>
+      <w:pPr>
+        <w:spacing w:after="20"/>
+      </w:pPr>
+    </w:p>
+    <w:p>
+      <w:pPr>
+        <w:pStyle w:val="Heading3"/>
+      </w:pPr>
+      <w:r>
+        <w:rPr>
+          <w:b w:val="0"/>
+          <w:i w:val="0"/>
+        </w:rPr>
+        <w:t>3.1.13 按键布局编辑器</w:t>
+      </w:r>
+    </w:p>
+    <w:tbl>
+      <w:tblPr>
+        <w:tblStyle w:val="TableGrid"/>
+        <w:tblW w:type="auto" w:w="0"/>
+        <w:tblLayout w:type="autofit"/>
+        <w:tblLook w:firstColumn="1" w:firstRow="1" w:lastColumn="0" w:lastRow="0" w:noHBand="0" w:noVBand="1" w:val="04A0"/>
+      </w:tblPr>
+      <w:tblGrid>
+        <w:gridCol w:w="5184"/>
+        <w:gridCol w:w="5184"/>
+      </w:tblGrid>
+      <w:tr>
+        <w:trPr>
+          <w:cantSplit/>
+        </w:trPr>
+        <w:tc>
+          <w:tcPr>
+            <w:tcW w:type="dxa" w:w="5184"/>
+            <w:vAlign w:val="top"/>
+            <w:tcMar>
+              <w:top w:w="80" w:type="dxa"/>
+              <w:start w:w="100" w:type="dxa"/>
+              <w:bottom w:w="80" w:type="dxa"/>
+              <w:end w:w="100" w:type="dxa"/>
+            </w:tcMar>
+            <w:shd w:fill="E9EDF2"/>
+          </w:tcPr>
+          <w:p>
+            <w:pPr>
+              <w:spacing w:after="40"/>
+            </w:pPr>
+            <w:r>
+              <w:rPr>
+                <w:rFonts w:ascii="Microsoft YaHei" w:hAnsi="Microsoft YaHei" w:eastAsia="Microsoft YaHei"/>
+              </w:rPr>
+            </w:r>
+            <w:r>
+              <w:rPr>
+                <w:rFonts w:ascii="Microsoft YaHei" w:hAnsi="Microsoft YaHei" w:eastAsia="Microsoft YaHei"/>
+                <w:b w:val="0"/>
+                <w:i w:val="0"/>
+              </w:rPr>
+              <w:t>要素</w:t>
+            </w:r>
+          </w:p>
+        </w:tc>
+        <w:tc>
+          <w:tcPr>
+            <w:tcW w:type="dxa" w:w="5184"/>
+            <w:vAlign w:val="top"/>
+            <w:tcMar>
+              <w:top w:w="80" w:type="dxa"/>
+              <w:start w:w="100" w:type="dxa"/>
+              <w:bottom w:w="80" w:type="dxa"/>
+              <w:end w:w="100" w:type="dxa"/>
+            </w:tcMar>
+            <w:shd w:fill="E9EDF2"/>
+          </w:tcPr>
+          <w:p>
+            <w:pPr>
+              <w:spacing w:after="40"/>
+            </w:pPr>
+            <w:r>
+              <w:rPr>
+                <w:rFonts w:ascii="Microsoft YaHei" w:hAnsi="Microsoft YaHei" w:eastAsia="Microsoft YaHei"/>
+              </w:rPr>
+            </w:r>
+            <w:r>
+              <w:rPr>
+                <w:rFonts w:ascii="Microsoft YaHei" w:hAnsi="Microsoft YaHei" w:eastAsia="Microsoft YaHei"/>
+                <w:b w:val="0"/>
+                <w:i w:val="0"/>
+              </w:rPr>
+              <w:t>内容说明</w:t>
+            </w:r>
+          </w:p>
+        </w:tc>
+      </w:tr>
+      <w:tr>
+        <w:trPr>
+          <w:cantSplit/>
+        </w:trPr>
+        <w:tc>
+          <w:tcPr>
+            <w:tcW w:type="dxa" w:w="5184"/>
+            <w:vAlign w:val="top"/>
+            <w:tcMar>
+              <w:top w:w="80" w:type="dxa"/>
+              <w:start w:w="100" w:type="dxa"/>
+              <w:bottom w:w="80" w:type="dxa"/>
+              <w:end w:w="100" w:type="dxa"/>
+            </w:tcMar>
+          </w:tcPr>
+          <w:p>
+            <w:pPr>
+              <w:spacing w:after="40"/>
+            </w:pPr>
+            <w:r>
+              <w:rPr>
+                <w:rFonts w:ascii="Microsoft YaHei" w:hAnsi="Microsoft YaHei" w:eastAsia="Microsoft YaHei"/>
+              </w:rPr>
+            </w:r>
+            <w:r>
+              <w:rPr>
+                <w:rFonts w:ascii="Microsoft YaHei" w:hAnsi="Microsoft YaHei" w:eastAsia="Microsoft YaHei"/>
+                <w:b w:val="0"/>
+                <w:i w:val="0"/>
+              </w:rPr>
+              <w:t>功能简介</w:t>
+            </w:r>
+          </w:p>
+        </w:tc>
+        <w:tc>
+          <w:tcPr>
+            <w:tcW w:type="dxa" w:w="5184"/>
+            <w:vAlign w:val="top"/>
+            <w:tcMar>
+              <w:top w:w="80" w:type="dxa"/>
+              <w:start w:w="100" w:type="dxa"/>
+              <w:bottom w:w="80" w:type="dxa"/>
+              <w:end w:w="100" w:type="dxa"/>
+            </w:tcMar>
+          </w:tcPr>
+          <w:p>
+            <w:pPr>
+              <w:spacing w:after="40"/>
+            </w:pPr>
+            <w:r>
+              <w:rPr>
+                <w:rFonts w:ascii="Microsoft YaHei" w:hAnsi="Microsoft YaHei" w:eastAsia="Microsoft YaHei"/>
+              </w:rPr>
+            </w:r>
+            <w:r>
+              <w:rPr>
+                <w:rFonts w:ascii="Microsoft YaHei" w:hAnsi="Microsoft YaHei" w:eastAsia="Microsoft YaHei"/>
+                <w:b w:val="0"/>
+                <w:i w:val="0"/>
+              </w:rPr>
+              <w:t>调整按键位置并添加、删除按键，保存到所属方案。</w:t>
+            </w:r>
+          </w:p>
+        </w:tc>
+      </w:tr>
+      <w:tr>
+        <w:trPr>
+          <w:cantSplit/>
+        </w:trPr>
+        <w:tc>
+          <w:tcPr>
+            <w:tcW w:type="dxa" w:w="5184"/>
+            <w:vAlign w:val="top"/>
+            <w:tcMar>
+              <w:top w:w="80" w:type="dxa"/>
+              <w:start w:w="100" w:type="dxa"/>
+              <w:bottom w:w="80" w:type="dxa"/>
+              <w:end w:w="100" w:type="dxa"/>
+            </w:tcMar>
+          </w:tcPr>
+          <w:p>
+            <w:pPr>
+              <w:spacing w:after="40"/>
+            </w:pPr>
+            <w:r>
+              <w:rPr>
+                <w:rFonts w:ascii="Microsoft YaHei" w:hAnsi="Microsoft YaHei" w:eastAsia="Microsoft YaHei"/>
+              </w:rPr>
+            </w:r>
+            <w:r>
+              <w:rPr>
+                <w:rFonts w:ascii="Microsoft YaHei" w:hAnsi="Microsoft YaHei" w:eastAsia="Microsoft YaHei"/>
+                <w:b w:val="0"/>
+                <w:i w:val="0"/>
+              </w:rPr>
+              <w:t>场景描述</w:t>
+            </w:r>
+          </w:p>
+        </w:tc>
+        <w:tc>
+          <w:tcPr>
+            <w:tcW w:type="dxa" w:w="5184"/>
+            <w:vAlign w:val="top"/>
+            <w:tcMar>
+              <w:top w:w="80" w:type="dxa"/>
+              <w:start w:w="100" w:type="dxa"/>
+              <w:bottom w:w="80" w:type="dxa"/>
+              <w:end w:w="100" w:type="dxa"/>
+            </w:tcMar>
+          </w:tcPr>
+          <w:p>
+            <w:pPr>
+              <w:spacing w:after="40"/>
+            </w:pPr>
+            <w:r>
+              <w:rPr>
+                <w:rFonts w:ascii="Microsoft YaHei" w:hAnsi="Microsoft YaHei" w:eastAsia="Microsoft YaHei"/>
+              </w:rPr>
+            </w:r>
+            <w:r>
+              <w:rPr>
+                <w:rFonts w:ascii="Microsoft YaHei" w:hAnsi="Microsoft YaHei" w:eastAsia="Microsoft YaHei"/>
+                <w:b w:val="0"/>
+                <w:i w:val="0"/>
+              </w:rPr>
+              <w:t>从布局库编辑已有方案，或导入布局码后进入。</w:t>
+            </w:r>
+          </w:p>
+        </w:tc>
+      </w:tr>
+      <w:tr>
+        <w:trPr>
+          <w:cantSplit/>
+        </w:trPr>
+        <w:tc>
+          <w:tcPr>
+            <w:tcW w:type="dxa" w:w="5184"/>
+            <w:vAlign w:val="top"/>
+            <w:tcMar>
+              <w:top w:w="80" w:type="dxa"/>
+              <w:start w:w="100" w:type="dxa"/>
+              <w:bottom w:w="80" w:type="dxa"/>
+              <w:end w:w="100" w:type="dxa"/>
+            </w:tcMar>
+          </w:tcPr>
+          <w:p>
+            <w:pPr>
+              <w:spacing w:after="40"/>
+            </w:pPr>
+            <w:r>
+              <w:rPr>
+                <w:rFonts w:ascii="Microsoft YaHei" w:hAnsi="Microsoft YaHei" w:eastAsia="Microsoft YaHei"/>
+              </w:rPr>
+            </w:r>
+            <w:r>
+              <w:rPr>
+                <w:rFonts w:ascii="Microsoft YaHei" w:hAnsi="Microsoft YaHei" w:eastAsia="Microsoft YaHei"/>
+                <w:b w:val="0"/>
+                <w:i w:val="0"/>
+              </w:rPr>
+              <w:t>输入／前置条件</w:t>
+            </w:r>
+          </w:p>
+        </w:tc>
+        <w:tc>
+          <w:tcPr>
+            <w:tcW w:type="dxa" w:w="5184"/>
+            <w:vAlign w:val="top"/>
+            <w:tcMar>
+              <w:top w:w="80" w:type="dxa"/>
+              <w:start w:w="100" w:type="dxa"/>
+              <w:bottom w:w="80" w:type="dxa"/>
+              <w:end w:w="100" w:type="dxa"/>
+            </w:tcMar>
+          </w:tcPr>
+          <w:p>
+            <w:pPr>
+              <w:spacing w:after="40"/>
+            </w:pPr>
+            <w:r>
+              <w:rPr>
+                <w:rFonts w:ascii="Microsoft YaHei" w:hAnsi="Microsoft YaHei" w:eastAsia="Microsoft YaHei"/>
+              </w:rPr>
+            </w:r>
+            <w:r>
+              <w:rPr>
+                <w:rFonts w:ascii="Microsoft YaHei" w:hAnsi="Microsoft YaHei" w:eastAsia="Microsoft YaHei"/>
+                <w:b w:val="0"/>
+                <w:i w:val="0"/>
+              </w:rPr>
+              <w:t>当前账号与进入时一致，待编辑方案有效；推荐或他人分享编辑为自己的副本。</w:t>
+            </w:r>
+          </w:p>
+        </w:tc>
+      </w:tr>
+      <w:tr>
+        <w:trPr>
+          <w:cantSplit/>
+        </w:trPr>
+        <w:tc>
+          <w:tcPr>
+            <w:tcW w:type="dxa" w:w="5184"/>
+            <w:vAlign w:val="top"/>
+            <w:tcMar>
+              <w:top w:w="80" w:type="dxa"/>
+              <w:start w:w="100" w:type="dxa"/>
+              <w:bottom w:w="80" w:type="dxa"/>
+              <w:end w:w="100" w:type="dxa"/>
+            </w:tcMar>
+          </w:tcPr>
+          <w:p>
+            <w:pPr>
+              <w:spacing w:after="40"/>
+            </w:pPr>
+            <w:r>
+              <w:rPr>
+                <w:rFonts w:ascii="Microsoft YaHei" w:hAnsi="Microsoft YaHei" w:eastAsia="Microsoft YaHei"/>
+              </w:rPr>
+            </w:r>
+            <w:r>
+              <w:rPr>
+                <w:rFonts w:ascii="Microsoft YaHei" w:hAnsi="Microsoft YaHei" w:eastAsia="Microsoft YaHei"/>
+                <w:b w:val="0"/>
+                <w:i w:val="0"/>
+              </w:rPr>
+              <w:t>需求描述</w:t>
+            </w:r>
+          </w:p>
+        </w:tc>
+        <w:tc>
+          <w:tcPr>
+            <w:tcW w:type="dxa" w:w="5184"/>
+            <w:vAlign w:val="top"/>
+            <w:tcMar>
+              <w:top w:w="80" w:type="dxa"/>
+              <w:start w:w="100" w:type="dxa"/>
+              <w:bottom w:w="80" w:type="dxa"/>
+              <w:end w:w="100" w:type="dxa"/>
+            </w:tcMar>
+          </w:tcPr>
+          <w:p>
+            <w:pPr>
+              <w:spacing w:after="40"/>
+            </w:pPr>
+            <w:r>
+              <w:rPr>
+                <w:rFonts w:ascii="Microsoft YaHei" w:hAnsi="Microsoft YaHei" w:eastAsia="Microsoft YaHei"/>
+              </w:rPr>
+            </w:r>
+            <w:r>
+              <w:rPr>
+                <w:rFonts w:ascii="Microsoft YaHei" w:hAnsi="Microsoft YaHei" w:eastAsia="Microsoft YaHei"/>
+                <w:b/>
+                <w:i w:val="0"/>
+              </w:rPr>
+              <w:t>图示：</w:t>
+            </w:r>
+            <w:r>
+              <w:rPr>
+                <w:rFonts w:ascii="Microsoft YaHei" w:hAnsi="Microsoft YaHei" w:eastAsia="Microsoft YaHei"/>
+                <w:b w:val="0"/>
+                <w:i w:val="0"/>
+              </w:rPr>
+              <w:t xml:space="preserve"> </w:t>
+            </w:r>
+            <w:r>
+              <w:rPr>
+                <w:rFonts w:ascii="Microsoft YaHei" w:hAnsi="Microsoft YaHei" w:eastAsia="Microsoft YaHei"/>
+              </w:rPr>
+              <w:drawing>
+                <wp:inline xmlns:a="http://schemas.openxmlformats.org/drawingml/2006/main" xmlns:pic="http://schemas.openxmlformats.org/drawingml/2006/picture">
+                  <wp:extent cx="2880360" cy="1618142"/>
+                  <wp:docPr id="25" name="Picture 25"/>
+                  <wp:cNvGraphicFramePr>
+                    <a:graphicFrameLocks noChangeAspect="1"/>
+                  </wp:cNvGraphicFramePr>
+                  <a:graphic>
+                    <a:graphicData uri="http://schemas.openxmlformats.org/drawingml/2006/picture">
+                      <pic:pic>
+                        <pic:nvPicPr>
+                          <pic:cNvPr id="0" name="standalone-mobile-layout-editor.png"/>
+                          <pic:cNvPicPr/>
+                        </pic:nvPicPr>
+                        <pic:blipFill>
+                          <a:blip r:embed="rId33"/>
+                          <a:stretch>
+                            <a:fillRect/>
+                          </a:stretch>
+                        </pic:blipFill>
+                        <pic:spPr>
+                          <a:xfrm>
+                            <a:off x="0" y="0"/>
+                            <a:ext cx="2880360" cy="1618142"/>
+                          </a:xfrm>
+                          <a:prstGeom prst="rect"/>
+                        </pic:spPr>
+                      </pic:pic>
+                    </a:graphicData>
+                  </a:graphic>
+                </wp:inline>
+              </w:drawing>
+            </w:r>
+            <w:r>
+              <w:rPr>
+                <w:rFonts w:ascii="Microsoft YaHei" w:hAnsi="Microsoft YaHei" w:eastAsia="Microsoft YaHei"/>
+              </w:rPr>
+              <w:br/>
+            </w:r>
+            <w:r>
+              <w:rPr>
+                <w:rFonts w:ascii="Microsoft YaHei" w:hAnsi="Microsoft YaHei" w:eastAsia="Microsoft YaHei"/>
+                <w:b w:val="0"/>
+                <w:i/>
+              </w:rPr>
+              <w:t>图3-35：拖动和调整虚拟按键。</w:t>
+            </w:r>
+            <w:r>
+              <w:rPr>
+                <w:rFonts w:ascii="Microsoft YaHei" w:hAnsi="Microsoft YaHei" w:eastAsia="Microsoft YaHei"/>
+              </w:rPr>
+              <w:br/>
+            </w:r>
+            <w:r>
+              <w:rPr>
+                <w:rFonts w:ascii="Microsoft YaHei" w:hAnsi="Microsoft YaHei" w:eastAsia="Microsoft YaHei"/>
+              </w:rPr>
+              <w:drawing>
+                <wp:inline xmlns:a="http://schemas.openxmlformats.org/drawingml/2006/main" xmlns:pic="http://schemas.openxmlformats.org/drawingml/2006/picture">
+                  <wp:extent cx="2880360" cy="1618142"/>
+                  <wp:docPr id="26" name="Picture 26"/>
+                  <wp:cNvGraphicFramePr>
+                    <a:graphicFrameLocks noChangeAspect="1"/>
+                  </wp:cNvGraphicFramePr>
+                  <a:graphic>
+                    <a:graphicData uri="http://schemas.openxmlformats.org/drawingml/2006/picture">
+                      <pic:pic>
+                        <pic:nvPicPr>
+                          <pic:cNvPr id="0" name="standalone-mobile-layout-applied.png"/>
+                          <pic:cNvPicPr/>
+                        </pic:nvPicPr>
+                        <pic:blipFill>
+                          <a:blip r:embed="rId34"/>
+                          <a:stretch>
+                            <a:fillRect/>
+                          </a:stretch>
+                        </pic:blipFill>
+                        <pic:spPr>
+                          <a:xfrm>
+                            <a:off x="0" y="0"/>
+                            <a:ext cx="2880360" cy="1618142"/>
+                          </a:xfrm>
+                          <a:prstGeom prst="rect"/>
+                        </pic:spPr>
+                      </pic:pic>
+                    </a:graphicData>
+                  </a:graphic>
+                </wp:inline>
+              </w:drawing>
+            </w:r>
+            <w:r>
+              <w:rPr>
+                <w:rFonts w:ascii="Microsoft YaHei" w:hAnsi="Microsoft YaHei" w:eastAsia="Microsoft YaHei"/>
+              </w:rPr>
+              <w:br/>
+            </w:r>
+            <w:r>
+              <w:rPr>
+                <w:rFonts w:ascii="Microsoft YaHei" w:hAnsi="Microsoft YaHei" w:eastAsia="Microsoft YaHei"/>
+                <w:b w:val="0"/>
+                <w:i/>
+              </w:rPr>
+              <w:t>图3-36：游戏画面按保存后的坐标显示按键。</w:t>
+            </w:r>
+            <w:r>
+              <w:rPr>
+                <w:rFonts w:ascii="Microsoft YaHei" w:hAnsi="Microsoft YaHei" w:eastAsia="Microsoft YaHei"/>
+              </w:rPr>
+              <w:br/>
+            </w:r>
+            <w:r>
+              <w:rPr>
+                <w:rFonts w:ascii="Microsoft YaHei" w:hAnsi="Microsoft YaHei" w:eastAsia="Microsoft YaHei"/>
+                <w:b/>
+                <w:i w:val="0"/>
+              </w:rPr>
+              <w:t>详细说明：</w:t>
+            </w:r>
+            <w:r>
+              <w:rPr>
+                <w:rFonts w:ascii="Microsoft YaHei" w:hAnsi="Microsoft YaHei" w:eastAsia="Microsoft YaHei"/>
+              </w:rPr>
+              <w:br/>
+            </w:r>
+            <w:r>
+              <w:rPr>
+                <w:rFonts w:ascii="Microsoft YaHei" w:hAnsi="Microsoft YaHei" w:eastAsia="Microsoft YaHei"/>
+                <w:b/>
+                <w:i w:val="0"/>
+              </w:rPr>
+              <w:t>展示说明：</w:t>
+            </w:r>
+            <w:r>
+              <w:rPr>
+                <w:rFonts w:ascii="Microsoft YaHei" w:hAnsi="Microsoft YaHei" w:eastAsia="Microsoft YaHei"/>
+              </w:rPr>
+              <w:br/>
+            </w:r>
+            <w:r>
+              <w:rPr>
+                <w:rFonts w:ascii="Microsoft YaHei" w:hAnsi="Microsoft YaHei" w:eastAsia="Microsoft YaHei"/>
+                <w:b w:val="0"/>
+                <w:i w:val="0"/>
+              </w:rPr>
+              <w:t>1. 编辑画布显示按键及位置，提供按键动作选择、添加、删除和保存。本地名称去首尾空格后为1–10个字符，自己的云分享名称为1–20个字符；例如“汉”“A”“😀”各计1，超限不提交。类型可选游戏布局或通用布局。</w:t>
+            </w:r>
+            <w:r>
+              <w:rPr>
+                <w:rFonts w:ascii="Microsoft YaHei" w:hAnsi="Microsoft YaHei" w:eastAsia="Microsoft YaHei"/>
+              </w:rPr>
+              <w:br/>
+            </w:r>
+            <w:r>
+              <w:rPr>
+                <w:rFonts w:ascii="Microsoft YaHei" w:hAnsi="Microsoft YaHei" w:eastAsia="Microsoft YaHei"/>
+                <w:b w:val="0"/>
+                <w:i w:val="0"/>
+              </w:rPr>
+              <w:t>2. 名称在当前账号的本地方案集合、云分享集合内分别查重，修改原方案时排除自身；同一集合内重名提示“该名称已被使用，请修改。”，不覆盖。</w:t>
+            </w:r>
+            <w:r>
+              <w:rPr>
+                <w:rFonts w:ascii="Microsoft YaHei" w:hAnsi="Microsoft YaHei" w:eastAsia="Microsoft YaHei"/>
+              </w:rPr>
+              <w:br/>
+            </w:r>
+            <w:r>
+              <w:rPr>
+                <w:rFonts w:ascii="Microsoft YaHei" w:hAnsi="Microsoft YaHei" w:eastAsia="Microsoft YaHei"/>
+                <w:b/>
+                <w:i w:val="0"/>
+              </w:rPr>
+              <w:t>交互说明：</w:t>
+            </w:r>
+            <w:r>
+              <w:rPr>
+                <w:rFonts w:ascii="Microsoft YaHei" w:hAnsi="Microsoft YaHei" w:eastAsia="Microsoft YaHei"/>
+              </w:rPr>
+              <w:br/>
+            </w:r>
+            <w:r>
+              <w:rPr>
+                <w:rFonts w:ascii="Microsoft YaHei" w:hAnsi="Microsoft YaHei" w:eastAsia="Microsoft YaHei"/>
+                <w:b w:val="0"/>
+                <w:i w:val="0"/>
+              </w:rPr>
+              <w:t>1. 拖动按键改变位置并限制在画布可用范围；选中按键后可切换其动作，添加/删除影响当前编辑方案，至少保留一个有效按键。编辑操作不向远端游戏发送按键。</w:t>
+            </w:r>
+            <w:r>
+              <w:rPr>
+                <w:rFonts w:ascii="Microsoft YaHei" w:hAnsi="Microsoft YaHei" w:eastAsia="Microsoft YaHei"/>
+              </w:rPr>
+              <w:br/>
+            </w:r>
+            <w:r>
+              <w:rPr>
+                <w:rFonts w:ascii="Microsoft YaHei" w:hAnsi="Microsoft YaHei" w:eastAsia="Microsoft YaHei"/>
+                <w:b w:val="0"/>
+                <w:i w:val="0"/>
+              </w:rPr>
+              <w:t>2. 点击保存，将有效名称、类型及按键数据写入当前账号方案；官方/他人推荐保存为我的副本，自己的云方案更新原内容并保留布局码。保存后返回所属方案Tab；若保存的是当前已应用方案，同步更新已应用数据。</w:t>
+            </w:r>
+            <w:r>
+              <w:rPr>
+                <w:rFonts w:ascii="Microsoft YaHei" w:hAnsi="Microsoft YaHei" w:eastAsia="Microsoft YaHei"/>
+              </w:rPr>
+              <w:br/>
+            </w:r>
+            <w:r>
+              <w:rPr>
+                <w:rFonts w:ascii="Microsoft YaHei" w:hAnsi="Microsoft YaHei" w:eastAsia="Microsoft YaHei"/>
+                <w:b w:val="0"/>
+                <w:i w:val="0"/>
+              </w:rPr>
+              <w:t>3. 未应用的方案需回布局库点击应用才替换当前选择；保存不重建远控连接或登录。</w:t>
+            </w:r>
+            <w:r>
+              <w:rPr>
+                <w:rFonts w:ascii="Microsoft YaHei" w:hAnsi="Microsoft YaHei" w:eastAsia="Microsoft YaHei"/>
+              </w:rPr>
+              <w:br/>
+            </w:r>
+            <w:r>
+              <w:rPr>
+                <w:rFonts w:ascii="Microsoft YaHei" w:hAnsi="Microsoft YaHei" w:eastAsia="Microsoft YaHei"/>
+                <w:b w:val="0"/>
+                <w:i w:val="0"/>
+              </w:rPr>
+              <w:t>4. 点击返回、关闭库或按Esc时，若有未保存修改，显示“保存此次编辑？”并提供保存、不保存、继续编辑；保存按正常校验提交，不保存丢弃本次编辑并回布局库，继续编辑保留草稿。存在二级弹窗时Esc先关闭弹窗，不退出远控。</w:t>
+            </w:r>
+          </w:p>
+        </w:tc>
+      </w:tr>
+      <w:tr>
+        <w:trPr>
+          <w:cantSplit/>
+        </w:trPr>
+        <w:tc>
+          <w:tcPr>
+            <w:tcW w:type="dxa" w:w="5184"/>
+            <w:vAlign w:val="top"/>
+            <w:tcMar>
+              <w:top w:w="80" w:type="dxa"/>
+              <w:start w:w="100" w:type="dxa"/>
+              <w:bottom w:w="80" w:type="dxa"/>
+              <w:end w:w="100" w:type="dxa"/>
+            </w:tcMar>
+          </w:tcPr>
+          <w:p>
+            <w:pPr>
+              <w:spacing w:after="40"/>
+            </w:pPr>
+            <w:r>
+              <w:rPr>
+                <w:rFonts w:ascii="Microsoft YaHei" w:hAnsi="Microsoft YaHei" w:eastAsia="Microsoft YaHei"/>
+              </w:rPr>
+            </w:r>
+            <w:r>
+              <w:rPr>
+                <w:rFonts w:ascii="Microsoft YaHei" w:hAnsi="Microsoft YaHei" w:eastAsia="Microsoft YaHei"/>
+                <w:b w:val="0"/>
+                <w:i w:val="0"/>
+              </w:rPr>
+              <w:t>输出／后置条件</w:t>
+            </w:r>
+          </w:p>
+        </w:tc>
+        <w:tc>
+          <w:tcPr>
+            <w:tcW w:type="dxa" w:w="5184"/>
+            <w:vAlign w:val="top"/>
+            <w:tcMar>
+              <w:top w:w="80" w:type="dxa"/>
+              <w:start w:w="100" w:type="dxa"/>
+              <w:bottom w:w="80" w:type="dxa"/>
+              <w:end w:w="100" w:type="dxa"/>
+            </w:tcMar>
+          </w:tcPr>
+          <w:p>
+            <w:pPr>
+              <w:spacing w:after="40"/>
+            </w:pPr>
+            <w:r>
+              <w:rPr>
+                <w:rFonts w:ascii="Microsoft YaHei" w:hAnsi="Microsoft YaHei" w:eastAsia="Microsoft YaHei"/>
+              </w:rPr>
+            </w:r>
+            <w:r>
+              <w:rPr>
+                <w:rFonts w:ascii="Microsoft YaHei" w:hAnsi="Microsoft YaHei" w:eastAsia="Microsoft YaHei"/>
+                <w:b w:val="0"/>
+                <w:i w:val="0"/>
+              </w:rPr>
+              <w:t>保存后的方案含本次按键位置及增删结果，可从布局库应用到当前游戏。</w:t>
+            </w:r>
+          </w:p>
+        </w:tc>
+      </w:tr>
+      <w:tr>
+        <w:trPr>
+          <w:cantSplit/>
+        </w:trPr>
+        <w:tc>
+          <w:tcPr>
+            <w:tcW w:type="dxa" w:w="5184"/>
+            <w:vAlign w:val="top"/>
+            <w:tcMar>
+              <w:top w:w="80" w:type="dxa"/>
+              <w:start w:w="100" w:type="dxa"/>
+              <w:bottom w:w="80" w:type="dxa"/>
+              <w:end w:w="100" w:type="dxa"/>
+            </w:tcMar>
+          </w:tcPr>
+          <w:p>
+            <w:pPr>
+              <w:spacing w:after="40"/>
+            </w:pPr>
+            <w:r>
+              <w:rPr>
+                <w:rFonts w:ascii="Microsoft YaHei" w:hAnsi="Microsoft YaHei" w:eastAsia="Microsoft YaHei"/>
+              </w:rPr>
+            </w:r>
+            <w:r>
+              <w:rPr>
+                <w:rFonts w:ascii="Microsoft YaHei" w:hAnsi="Microsoft YaHei" w:eastAsia="Microsoft YaHei"/>
+                <w:b w:val="0"/>
+                <w:i w:val="0"/>
+              </w:rPr>
+              <w:t>补充说明</w:t>
+            </w:r>
+          </w:p>
+        </w:tc>
+        <w:tc>
+          <w:tcPr>
+            <w:tcW w:type="dxa" w:w="5184"/>
+            <w:vAlign w:val="top"/>
+            <w:tcMar>
+              <w:top w:w="80" w:type="dxa"/>
+              <w:start w:w="100" w:type="dxa"/>
+              <w:bottom w:w="80" w:type="dxa"/>
+              <w:end w:w="100" w:type="dxa"/>
+            </w:tcMar>
+          </w:tcPr>
+          <w:p>
+            <w:pPr>
+              <w:spacing w:after="40"/>
+            </w:pPr>
+            <w:r>
+              <w:rPr>
+                <w:rFonts w:ascii="Microsoft YaHei" w:hAnsi="Microsoft YaHei" w:eastAsia="Microsoft YaHei"/>
+              </w:rPr>
+            </w:r>
+            <w:r>
+              <w:rPr>
+                <w:rFonts w:ascii="Microsoft YaHei" w:hAnsi="Microsoft YaHei" w:eastAsia="Microsoft YaHei"/>
+                <w:b w:val="0"/>
+                <w:i w:val="0"/>
+              </w:rPr>
+              <w:t>1. 退出账号、切换账号或原会话失效时，旧编辑结果不得写入新账号；失败或未完成保存不能显示保存成功。</w:t>
+            </w:r>
+            <w:r>
+              <w:rPr>
+                <w:rFonts w:ascii="Microsoft YaHei" w:hAnsi="Microsoft YaHei" w:eastAsia="Microsoft YaHei"/>
+              </w:rPr>
+              <w:br/>
+            </w:r>
+            <w:r>
+              <w:rPr>
+                <w:rFonts w:ascii="Microsoft YaHei" w:hAnsi="Microsoft YaHei" w:eastAsia="Microsoft YaHei"/>
+                <w:b w:val="0"/>
+                <w:i w:val="0"/>
+              </w:rPr>
+              <w:t>2. 正式布局编辑、云端存储和远控输入仍需联调，Demo可拖动/保存不代表服务端同步或真实按键输入已经验收。</w:t>
             </w:r>
           </w:p>
         </w:tc>
@@ -12110,7 +14803,7 @@
               <w:drawing>
                 <wp:inline xmlns:a="http://schemas.openxmlformats.org/drawingml/2006/main" xmlns:pic="http://schemas.openxmlformats.org/drawingml/2006/picture">
                   <wp:extent cx="2880360" cy="1853576"/>
-                  <wp:docPr id="19" name="Picture 19"/>
+                  <wp:docPr id="27" name="Picture 27"/>
                   <wp:cNvGraphicFramePr>
                     <a:graphicFrameLocks noChangeAspect="1"/>
                   </wp:cNvGraphicFramePr>
@@ -12122,7 +14815,7 @@
                           <pic:cNvPicPr/>
                         </pic:nvPicPr>
                         <pic:blipFill>
-                          <a:blip r:embed="rId27"/>
+                          <a:blip r:embed="rId35"/>
                           <a:stretch>
                             <a:fillRect/>
                           </a:stretch>
@@ -12167,7 +14860,7 @@
               <w:drawing>
                 <wp:inline xmlns:a="http://schemas.openxmlformats.org/drawingml/2006/main" xmlns:pic="http://schemas.openxmlformats.org/drawingml/2006/picture">
                   <wp:extent cx="2880360" cy="1853576"/>
-                  <wp:docPr id="20" name="Picture 20"/>
+                  <wp:docPr id="28" name="Picture 28"/>
                   <wp:cNvGraphicFramePr>
                     <a:graphicFrameLocks noChangeAspect="1"/>
                   </wp:cNvGraphicFramePr>
@@ -12179,7 +14872,7 @@
                           <pic:cNvPicPr/>
                         </pic:nvPicPr>
                         <pic:blipFill>
-                          <a:blip r:embed="rId28"/>
+                          <a:blip r:embed="rId36"/>
                           <a:stretch>
                             <a:fillRect/>
                           </a:stretch>
@@ -12223,8 +14916,8 @@
               </w:rPr>
               <w:drawing>
                 <wp:inline xmlns:a="http://schemas.openxmlformats.org/drawingml/2006/main" xmlns:pic="http://schemas.openxmlformats.org/drawingml/2006/picture">
-                  <wp:extent cx="2880360" cy="1853576"/>
-                  <wp:docPr id="21" name="Picture 21"/>
+                  <wp:extent cx="2880360" cy="1855147"/>
+                  <wp:docPr id="29" name="Picture 29"/>
                   <wp:cNvGraphicFramePr>
                     <a:graphicFrameLocks noChangeAspect="1"/>
                   </wp:cNvGraphicFramePr>
@@ -12236,7 +14929,7 @@
                           <pic:cNvPicPr/>
                         </pic:nvPicPr>
                         <pic:blipFill>
-                          <a:blip r:embed="rId29"/>
+                          <a:blip r:embed="rId37"/>
                           <a:stretch>
                             <a:fillRect/>
                           </a:stretch>
@@ -12244,7 +14937,7 @@
                         <pic:spPr>
                           <a:xfrm>
                             <a:off x="0" y="0"/>
-                            <a:ext cx="2880360" cy="1853576"/>
+                            <a:ext cx="2880360" cy="1855147"/>
                           </a:xfrm>
                           <a:prstGeom prst="rect"/>
                         </pic:spPr>
@@ -12308,7 +15001,7 @@
                 <w:b w:val="0"/>
                 <w:i w:val="0"/>
               </w:rPr>
-              <w:t>1. 未登录启动或退出账号后直接展示完整登录页，不再先显示独立欢迎首页或要求点击登录后展开表单。品牌区只盖世游戏Logo和“盖世远程”，无电脑插画、宣传标题/副文案。左侧默认展示电脑登录二维码，右侧国内手机号验证码；海外邮箱验证码及Google，不显示账号密码/微信/QQ。未登录时右上不显示账户和更多。</w:t>
+              <w:t>1. 未登录启动或退出账号后直接展示完整登录页，不再先显示独立欢迎首页或要求点击登录后展开表单。品牌区只盖世游戏Logo和“盖世远程”，无电脑插画、宣传标题/副文案。左侧显示“App扫码登录”及电脑登录二维码，说明“使用盖世远程或盖世游戏App扫码登录”，右侧国内手机号验证码；海外邮箱验证码及Google，不显示账号密码/微信/QQ。未登录时右上不显示账户和更多。</w:t>
             </w:r>
             <w:r>
               <w:rPr>
@@ -12322,7 +15015,7 @@
                 <w:b w:val="0"/>
                 <w:i w:val="0"/>
               </w:rPr>
-              <w:t>2. 底部统一协议默认未勾选：国内用户/隐私/中国移动认证三项，海外用户/隐私两项。未同意时仍展示可扫描的登录码，允许进入手机确认页；表单、获取验证码及登录/Google入口不因未勾选而禁用。扫码本身不代表确认或登录成功。扫码说明中的“盖世游戏 App”为官网下载链接。</w:t>
+              <w:t>2. 底部统一协议默认未勾选：国内用户/隐私/中国移动认证三项，海外用户/隐私两项。未同意时仍展示可扫描的登录码，允许进入手机确认页；表单、获取验证码及登录/Google入口不因未勾选而禁用。扫码本身不代表确认或登录成功。盖世游戏下载链接仍可打开对应官网，不作为唯一扫码来源。</w:t>
             </w:r>
             <w:r>
               <w:rPr>
@@ -12378,7 +15071,7 @@
                 <w:b w:val="0"/>
                 <w:i w:val="0"/>
               </w:rPr>
-              <w:t>3. 初始登录码绑定本发起端，未同意也可扫描至待确认；勾选同意保留仍有效的同一码、扫码状态、输入及验证码，更新本次同意状态，无需重扫或重取验证码。撤勾使旧码和请求失效，生成新的可扫描但未同意的码，旧扫码确认不能复用。本轮用已登录盖世远程移动App的我的→扫一扫扫描并确认。盖世游戏App扫码入口沿用账号体系的接入范围，实际码协议与可扫描App需联调核对，不以Demo证明兼容。二维码不是设备被控码，不继承Steam/Epic会话。</w:t>
+              <w:t>3. 初始登录码绑定本发起端，未同意也可扫描至待确认；勾选同意保留仍有效的同一码、扫码状态、输入及验证码，更新本次同意状态，无需重扫或重取验证码。撤勾使旧码和请求失效，生成新的可扫描但未同意的码，旧扫码确认不能复用。支持已登录盖世远程App的我的→扫一扫，或盖世游戏App扫码后确认；两者确认的均为本次电脑登录。真实码协议、支持版本和跨App联调仍需接入，Demo不证明生产扫码兼容。二维码不是设备被控码，不继承Steam/Epic会话。</w:t>
             </w:r>
             <w:r>
               <w:rPr>
@@ -12392,7 +15085,7 @@
                 <w:b w:val="0"/>
                 <w:i w:val="0"/>
               </w:rPr>
-              <w:t>4. Google仅海外，同意后走渠道原授权，不收集Google密码；验证码、Google和扫码在最终异步完成/领取前均复核本次协议同意和请求有效性，取得有效会话后才获取当前UID工作区。</w:t>
+              <w:t>4. Google仅海外，同意后走渠道原授权，不收集Google密码；验证码、Google和扫码在最终异步完成/领取前均复核本次协议同意和请求有效性，首次使用且无既有账号时按盖世账号体系完成登录即注册；取得有效会话后才获取当前UID工作区。</w:t>
             </w:r>
             <w:r>
               <w:rPr>
@@ -13696,7 +16389,7 @@
               <w:drawing>
                 <wp:inline xmlns:a="http://schemas.openxmlformats.org/drawingml/2006/main" xmlns:pic="http://schemas.openxmlformats.org/drawingml/2006/picture">
                   <wp:extent cx="2880360" cy="1853576"/>
-                  <wp:docPr id="22" name="Picture 22"/>
+                  <wp:docPr id="30" name="Picture 30"/>
                   <wp:cNvGraphicFramePr>
                     <a:graphicFrameLocks noChangeAspect="1"/>
                   </wp:cNvGraphicFramePr>
@@ -13708,7 +16401,7 @@
                           <pic:cNvPicPr/>
                         </pic:nvPicPr>
                         <pic:blipFill>
-                          <a:blip r:embed="rId30"/>
+                          <a:blip r:embed="rId38"/>
                           <a:stretch>
                             <a:fillRect/>
                           </a:stretch>
@@ -13794,7 +16487,7 @@
                 <w:b w:val="0"/>
                 <w:i w:val="0"/>
               </w:rPr>
-              <w:t>2. 不展示远程协助、设备码、收藏、会员或公网承诺。</w:t>
+              <w:t>2. 不展示远程协助、设备码、收藏或会员；不承诺公网必定连接成功或未确定的画质、时长。</w:t>
             </w:r>
             <w:r>
               <w:rPr>
@@ -14353,7 +17046,7 @@
               <w:drawing>
                 <wp:inline xmlns:a="http://schemas.openxmlformats.org/drawingml/2006/main" xmlns:pic="http://schemas.openxmlformats.org/drawingml/2006/picture">
                   <wp:extent cx="2880360" cy="1853576"/>
-                  <wp:docPr id="23" name="Picture 23"/>
+                  <wp:docPr id="31" name="Picture 31"/>
                   <wp:cNvGraphicFramePr>
                     <a:graphicFrameLocks noChangeAspect="1"/>
                   </wp:cNvGraphicFramePr>
@@ -14365,7 +17058,7 @@
                           <pic:cNvPicPr/>
                         </pic:nvPicPr>
                         <pic:blipFill>
-                          <a:blip r:embed="rId31"/>
+                          <a:blip r:embed="rId39"/>
                           <a:stretch>
                             <a:fillRect/>
                           </a:stretch>
@@ -15052,7 +17745,7 @@
               <w:drawing>
                 <wp:inline xmlns:a="http://schemas.openxmlformats.org/drawingml/2006/main" xmlns:pic="http://schemas.openxmlformats.org/drawingml/2006/picture">
                   <wp:extent cx="2880360" cy="1853576"/>
-                  <wp:docPr id="24" name="Picture 24"/>
+                  <wp:docPr id="32" name="Picture 32"/>
                   <wp:cNvGraphicFramePr>
                     <a:graphicFrameLocks noChangeAspect="1"/>
                   </wp:cNvGraphicFramePr>
@@ -15064,7 +17757,7 @@
                           <pic:cNvPicPr/>
                         </pic:nvPicPr>
                         <pic:blipFill>
-                          <a:blip r:embed="rId32"/>
+                          <a:blip r:embed="rId40"/>
                           <a:stretch>
                             <a:fillRect/>
                           </a:stretch>
@@ -15192,7 +17885,7 @@
                 <w:b w:val="0"/>
                 <w:i w:val="0"/>
               </w:rPr>
-              <w:t>1. 点击进入桌面或观看，核对实时在线、权限、同一局域网及占用；符合后显示连接中，避免重复发起。首帧可显示且会话可用才算连接成功。</w:t>
+              <w:t>1. 点击进入桌面或观看，核对实时在线、权限、网络可达性及占用；符合后显示连接中，避免重复发起。首帧可显示且会话可用才算连接成功。</w:t>
             </w:r>
             <w:r>
               <w:rPr>
@@ -15206,7 +17899,7 @@
                 <w:b w:val="0"/>
                 <w:i w:val="0"/>
               </w:rPr>
-              <w:t>2. 占用时确认接管才发起；取消不影响原会话。连接中取消回详情，失败/超时留在原流程，可检查设备后重试。非同一局域网阻止连接，教程可查看条件。</w:t>
+              <w:t>2. 占用时确认接管才发起；取消不影响原会话。连接中取消回详情，失败/超时留在原流程，可检查设备后重试。跨网络不因非同一局域网而直接阻止；实际连接失败或超时保留原失败/重试路径，不显示连接成功。</w:t>
             </w:r>
             <w:r>
               <w:rPr>
@@ -15350,7 +18043,7 @@
                 <w:b w:val="0"/>
                 <w:i w:val="0"/>
               </w:rPr>
-              <w:t>1. 主控登录不能代替目标系统授权，非同一局域网不能连接。失败、取消、离线或权限不足留在原设备流程，不显示成功桌面。</w:t>
+              <w:t>1. 主控登录不能代替目标系统授权；公网与局域网均需目标在线、网络可达及权限有效。失败、取消、离线或权限不足留在原设备流程，不显示成功桌面。</w:t>
             </w:r>
             <w:r>
               <w:rPr>
@@ -16064,7 +18757,7 @@
               <w:drawing>
                 <wp:inline xmlns:a="http://schemas.openxmlformats.org/drawingml/2006/main" xmlns:pic="http://schemas.openxmlformats.org/drawingml/2006/picture">
                   <wp:extent cx="2880360" cy="1853576"/>
-                  <wp:docPr id="25" name="Picture 25"/>
+                  <wp:docPr id="33" name="Picture 33"/>
                   <wp:cNvGraphicFramePr>
                     <a:graphicFrameLocks noChangeAspect="1"/>
                   </wp:cNvGraphicFramePr>
@@ -16076,7 +18769,7 @@
                           <pic:cNvPicPr/>
                         </pic:nvPicPr>
                         <pic:blipFill>
-                          <a:blip r:embed="rId33"/>
+                          <a:blip r:embed="rId41"/>
                           <a:stretch>
                             <a:fillRect/>
                           </a:stretch>
@@ -17104,7 +19797,7 @@
               <w:drawing>
                 <wp:inline xmlns:a="http://schemas.openxmlformats.org/drawingml/2006/main" xmlns:pic="http://schemas.openxmlformats.org/drawingml/2006/picture">
                   <wp:extent cx="2880360" cy="1853576"/>
-                  <wp:docPr id="26" name="Picture 26"/>
+                  <wp:docPr id="34" name="Picture 34"/>
                   <wp:cNvGraphicFramePr>
                     <a:graphicFrameLocks noChangeAspect="1"/>
                   </wp:cNvGraphicFramePr>
@@ -17116,7 +19809,7 @@
                           <pic:cNvPicPr/>
                         </pic:nvPicPr>
                         <pic:blipFill>
-                          <a:blip r:embed="rId34"/>
+                          <a:blip r:embed="rId42"/>
                           <a:stretch>
                             <a:fillRect/>
                           </a:stretch>
@@ -17747,7 +20440,7 @@
               <w:drawing>
                 <wp:inline xmlns:a="http://schemas.openxmlformats.org/drawingml/2006/main" xmlns:pic="http://schemas.openxmlformats.org/drawingml/2006/picture">
                   <wp:extent cx="2880360" cy="1853576"/>
-                  <wp:docPr id="27" name="Picture 27"/>
+                  <wp:docPr id="35" name="Picture 35"/>
                   <wp:cNvGraphicFramePr>
                     <a:graphicFrameLocks noChangeAspect="1"/>
                   </wp:cNvGraphicFramePr>
@@ -17759,7 +20452,7 @@
                           <pic:cNvPicPr/>
                         </pic:nvPicPr>
                         <pic:blipFill>
-                          <a:blip r:embed="rId35"/>
+                          <a:blip r:embed="rId43"/>
                           <a:stretch>
                             <a:fillRect/>
                           </a:stretch>
@@ -18390,7 +21083,7 @@
               <w:drawing>
                 <wp:inline xmlns:a="http://schemas.openxmlformats.org/drawingml/2006/main" xmlns:pic="http://schemas.openxmlformats.org/drawingml/2006/picture">
                   <wp:extent cx="2880360" cy="1853576"/>
-                  <wp:docPr id="28" name="Picture 28"/>
+                  <wp:docPr id="36" name="Picture 36"/>
                   <wp:cNvGraphicFramePr>
                     <a:graphicFrameLocks noChangeAspect="1"/>
                   </wp:cNvGraphicFramePr>
@@ -18402,7 +21095,7 @@
                           <pic:cNvPicPr/>
                         </pic:nvPicPr>
                         <pic:blipFill>
-                          <a:blip r:embed="rId36"/>
+                          <a:blip r:embed="rId44"/>
                           <a:stretch>
                             <a:fillRect/>
                           </a:stretch>
@@ -18447,7 +21140,7 @@
               <w:drawing>
                 <wp:inline xmlns:a="http://schemas.openxmlformats.org/drawingml/2006/main" xmlns:pic="http://schemas.openxmlformats.org/drawingml/2006/picture">
                   <wp:extent cx="2880360" cy="1853576"/>
-                  <wp:docPr id="29" name="Picture 29"/>
+                  <wp:docPr id="37" name="Picture 37"/>
                   <wp:cNvGraphicFramePr>
                     <a:graphicFrameLocks noChangeAspect="1"/>
                   </wp:cNvGraphicFramePr>
@@ -18459,7 +21152,7 @@
                           <pic:cNvPicPr/>
                         </pic:nvPicPr>
                         <pic:blipFill>
-                          <a:blip r:embed="rId37"/>
+                          <a:blip r:embed="rId45"/>
                           <a:stretch>
                             <a:fillRect/>
                           </a:stretch>
@@ -18504,7 +21197,7 @@
               <w:drawing>
                 <wp:inline xmlns:a="http://schemas.openxmlformats.org/drawingml/2006/main" xmlns:pic="http://schemas.openxmlformats.org/drawingml/2006/picture">
                   <wp:extent cx="2880360" cy="1853576"/>
-                  <wp:docPr id="30" name="Picture 30"/>
+                  <wp:docPr id="38" name="Picture 38"/>
                   <wp:cNvGraphicFramePr>
                     <a:graphicFrameLocks noChangeAspect="1"/>
                   </wp:cNvGraphicFramePr>
@@ -18516,7 +21209,7 @@
                           <pic:cNvPicPr/>
                         </pic:nvPicPr>
                         <pic:blipFill>
-                          <a:blip r:embed="rId38"/>
+                          <a:blip r:embed="rId46"/>
                           <a:stretch>
                             <a:fillRect/>
                           </a:stretch>
@@ -18616,7 +21309,7 @@
                 <w:b w:val="0"/>
                 <w:i w:val="0"/>
               </w:rPr>
-              <w:t>3. 账户面板显示静态头像、当前昵称和脱敏盖世账号，昵称右侧只显示退出图标，不显示退出文字；图标按钮的aria-label和title均为“退出登录”，不在面板底部重复放退出入口。头像不显示可点击反馈；当前Demo用演示头像，正式资料由盖世账号体系提供。</w:t>
+              <w:t>3. 账户面板显示静态头像、当前昵称，下方显示当前盖世UID，昵称右侧只显示退出图标，不显示退出文字；图标按钮的aria-label和title均为“退出登录”，不在面板底部重复放退出入口。头像不显示可点击反馈；当前Demo用演示头像，正式资料由盖世账号体系提供；新账号使用其默认头像/昵称，盖世侧修改后本端重新获取资料时同步，不开放本端编辑。Demo按账号派生稳定的演示UID，同账号跨端一致，不冒充服务端真实UID。</w:t>
             </w:r>
             <w:r>
               <w:rPr>
@@ -19056,7 +21749,7 @@
               <w:drawing>
                 <wp:inline xmlns:a="http://schemas.openxmlformats.org/drawingml/2006/main" xmlns:pic="http://schemas.openxmlformats.org/drawingml/2006/picture">
                   <wp:extent cx="2880360" cy="1853576"/>
-                  <wp:docPr id="31" name="Picture 31"/>
+                  <wp:docPr id="39" name="Picture 39"/>
                   <wp:cNvGraphicFramePr>
                     <a:graphicFrameLocks noChangeAspect="1"/>
                   </wp:cNvGraphicFramePr>
@@ -19068,7 +21761,7 @@
                           <pic:cNvPicPr/>
                         </pic:nvPicPr>
                         <pic:blipFill>
-                          <a:blip r:embed="rId39"/>
+                          <a:blip r:embed="rId47"/>
                           <a:stretch>
                             <a:fillRect/>
                           </a:stretch>
@@ -19810,7 +22503,7 @@
               <w:drawing>
                 <wp:inline xmlns:a="http://schemas.openxmlformats.org/drawingml/2006/main" xmlns:pic="http://schemas.openxmlformats.org/drawingml/2006/picture">
                   <wp:extent cx="2880360" cy="1853576"/>
-                  <wp:docPr id="32" name="Picture 32"/>
+                  <wp:docPr id="40" name="Picture 40"/>
                   <wp:cNvGraphicFramePr>
                     <a:graphicFrameLocks noChangeAspect="1"/>
                   </wp:cNvGraphicFramePr>
@@ -19822,7 +22515,7 @@
                           <pic:cNvPicPr/>
                         </pic:nvPicPr>
                         <pic:blipFill>
-                          <a:blip r:embed="rId40"/>
+                          <a:blip r:embed="rId48"/>
                           <a:stretch>
                             <a:fillRect/>
                           </a:stretch>
@@ -20066,7 +22759,7 @@
                 <w:b w:val="0"/>
                 <w:i w:val="0"/>
               </w:rPr>
-              <w:t>1. 不新增客服或反馈提交流程；正式文章来源与审核待确认。</w:t>
+              <w:t>1. 正式帮助内容采用静态H5，由运营提供并审核、服务端维护，客户端打开；一期不新增运营配置页、客服或反馈提交流程。</w:t>
             </w:r>
           </w:p>
         </w:tc>
@@ -20439,7 +23132,7 @@
               <w:drawing>
                 <wp:inline xmlns:a="http://schemas.openxmlformats.org/drawingml/2006/main" xmlns:pic="http://schemas.openxmlformats.org/drawingml/2006/picture">
                   <wp:extent cx="2880360" cy="1853576"/>
-                  <wp:docPr id="33" name="Picture 33"/>
+                  <wp:docPr id="41" name="Picture 41"/>
                   <wp:cNvGraphicFramePr>
                     <a:graphicFrameLocks noChangeAspect="1"/>
                   </wp:cNvGraphicFramePr>
@@ -20451,7 +23144,7 @@
                           <pic:cNvPicPr/>
                         </pic:nvPicPr>
                         <pic:blipFill>
-                          <a:blip r:embed="rId41"/>
+                          <a:blip r:embed="rId49"/>
                           <a:stretch>
                             <a:fillRect/>
                           </a:stretch>
@@ -20842,7 +23535,7 @@
                 <w:b w:val="0"/>
                 <w:i w:val="0"/>
               </w:rPr>
-              <w:t>阅读电脑客户端协议与信息清单入口。</w:t>
+              <w:t>阅读电脑客户端协议与信息清单，提供账号注销入口。</w:t>
             </w:r>
           </w:p>
         </w:tc>
@@ -21054,7 +23747,7 @@
               <w:drawing>
                 <wp:inline xmlns:a="http://schemas.openxmlformats.org/drawingml/2006/main" xmlns:pic="http://schemas.openxmlformats.org/drawingml/2006/picture">
                   <wp:extent cx="2880360" cy="1853576"/>
-                  <wp:docPr id="34" name="Picture 34"/>
+                  <wp:docPr id="42" name="Picture 42"/>
                   <wp:cNvGraphicFramePr>
                     <a:graphicFrameLocks noChangeAspect="1"/>
                   </wp:cNvGraphicFramePr>
@@ -21066,7 +23759,7 @@
                           <pic:cNvPicPr/>
                         </pic:nvPicPr>
                         <pic:blipFill>
-                          <a:blip r:embed="rId42"/>
+                          <a:blip r:embed="rId50"/>
                           <a:stretch>
                             <a:fillRect/>
                           </a:stretch>
@@ -21096,7 +23789,7 @@
                 <w:b w:val="0"/>
                 <w:i/>
               </w:rPr>
-              <w:t>图3-30：电脑端关于；仅四项协议与信息清单入口。</w:t>
+              <w:t>图3-30：电脑端关于；协议/信息清单及已登录时的注销账号入口。</w:t>
             </w:r>
             <w:r>
               <w:rPr>
@@ -21138,7 +23831,7 @@
                 <w:b w:val="0"/>
                 <w:i w:val="0"/>
               </w:rPr>
-              <w:t>1. 标题为“关于盖世远程”；内容仅显示用户协议、隐私协议、个人信息收集清单、第三方信息共享清单，不放检查更新、版本、Logo或产品介绍。</w:t>
+              <w:t>1. 标题为“关于盖世远程”；显示用户协议、隐私协议、个人信息收集清单、第三方信息共享清单；仅登录时在列表后显示“注销账号”。不放检查更新、版本、Logo或产品介绍。</w:t>
             </w:r>
             <w:r>
               <w:rPr>
@@ -21167,6 +23860,20 @@
                 <w:i w:val="0"/>
               </w:rPr>
               <w:t>1. 点击协议或清单只显示正式内容与地址待接入说明，不编造正文，也不改变登录协议同意状态。</w:t>
+            </w:r>
+            <w:r>
+              <w:rPr>
+                <w:rFonts w:ascii="Microsoft YaHei" w:hAnsi="Microsoft YaHei" w:eastAsia="Microsoft YaHei"/>
+              </w:rPr>
+              <w:br/>
+            </w:r>
+            <w:r>
+              <w:rPr>
+                <w:rFonts w:ascii="Microsoft YaHei" w:hAnsi="Microsoft YaHei" w:eastAsia="Microsoft YaHei"/>
+                <w:b w:val="0"/>
+                <w:i w:val="0"/>
+              </w:rPr>
+              <w:t>2. 点击注销账号，正式版本打开盖世账号注销H5流程；当前无正式地址时在现有说明区域显示“注销账号页面待接入，正式版本将打开盖世账号注销流程。”，不跳虚构网址、不退出账号或模拟注销成功。</w:t>
             </w:r>
           </w:p>
         </w:tc>
@@ -21231,7 +23938,7 @@
                 <w:b w:val="0"/>
                 <w:i w:val="0"/>
               </w:rPr>
-              <w:t>显示四项条款/清单入口及对应待接入说明。</w:t>
+              <w:t>显示四项条款/清单及登录态下的注销入口；未接入时显示相应说明，不改变账号状态。</w:t>
             </w:r>
           </w:p>
         </w:tc>
@@ -21297,6 +24004,20 @@
                 <w:i w:val="0"/>
               </w:rPr>
               <w:t>1. 中国移动认证服务协议继续在国内适用登录流程展示；未提供的正式正文不由Demo代写。</w:t>
+            </w:r>
+            <w:r>
+              <w:rPr>
+                <w:rFonts w:ascii="Microsoft YaHei" w:hAnsi="Microsoft YaHei" w:eastAsia="Microsoft YaHei"/>
+              </w:rPr>
+              <w:br/>
+            </w:r>
+            <w:r>
+              <w:rPr>
+                <w:rFonts w:ascii="Microsoft YaHei" w:hAnsi="Microsoft YaHei" w:eastAsia="Microsoft YaHei"/>
+                <w:b w:val="0"/>
+                <w:i w:val="0"/>
+              </w:rPr>
+              <w:t>2. 注销复用账号体系的既有H5，资格、确认步骤、生效及回传由该流程提供，不另拟规则；真实地址及结果衔接未接入前不宣称可完成注销。</w:t>
             </w:r>
           </w:p>
         </w:tc>
@@ -21359,7 +24080,7 @@
           <w:b w:val="0"/>
           <w:i w:val="0"/>
         </w:rPr>
-        <w:t>本轮我的/帮助搜索/版本/关于为页面与入口调整，不新增统计目标或埋点；扫码继续归入电脑端登录尝试，不将手机扫描或确认记作登录成功。以下三项为既有独立登录改造的新增事件；每项包含登录业务参数及产品归属。账号、事件ID、客户端版本、环境等SDK公参复用原字典，接入前核对映射。</w:t>
+        <w:t>本轮我的/帮助搜索/版本/关于为页面与入口调整，不新增统计目标或埋点；扫码继续归入电脑端登录尝试，不将手机扫描或确认记作登录成功。埋点先保留当前事件设计；接入新自有平台或Firebase的选择、接口和迁移口径待数据团队确认，不同时重复计数。按键布局打开/应用沿用原工具操作事件的语义；编辑、发布、布局码导入的正式事件映射及服务结果口径需数据接入确认，不用点击Demo按钮推断云发布成功。以下三项为既有独立登录改造的新增事件；每项包含登录业务参数及产品归属。账号、事件ID、客户端版本、环境等SDK公参复用原字典，接入前核对映射。</w:t>
       </w:r>
     </w:p>
     <w:p>
@@ -22259,7 +24980,7 @@
           <w:b w:val="0"/>
           <w:i w:val="0"/>
         </w:rPr>
-        <w:t>。独立版使用新的产品归属区分历史数据，不重写历史事件含义。</w:t>
+        <w:t>。独立版使用新的产品归属区分历史数据，不重写历史事件含义。 本轮公网纳入一期后，连接事件不再继承旧稿“仅上报network_scope=lan”或“非LAN即not_same_lan拦截”的规则；网络范围按真实连接来源记录，公网取值及历史兼容映射由数据团队确认，未确认前不得伪报lan或连接成功。该变更不放宽Windows远程唤醒原有的目标系统、网络及辅助设备条件。</w:t>
       </w:r>
     </w:p>
     <w:p>
@@ -23318,7 +26039,7 @@
           <w:b w:val="0"/>
           <w:i w:val="0"/>
         </w:rPr>
-        <w:t>两端以同一服务端 UID 识别账号，独立产品各自建立会话。扫码及跨 App 登录必须绑定本次发起端；取消、过期或刷新后旧授权不可继续使用。跨 App 返回需要恢复发起端页面；会话未核实前不读取设备。账号服务异常时保留仍可用的本地区登录方式，具体 SDK、授权回调和会话撤销方案由账号团队与客户端核对。</w:t>
+        <w:t>两端以同一服务端UID识别盖世共用账号，独立产品各自建立会话；首次登录即注册，生成的账号可在盖世游戏使用。头像昵称及UID从同一账号体系获取，本端只展示。扫码及跨 App 登录必须绑定本次发起端；取消、过期或刷新后旧授权不可继续使用。跨 App 返回需要恢复发起端页面；会话未核实前不读取设备。账号服务异常时保留仍可用的本地区登录方式，具体 SDK、授权回调和会话撤销方案由账号团队与客户端核对。</w:t>
       </w:r>
     </w:p>
     <w:p>
@@ -23342,7 +26063,7 @@
           <w:b w:val="0"/>
           <w:i w:val="0"/>
         </w:rPr>
-        <w:t>未改远控区域的精确参数及旧交互以V3.10 §3.1.3～3.1.7a、§3.1.10～3.1.16及对应当前模块为基线；本稿已替换其嵌入式入口及登录前置，不继承游戏库/商店外壳，也不将模拟内容视为真实服务。</w:t>
+        <w:t>未改远控区域的精确参数及旧交互以V3.10 §3.1.3～3.1.7a、§3.1.10～3.1.16及对应当前模块为基线，虚拟按键方案以本稿3.1.12～3.1.13替代旧不可编辑或仅切换规则；本稿已替换其嵌入式入口、登录前置和仅局域网范围，不继承游戏库/商店外壳，也不将模拟内容视为真实服务。</w:t>
       </w:r>
     </w:p>
     <w:p>
@@ -23530,7 +26251,7 @@
                 <w:b w:val="0"/>
                 <w:i w:val="0"/>
               </w:rPr>
-              <w:t>Demo语言</w:t>
+              <w:t>正式语言与官网包</w:t>
             </w:r>
           </w:p>
         </w:tc>
@@ -23560,7 +26281,7 @@
                 <w:b w:val="0"/>
                 <w:i w:val="0"/>
               </w:rPr>
-              <w:t>双端Demo顶部外部评审区常驻“中文”“English”按钮，点击即时切换当前界面文案并记忆选择，刷新或再次打开沿用已选语言。语言与国内/海外地区独立：国内继续手机号渠道，海外继续邮箱/Google，扫码及盖世授权规则不变；切换语言不改输入、协议勾选、账号登录态、当前页面、请求/验证码/二维码和进行中任务，不重新发起或作废请求。按钮不是正式产品地区入口，不新增设置页。本文界面文案以中文为例，英文提供对应含义；用户输入、手机号、邮箱、验证码及业务标识不随语言改写。</w:t>
+              <w:t>一期提供中文、英文，语言随官网下载的对应安装包确定，正式客户端不设语言切换。官网露出盖世远程Android、iOS、Windows、Mac下载入口并关联对应语言包；实际可下载平台、版本、架构和包地址待确认，不放虚构下载地址。</w:t>
             </w:r>
           </w:p>
         </w:tc>
@@ -23595,6 +26316,71 @@
                 <w:b w:val="0"/>
                 <w:i w:val="0"/>
               </w:rPr>
+              <w:t>Demo语言</w:t>
+            </w:r>
+          </w:p>
+        </w:tc>
+        <w:tc>
+          <w:tcPr>
+            <w:tcW w:type="dxa" w:w="5184"/>
+            <w:vAlign w:val="top"/>
+            <w:tcMar>
+              <w:top w:w="80" w:type="dxa"/>
+              <w:start w:w="100" w:type="dxa"/>
+              <w:bottom w:w="80" w:type="dxa"/>
+              <w:end w:w="100" w:type="dxa"/>
+            </w:tcMar>
+          </w:tcPr>
+          <w:p>
+            <w:pPr>
+              <w:spacing w:after="40"/>
+            </w:pPr>
+            <w:r>
+              <w:rPr>
+                <w:rFonts w:ascii="Microsoft YaHei" w:hAnsi="Microsoft YaHei" w:eastAsia="Microsoft YaHei"/>
+              </w:rPr>
+            </w:r>
+            <w:r>
+              <w:rPr>
+                <w:rFonts w:ascii="Microsoft YaHei" w:hAnsi="Microsoft YaHei" w:eastAsia="Microsoft YaHei"/>
+                <w:b w:val="0"/>
+                <w:i w:val="0"/>
+              </w:rPr>
+              <w:t>双端Demo顶部外部评审区常驻“中文”“English”按钮，点击即时切换当前界面文案并记忆选择，刷新或再次打开沿用已选语言。语言与国内/海外地区独立：国内继续手机号渠道，海外继续邮箱/Google，扫码及盖世授权规则不变；切换语言不改输入、协议勾选、账号登录态、当前页面、请求/验证码/二维码和进行中任务，不重新发起或作废请求。按钮不是正式产品地区入口，不新增设置页。本文界面文案以中文为例，英文提供对应含义；用户输入、手机号、邮箱、验证码及业务标识不随语言改写。</w:t>
+            </w:r>
+          </w:p>
+        </w:tc>
+      </w:tr>
+      <w:tr>
+        <w:trPr>
+          <w:cantSplit/>
+        </w:trPr>
+        <w:tc>
+          <w:tcPr>
+            <w:tcW w:type="dxa" w:w="5184"/>
+            <w:vAlign w:val="top"/>
+            <w:tcMar>
+              <w:top w:w="80" w:type="dxa"/>
+              <w:start w:w="100" w:type="dxa"/>
+              <w:bottom w:w="80" w:type="dxa"/>
+              <w:end w:w="100" w:type="dxa"/>
+            </w:tcMar>
+          </w:tcPr>
+          <w:p>
+            <w:pPr>
+              <w:spacing w:after="40"/>
+            </w:pPr>
+            <w:r>
+              <w:rPr>
+                <w:rFonts w:ascii="Microsoft YaHei" w:hAnsi="Microsoft YaHei" w:eastAsia="Microsoft YaHei"/>
+              </w:rPr>
+            </w:r>
+            <w:r>
+              <w:rPr>
+                <w:rFonts w:ascii="Microsoft YaHei" w:hAnsi="Microsoft YaHei" w:eastAsia="Microsoft YaHei"/>
+                <w:b w:val="0"/>
+                <w:i w:val="0"/>
+              </w:rPr>
               <w:t>正式配置</w:t>
             </w:r>
           </w:p>
@@ -23625,7 +26411,202 @@
                 <w:b w:val="0"/>
                 <w:i w:val="0"/>
               </w:rPr>
-              <w:t>独立产品协议主体、版本、正式地址及中国移动实际认证方式仍待账号团队核对。未提供正文时Demo仅显示待接入预览，不新增运营商一键登录能力。</w:t>
+              <w:t>帮助与协议采用静态H5，运营提供内容、服务端维护，客户端提供入口；一期不建文章/协议后台配置页。协议按盖世远程实际功能、采集信息及已接入SDK整理并经法务审核，不直接改产品名后沿用无关条款；主体、版本、正式地址及中国移动实际认证方式待核对。未提供正文时Demo仅显示待接入预览，不新增运营商一键登录能力。</w:t>
+            </w:r>
+          </w:p>
+        </w:tc>
+      </w:tr>
+      <w:tr>
+        <w:trPr>
+          <w:cantSplit/>
+        </w:trPr>
+        <w:tc>
+          <w:tcPr>
+            <w:tcW w:type="dxa" w:w="5184"/>
+            <w:vAlign w:val="top"/>
+            <w:tcMar>
+              <w:top w:w="80" w:type="dxa"/>
+              <w:start w:w="100" w:type="dxa"/>
+              <w:bottom w:w="80" w:type="dxa"/>
+              <w:end w:w="100" w:type="dxa"/>
+            </w:tcMar>
+          </w:tcPr>
+          <w:p>
+            <w:pPr>
+              <w:spacing w:after="40"/>
+            </w:pPr>
+            <w:r>
+              <w:rPr>
+                <w:rFonts w:ascii="Microsoft YaHei" w:hAnsi="Microsoft YaHei" w:eastAsia="Microsoft YaHei"/>
+              </w:rPr>
+            </w:r>
+            <w:r>
+              <w:rPr>
+                <w:rFonts w:ascii="Microsoft YaHei" w:hAnsi="Microsoft YaHei" w:eastAsia="Microsoft YaHei"/>
+                <w:b w:val="0"/>
+                <w:i w:val="0"/>
+              </w:rPr>
+              <w:t>更新与渠道</w:t>
+            </w:r>
+          </w:p>
+        </w:tc>
+        <w:tc>
+          <w:tcPr>
+            <w:tcW w:type="dxa" w:w="5184"/>
+            <w:vAlign w:val="top"/>
+            <w:tcMar>
+              <w:top w:w="80" w:type="dxa"/>
+              <w:start w:w="100" w:type="dxa"/>
+              <w:bottom w:w="80" w:type="dxa"/>
+              <w:end w:w="100" w:type="dxa"/>
+            </w:tcMar>
+          </w:tcPr>
+          <w:p>
+            <w:pPr>
+              <w:spacing w:after="40"/>
+            </w:pPr>
+            <w:r>
+              <w:rPr>
+                <w:rFonts w:ascii="Microsoft YaHei" w:hAnsi="Microsoft YaHei" w:eastAsia="Microsoft YaHei"/>
+              </w:rPr>
+            </w:r>
+            <w:r>
+              <w:rPr>
+                <w:rFonts w:ascii="Microsoft YaHei" w:hAnsi="Microsoft YaHei" w:eastAsia="Microsoft YaHei"/>
+                <w:b w:val="0"/>
+                <w:i w:val="0"/>
+              </w:rPr>
+              <w:t>安装包保留渠道标识，检查更新沿用盖世的官网/应用商店分渠道规则；独立产品更新源与盖世游戏配置分开，后台账号权限可复用。正式版本、下载地址、商店跳转及失败恢复按适用渠道接入，Demo仅模拟检测和下载结果。</w:t>
+            </w:r>
+          </w:p>
+        </w:tc>
+      </w:tr>
+      <w:tr>
+        <w:trPr>
+          <w:cantSplit/>
+        </w:trPr>
+        <w:tc>
+          <w:tcPr>
+            <w:tcW w:type="dxa" w:w="5184"/>
+            <w:vAlign w:val="top"/>
+            <w:tcMar>
+              <w:top w:w="80" w:type="dxa"/>
+              <w:start w:w="100" w:type="dxa"/>
+              <w:bottom w:w="80" w:type="dxa"/>
+              <w:end w:w="100" w:type="dxa"/>
+            </w:tcMar>
+          </w:tcPr>
+          <w:p>
+            <w:pPr>
+              <w:spacing w:after="40"/>
+            </w:pPr>
+            <w:r>
+              <w:rPr>
+                <w:rFonts w:ascii="Microsoft YaHei" w:hAnsi="Microsoft YaHei" w:eastAsia="Microsoft YaHei"/>
+              </w:rPr>
+            </w:r>
+            <w:r>
+              <w:rPr>
+                <w:rFonts w:ascii="Microsoft YaHei" w:hAnsi="Microsoft YaHei" w:eastAsia="Microsoft YaHei"/>
+                <w:b w:val="0"/>
+                <w:i w:val="0"/>
+              </w:rPr>
+              <w:t>公网接入</w:t>
+            </w:r>
+          </w:p>
+        </w:tc>
+        <w:tc>
+          <w:tcPr>
+            <w:tcW w:type="dxa" w:w="5184"/>
+            <w:vAlign w:val="top"/>
+            <w:tcMar>
+              <w:top w:w="80" w:type="dxa"/>
+              <w:start w:w="100" w:type="dxa"/>
+              <w:bottom w:w="80" w:type="dxa"/>
+              <w:end w:w="100" w:type="dxa"/>
+            </w:tcMar>
+          </w:tcPr>
+          <w:p>
+            <w:pPr>
+              <w:spacing w:after="40"/>
+            </w:pPr>
+            <w:r>
+              <w:rPr>
+                <w:rFonts w:ascii="Microsoft YaHei" w:hAnsi="Microsoft YaHei" w:eastAsia="Microsoft YaHei"/>
+              </w:rPr>
+            </w:r>
+            <w:r>
+              <w:rPr>
+                <w:rFonts w:ascii="Microsoft YaHei" w:hAnsi="Microsoft YaHei" w:eastAsia="Microsoft YaHei"/>
+                <w:b w:val="0"/>
+                <w:i w:val="0"/>
+              </w:rPr>
+              <w:t>一期支持公网与局域网；打洞/转发策略、自研或供应商、成本及容量须进一步评估。收费、免费画质、时长与用户限量尚未定案，界面不新增套餐、限额或免费承诺。实际网络不可达、服务失败或超时不标连接成功。</w:t>
+            </w:r>
+          </w:p>
+        </w:tc>
+      </w:tr>
+      <w:tr>
+        <w:trPr>
+          <w:cantSplit/>
+        </w:trPr>
+        <w:tc>
+          <w:tcPr>
+            <w:tcW w:type="dxa" w:w="5184"/>
+            <w:vAlign w:val="top"/>
+            <w:tcMar>
+              <w:top w:w="80" w:type="dxa"/>
+              <w:start w:w="100" w:type="dxa"/>
+              <w:bottom w:w="80" w:type="dxa"/>
+              <w:end w:w="100" w:type="dxa"/>
+            </w:tcMar>
+          </w:tcPr>
+          <w:p>
+            <w:pPr>
+              <w:spacing w:after="40"/>
+            </w:pPr>
+            <w:r>
+              <w:rPr>
+                <w:rFonts w:ascii="Microsoft YaHei" w:hAnsi="Microsoft YaHei" w:eastAsia="Microsoft YaHei"/>
+              </w:rPr>
+            </w:r>
+            <w:r>
+              <w:rPr>
+                <w:rFonts w:ascii="Microsoft YaHei" w:hAnsi="Microsoft YaHei" w:eastAsia="Microsoft YaHei"/>
+                <w:b w:val="0"/>
+                <w:i w:val="0"/>
+              </w:rPr>
+              <w:t>应用交付</w:t>
+            </w:r>
+          </w:p>
+        </w:tc>
+        <w:tc>
+          <w:tcPr>
+            <w:tcW w:type="dxa" w:w="5184"/>
+            <w:vAlign w:val="top"/>
+            <w:tcMar>
+              <w:top w:w="80" w:type="dxa"/>
+              <w:start w:w="100" w:type="dxa"/>
+              <w:bottom w:w="80" w:type="dxa"/>
+              <w:end w:w="100" w:type="dxa"/>
+            </w:tcMar>
+          </w:tcPr>
+          <w:p>
+            <w:pPr>
+              <w:spacing w:after="40"/>
+            </w:pPr>
+            <w:r>
+              <w:rPr>
+                <w:rFonts w:ascii="Microsoft YaHei" w:hAnsi="Microsoft YaHei" w:eastAsia="Microsoft YaHei"/>
+              </w:rPr>
+            </w:r>
+            <w:r>
+              <w:rPr>
+                <w:rFonts w:ascii="Microsoft YaHei" w:hAnsi="Microsoft YaHei" w:eastAsia="Microsoft YaHei"/>
+                <w:b w:val="0"/>
+                <w:i w:val="0"/>
+              </w:rPr>
+              <w:t>独立应用需准备软著、ICP、签名、商店应用及实际功能匹配的协议/采集和共享清单；正式资料经相应审核后接入。先准备本地最小可运行包用于软著材料，不改变一期包含公网的产品范围，不将会议口头日期写成发版承诺。</w:t>
             </w:r>
           </w:p>
         </w:tc>
@@ -23885,7 +26866,7 @@
                 <w:b w:val="0"/>
                 <w:i w:val="0"/>
               </w:rPr>
-              <w:t>独立入口的埋点枚举</w:t>
+              <w:t>独立入口埋点与上报平台</w:t>
             </w:r>
           </w:p>
         </w:tc>
@@ -23915,7 +26896,7 @@
                 <w:b w:val="0"/>
                 <w:i w:val="0"/>
               </w:rPr>
-              <w:t>新增独立产品归属；原 entry 的独立移动/电脑入口值及兼容映射由数据团队核对。</w:t>
+              <w:t>新增独立产品归属；原entry的独立移动/电脑入口值、公网network_scope枚举及历史兼容映射、新平台或Firebase承接、接口切换由数据团队核对。</w:t>
             </w:r>
           </w:p>
         </w:tc>
@@ -23945,7 +26926,7 @@
                 <w:b w:val="0"/>
                 <w:i w:val="0"/>
               </w:rPr>
-              <w:t>入口转化和历史报表。</w:t>
+              <w:t>入口转化、网络归因和历史报表。</w:t>
             </w:r>
           </w:p>
         </w:tc>
@@ -23975,7 +26956,7 @@
                 <w:b w:val="0"/>
                 <w:i w:val="0"/>
               </w:rPr>
-              <w:t>阻塞入口埋点联调，不阻塞页面。</w:t>
+              <w:t>阻塞入口及公网埋点联调，不阻塞页面。</w:t>
             </w:r>
           </w:p>
         </w:tc>
@@ -24165,7 +27146,7 @@
                 <w:b w:val="0"/>
                 <w:i w:val="0"/>
               </w:rPr>
-              <w:t>国内手机号、海外邮箱/Google、盖世授权已确认；核对SDK支持、正式输入长度和发行地区来源。</w:t>
+              <w:t>国内手机号、海外邮箱/Google、盖世授权及正式中英文语言包已确认；Windows/Mac先覆盖主流系统与架构，精确支持表、移动平台包、SDK、正式输入长度和地区配置待确认。</w:t>
             </w:r>
           </w:p>
         </w:tc>
@@ -24415,7 +27396,7 @@
                 <w:b w:val="0"/>
                 <w:i w:val="0"/>
               </w:rPr>
-              <w:t>账号身份复用，按独立产品签发会话；核对盖世远程/盖世游戏App的可扫码范围、码协议、地区限制、回跳、取消、失效及旧码失效。</w:t>
+              <w:t>账号身份复用，按独立产品签发会话；盖世远程与盖世游戏App均须支持扫码；待核对码协议、最低兼容版本、旧版更新地址、地区限制、回跳、取消、失效及旧码失效。</w:t>
             </w:r>
           </w:p>
         </w:tc>
@@ -24760,7 +27741,7 @@
                 <w:b w:val="0"/>
                 <w:i w:val="0"/>
               </w:rPr>
-              <w:t>独立产品是否继续仅局域网</w:t>
+              <w:t>公网连接方案与资源规则</w:t>
             </w:r>
           </w:p>
         </w:tc>
@@ -24790,7 +27771,7 @@
                 <w:b w:val="0"/>
                 <w:i w:val="0"/>
               </w:rPr>
-              <w:t>本稿暂保留一期 LAN 规则；公网需要单独确认能力与范围。</w:t>
+              <w:t>公网已纳入一期；打洞/转发策略、自研或供应商、成本与容量需调研验证，收费、画质、时长及限量另行确认。</w:t>
             </w:r>
           </w:p>
         </w:tc>
@@ -24820,7 +27801,7 @@
                 <w:b w:val="0"/>
                 <w:i w:val="0"/>
               </w:rPr>
-              <w:t>连接条件、教程、失败文案和埋点。</w:t>
+              <w:t>连接失败恢复、容量、体验及商业化。</w:t>
             </w:r>
           </w:p>
         </w:tc>
@@ -24850,7 +27831,7 @@
                 <w:b w:val="0"/>
                 <w:i w:val="0"/>
               </w:rPr>
-              <w:t>阻塞公网承诺；本轮不开放公网。</w:t>
+              <w:t>阻塞真实公网服务与资源规则验收，不影响已确认的一期公网范围；Demo不证明服务已接通。</w:t>
             </w:r>
           </w:p>
         </w:tc>
@@ -24915,7 +27896,7 @@
                 <w:b w:val="0"/>
                 <w:i w:val="0"/>
               </w:rPr>
-              <w:t>当前Demo仅内置文章，更新结果由外部评审工具模拟有更新/已最新；下载并重启按钮仅演示，不接真实更新服务。正式文章由运营审核，版本以安装包为准，更新源、下载失败恢复及重启安装流程待客户端核对。</w:t>
+              <w:t>当前Demo仅内置文章，更新结果由外部评审工具模拟有更新/已最新；下载并重启按钮仅演示，不接真实更新服务。正式文章采用运营审核的静态H5；版本以安装包为准，独立更新源与官网/应用商店渠道、下载失败恢复及重启安装流程待接入。</w:t>
             </w:r>
           </w:p>
         </w:tc>
@@ -24976,6 +27957,256 @@
                 <w:i w:val="0"/>
               </w:rPr>
               <w:t>阻塞正式内容及真实更新服务/下载重启验收，不阻塞Demo交互评审。</w:t>
+            </w:r>
+          </w:p>
+        </w:tc>
+      </w:tr>
+      <w:tr>
+        <w:trPr>
+          <w:cantSplit/>
+        </w:trPr>
+        <w:tc>
+          <w:tcPr>
+            <w:tcW w:type="dxa" w:w="2592"/>
+            <w:vAlign w:val="top"/>
+            <w:tcMar>
+              <w:top w:w="80" w:type="dxa"/>
+              <w:start w:w="100" w:type="dxa"/>
+              <w:bottom w:w="80" w:type="dxa"/>
+              <w:end w:w="100" w:type="dxa"/>
+            </w:tcMar>
+          </w:tcPr>
+          <w:p>
+            <w:pPr>
+              <w:spacing w:after="40"/>
+            </w:pPr>
+            <w:r>
+              <w:rPr>
+                <w:rFonts w:ascii="Microsoft YaHei" w:hAnsi="Microsoft YaHei" w:eastAsia="Microsoft YaHei"/>
+              </w:rPr>
+            </w:r>
+            <w:r>
+              <w:rPr>
+                <w:rFonts w:ascii="Microsoft YaHei" w:hAnsi="Microsoft YaHei" w:eastAsia="Microsoft YaHei"/>
+                <w:b w:val="0"/>
+                <w:i w:val="0"/>
+              </w:rPr>
+              <w:t>按键云分享服务与数据口径</w:t>
+            </w:r>
+          </w:p>
+        </w:tc>
+        <w:tc>
+          <w:tcPr>
+            <w:tcW w:type="dxa" w:w="2592"/>
+            <w:vAlign w:val="top"/>
+            <w:tcMar>
+              <w:top w:w="80" w:type="dxa"/>
+              <w:start w:w="100" w:type="dxa"/>
+              <w:bottom w:w="80" w:type="dxa"/>
+              <w:end w:w="100" w:type="dxa"/>
+            </w:tcMar>
+          </w:tcPr>
+          <w:p>
+            <w:pPr>
+              <w:spacing w:after="40"/>
+            </w:pPr>
+            <w:r>
+              <w:rPr>
+                <w:rFonts w:ascii="Microsoft YaHei" w:hAnsi="Microsoft YaHei" w:eastAsia="Microsoft YaHei"/>
+              </w:rPr>
+            </w:r>
+            <w:r>
+              <w:rPr>
+                <w:rFonts w:ascii="Microsoft YaHei" w:hAnsi="Microsoft YaHei" w:eastAsia="Microsoft YaHei"/>
+                <w:b w:val="0"/>
+                <w:i w:val="0"/>
+              </w:rPr>
+              <w:t>已确认可编辑、应用、复制、发布及码导入；推荐下发、真实云存储、布局码校验、账号归属和编辑/分享/导入埋点映射需联调。</w:t>
+            </w:r>
+          </w:p>
+        </w:tc>
+        <w:tc>
+          <w:tcPr>
+            <w:tcW w:type="dxa" w:w="2592"/>
+            <w:vAlign w:val="top"/>
+            <w:tcMar>
+              <w:top w:w="80" w:type="dxa"/>
+              <w:start w:w="100" w:type="dxa"/>
+              <w:bottom w:w="80" w:type="dxa"/>
+              <w:end w:w="100" w:type="dxa"/>
+            </w:tcMar>
+          </w:tcPr>
+          <w:p>
+            <w:pPr>
+              <w:spacing w:after="40"/>
+            </w:pPr>
+            <w:r>
+              <w:rPr>
+                <w:rFonts w:ascii="Microsoft YaHei" w:hAnsi="Microsoft YaHei" w:eastAsia="Microsoft YaHei"/>
+              </w:rPr>
+            </w:r>
+            <w:r>
+              <w:rPr>
+                <w:rFonts w:ascii="Microsoft YaHei" w:hAnsi="Microsoft YaHei" w:eastAsia="Microsoft YaHei"/>
+                <w:b w:val="0"/>
+                <w:i w:val="0"/>
+              </w:rPr>
+              <w:t>推荐数据、跨设备共享、更新原码及失败恢复。</w:t>
+            </w:r>
+          </w:p>
+        </w:tc>
+        <w:tc>
+          <w:tcPr>
+            <w:tcW w:type="dxa" w:w="2592"/>
+            <w:vAlign w:val="top"/>
+            <w:tcMar>
+              <w:top w:w="80" w:type="dxa"/>
+              <w:start w:w="100" w:type="dxa"/>
+              <w:bottom w:w="80" w:type="dxa"/>
+              <w:end w:w="100" w:type="dxa"/>
+            </w:tcMar>
+          </w:tcPr>
+          <w:p>
+            <w:pPr>
+              <w:spacing w:after="40"/>
+            </w:pPr>
+            <w:r>
+              <w:rPr>
+                <w:rFonts w:ascii="Microsoft YaHei" w:hAnsi="Microsoft YaHei" w:eastAsia="Microsoft YaHei"/>
+              </w:rPr>
+            </w:r>
+            <w:r>
+              <w:rPr>
+                <w:rFonts w:ascii="Microsoft YaHei" w:hAnsi="Microsoft YaHei" w:eastAsia="Microsoft YaHei"/>
+                <w:b w:val="0"/>
+                <w:i w:val="0"/>
+              </w:rPr>
+              <w:t>阻塞真实云分享和数据上报验收；本地共享目录仅供交互评审。</w:t>
+            </w:r>
+          </w:p>
+        </w:tc>
+      </w:tr>
+      <w:tr>
+        <w:trPr>
+          <w:cantSplit/>
+        </w:trPr>
+        <w:tc>
+          <w:tcPr>
+            <w:tcW w:type="dxa" w:w="2592"/>
+            <w:vAlign w:val="top"/>
+            <w:tcMar>
+              <w:top w:w="80" w:type="dxa"/>
+              <w:start w:w="100" w:type="dxa"/>
+              <w:bottom w:w="80" w:type="dxa"/>
+              <w:end w:w="100" w:type="dxa"/>
+            </w:tcMar>
+          </w:tcPr>
+          <w:p>
+            <w:pPr>
+              <w:spacing w:after="40"/>
+            </w:pPr>
+            <w:r>
+              <w:rPr>
+                <w:rFonts w:ascii="Microsoft YaHei" w:hAnsi="Microsoft YaHei" w:eastAsia="Microsoft YaHei"/>
+              </w:rPr>
+            </w:r>
+            <w:r>
+              <w:rPr>
+                <w:rFonts w:ascii="Microsoft YaHei" w:hAnsi="Microsoft YaHei" w:eastAsia="Microsoft YaHei"/>
+                <w:b w:val="0"/>
+                <w:i w:val="0"/>
+              </w:rPr>
+              <w:t>注销H5地址与结果衔接</w:t>
+            </w:r>
+          </w:p>
+        </w:tc>
+        <w:tc>
+          <w:tcPr>
+            <w:tcW w:type="dxa" w:w="2592"/>
+            <w:vAlign w:val="top"/>
+            <w:tcMar>
+              <w:top w:w="80" w:type="dxa"/>
+              <w:start w:w="100" w:type="dxa"/>
+              <w:bottom w:w="80" w:type="dxa"/>
+              <w:end w:w="100" w:type="dxa"/>
+            </w:tcMar>
+          </w:tcPr>
+          <w:p>
+            <w:pPr>
+              <w:spacing w:after="40"/>
+            </w:pPr>
+            <w:r>
+              <w:rPr>
+                <w:rFonts w:ascii="Microsoft YaHei" w:hAnsi="Microsoft YaHei" w:eastAsia="Microsoft YaHei"/>
+              </w:rPr>
+            </w:r>
+            <w:r>
+              <w:rPr>
+                <w:rFonts w:ascii="Microsoft YaHei" w:hAnsi="Microsoft YaHei" w:eastAsia="Microsoft YaHei"/>
+                <w:b w:val="0"/>
+                <w:i w:val="0"/>
+              </w:rPr>
+              <w:t>双端关于中的注销入口已确定；复用盖世账号注销H5，真实URL、登录校验、取消返回和成功回传后本端处理需账号服务核对。</w:t>
+            </w:r>
+          </w:p>
+        </w:tc>
+        <w:tc>
+          <w:tcPr>
+            <w:tcW w:type="dxa" w:w="2592"/>
+            <w:vAlign w:val="top"/>
+            <w:tcMar>
+              <w:top w:w="80" w:type="dxa"/>
+              <w:start w:w="100" w:type="dxa"/>
+              <w:bottom w:w="80" w:type="dxa"/>
+              <w:end w:w="100" w:type="dxa"/>
+            </w:tcMar>
+          </w:tcPr>
+          <w:p>
+            <w:pPr>
+              <w:spacing w:after="40"/>
+            </w:pPr>
+            <w:r>
+              <w:rPr>
+                <w:rFonts w:ascii="Microsoft YaHei" w:hAnsi="Microsoft YaHei" w:eastAsia="Microsoft YaHei"/>
+              </w:rPr>
+            </w:r>
+            <w:r>
+              <w:rPr>
+                <w:rFonts w:ascii="Microsoft YaHei" w:hAnsi="Microsoft YaHei" w:eastAsia="Microsoft YaHei"/>
+                <w:b w:val="0"/>
+                <w:i w:val="0"/>
+              </w:rPr>
+              <w:t>注销页面打开、共享账号状态及任务清理。</w:t>
+            </w:r>
+          </w:p>
+        </w:tc>
+        <w:tc>
+          <w:tcPr>
+            <w:tcW w:type="dxa" w:w="2592"/>
+            <w:vAlign w:val="top"/>
+            <w:tcMar>
+              <w:top w:w="80" w:type="dxa"/>
+              <w:start w:w="100" w:type="dxa"/>
+              <w:bottom w:w="80" w:type="dxa"/>
+              <w:end w:w="100" w:type="dxa"/>
+            </w:tcMar>
+          </w:tcPr>
+          <w:p>
+            <w:pPr>
+              <w:spacing w:after="40"/>
+            </w:pPr>
+            <w:r>
+              <w:rPr>
+                <w:rFonts w:ascii="Microsoft YaHei" w:hAnsi="Microsoft YaHei" w:eastAsia="Microsoft YaHei"/>
+              </w:rPr>
+            </w:r>
+            <w:r>
+              <w:rPr>
+                <w:rFonts w:ascii="Microsoft YaHei" w:hAnsi="Microsoft YaHei" w:eastAsia="Microsoft YaHei"/>
+                <w:b w:val="0"/>
+                <w:i w:val="0"/>
+              </w:rPr>
+              <w:t>阻塞真实注销联调，不阻塞待接入入口展示；不以点击入口判注销成功。</w:t>
             </w:r>
           </w:p>
         </w:tc>
@@ -25275,7 +28506,7 @@
                 <w:b w:val="0"/>
                 <w:i w:val="0"/>
               </w:rPr>
-              <w:t>盖世串流一期PRD V3.10</w:t>
+              <w:t>既有按键云分享Demo</w:t>
             </w:r>
           </w:p>
         </w:tc>
@@ -25305,7 +28536,7 @@
                 <w:b w:val="0"/>
                 <w:i w:val="0"/>
               </w:rPr>
-              <w:t>盖世串流一期PRD.md</w:t>
+              <w:t>demos/虚拟按键与布局/按键云分享-gemini-demo.html；同名txt</w:t>
             </w:r>
           </w:p>
         </w:tc>
@@ -25335,7 +28566,7 @@
                 <w:b w:val="0"/>
                 <w:i w:val="0"/>
               </w:rPr>
-              <w:t>旧远控交互及数据字典；嵌入式入口和登录已替换。</w:t>
+              <w:t>布局库、拖动编辑、发布与布局码导入参考；当前独立版按本稿收敛，不自动继承旧稿全部功能。</w:t>
             </w:r>
           </w:p>
         </w:tc>
@@ -25370,6 +28601,196 @@
                 <w:b w:val="0"/>
                 <w:i w:val="0"/>
               </w:rPr>
+              <w:t>2026/10/28 二次评审</w:t>
+            </w:r>
+          </w:p>
+        </w:tc>
+        <w:tc>
+          <w:tcPr>
+            <w:tcW w:type="dxa" w:w="3456"/>
+            <w:vAlign w:val="top"/>
+            <w:tcMar>
+              <w:top w:w="80" w:type="dxa"/>
+              <w:start w:w="100" w:type="dxa"/>
+              <w:bottom w:w="80" w:type="dxa"/>
+              <w:end w:w="100" w:type="dxa"/>
+            </w:tcMar>
+          </w:tcPr>
+          <w:p>
+            <w:pPr>
+              <w:spacing w:after="40"/>
+            </w:pPr>
+            <w:r>
+              <w:rPr>
+                <w:rFonts w:ascii="Microsoft YaHei" w:hAnsi="Microsoft YaHei" w:eastAsia="Microsoft YaHei"/>
+              </w:rPr>
+            </w:r>
+            <w:r>
+              <w:rPr>
+                <w:rFonts w:ascii="Microsoft YaHei" w:hAnsi="Microsoft YaHei" w:eastAsia="Microsoft YaHei"/>
+                <w:b w:val="0"/>
+                <w:i w:val="0"/>
+              </w:rPr>
+              <w:t>C:/Users/z3635/Downloads/盖世远程需求变更2次评审.txt</w:t>
+            </w:r>
+          </w:p>
+        </w:tc>
+        <w:tc>
+          <w:tcPr>
+            <w:tcW w:type="dxa" w:w="3456"/>
+            <w:vAlign w:val="top"/>
+            <w:tcMar>
+              <w:top w:w="80" w:type="dxa"/>
+              <w:start w:w="100" w:type="dxa"/>
+              <w:bottom w:w="80" w:type="dxa"/>
+              <w:end w:w="100" w:type="dxa"/>
+            </w:tcMar>
+          </w:tcPr>
+          <w:p>
+            <w:pPr>
+              <w:spacing w:after="40"/>
+            </w:pPr>
+            <w:r>
+              <w:rPr>
+                <w:rFonts w:ascii="Microsoft YaHei" w:hAnsi="Microsoft YaHei" w:eastAsia="Microsoft YaHei"/>
+              </w:rPr>
+            </w:r>
+            <w:r>
+              <w:rPr>
+                <w:rFonts w:ascii="Microsoft YaHei" w:hAnsi="Microsoft YaHei" w:eastAsia="Microsoft YaHei"/>
+                <w:b w:val="0"/>
+                <w:i w:val="0"/>
+              </w:rPr>
+              <w:t>一期公网、账号UID与注销、双App扫码、正式语言包、内容维护及按键编辑/云分享；网络成本方案仍待定。</w:t>
+            </w:r>
+          </w:p>
+        </w:tc>
+      </w:tr>
+      <w:tr>
+        <w:trPr>
+          <w:cantSplit/>
+        </w:trPr>
+        <w:tc>
+          <w:tcPr>
+            <w:tcW w:type="dxa" w:w="3456"/>
+            <w:vAlign w:val="top"/>
+            <w:tcMar>
+              <w:top w:w="80" w:type="dxa"/>
+              <w:start w:w="100" w:type="dxa"/>
+              <w:bottom w:w="80" w:type="dxa"/>
+              <w:end w:w="100" w:type="dxa"/>
+            </w:tcMar>
+          </w:tcPr>
+          <w:p>
+            <w:pPr>
+              <w:spacing w:after="40"/>
+            </w:pPr>
+            <w:r>
+              <w:rPr>
+                <w:rFonts w:ascii="Microsoft YaHei" w:hAnsi="Microsoft YaHei" w:eastAsia="Microsoft YaHei"/>
+              </w:rPr>
+            </w:r>
+            <w:r>
+              <w:rPr>
+                <w:rFonts w:ascii="Microsoft YaHei" w:hAnsi="Microsoft YaHei" w:eastAsia="Microsoft YaHei"/>
+                <w:b w:val="0"/>
+                <w:i w:val="0"/>
+              </w:rPr>
+              <w:t>盖世串流一期PRD V3.10</w:t>
+            </w:r>
+          </w:p>
+        </w:tc>
+        <w:tc>
+          <w:tcPr>
+            <w:tcW w:type="dxa" w:w="3456"/>
+            <w:vAlign w:val="top"/>
+            <w:tcMar>
+              <w:top w:w="80" w:type="dxa"/>
+              <w:start w:w="100" w:type="dxa"/>
+              <w:bottom w:w="80" w:type="dxa"/>
+              <w:end w:w="100" w:type="dxa"/>
+            </w:tcMar>
+          </w:tcPr>
+          <w:p>
+            <w:pPr>
+              <w:spacing w:after="40"/>
+            </w:pPr>
+            <w:r>
+              <w:rPr>
+                <w:rFonts w:ascii="Microsoft YaHei" w:hAnsi="Microsoft YaHei" w:eastAsia="Microsoft YaHei"/>
+              </w:rPr>
+            </w:r>
+            <w:r>
+              <w:rPr>
+                <w:rFonts w:ascii="Microsoft YaHei" w:hAnsi="Microsoft YaHei" w:eastAsia="Microsoft YaHei"/>
+                <w:b w:val="0"/>
+                <w:i w:val="0"/>
+              </w:rPr>
+              <w:t>盖世串流一期PRD.md</w:t>
+            </w:r>
+          </w:p>
+        </w:tc>
+        <w:tc>
+          <w:tcPr>
+            <w:tcW w:type="dxa" w:w="3456"/>
+            <w:vAlign w:val="top"/>
+            <w:tcMar>
+              <w:top w:w="80" w:type="dxa"/>
+              <w:start w:w="100" w:type="dxa"/>
+              <w:bottom w:w="80" w:type="dxa"/>
+              <w:end w:w="100" w:type="dxa"/>
+            </w:tcMar>
+          </w:tcPr>
+          <w:p>
+            <w:pPr>
+              <w:spacing w:after="40"/>
+            </w:pPr>
+            <w:r>
+              <w:rPr>
+                <w:rFonts w:ascii="Microsoft YaHei" w:hAnsi="Microsoft YaHei" w:eastAsia="Microsoft YaHei"/>
+              </w:rPr>
+            </w:r>
+            <w:r>
+              <w:rPr>
+                <w:rFonts w:ascii="Microsoft YaHei" w:hAnsi="Microsoft YaHei" w:eastAsia="Microsoft YaHei"/>
+                <w:b w:val="0"/>
+                <w:i w:val="0"/>
+              </w:rPr>
+              <w:t>旧远控交互及数据字典；嵌入式入口和登录已替换。</w:t>
+            </w:r>
+          </w:p>
+        </w:tc>
+      </w:tr>
+      <w:tr>
+        <w:trPr>
+          <w:cantSplit/>
+        </w:trPr>
+        <w:tc>
+          <w:tcPr>
+            <w:tcW w:type="dxa" w:w="3456"/>
+            <w:vAlign w:val="top"/>
+            <w:tcMar>
+              <w:top w:w="80" w:type="dxa"/>
+              <w:start w:w="100" w:type="dxa"/>
+              <w:bottom w:w="80" w:type="dxa"/>
+              <w:end w:w="100" w:type="dxa"/>
+            </w:tcMar>
+          </w:tcPr>
+          <w:p>
+            <w:pPr>
+              <w:spacing w:after="40"/>
+            </w:pPr>
+            <w:r>
+              <w:rPr>
+                <w:rFonts w:ascii="Microsoft YaHei" w:hAnsi="Microsoft YaHei" w:eastAsia="Microsoft YaHei"/>
+              </w:rPr>
+            </w:r>
+            <w:r>
+              <w:rPr>
+                <w:rFonts w:ascii="Microsoft YaHei" w:hAnsi="Microsoft YaHei" w:eastAsia="Microsoft YaHei"/>
+                <w:b w:val="0"/>
+                <w:i w:val="0"/>
+              </w:rPr>
               <w:t>独立产品与登录讨论稿、状态卡</w:t>
             </w:r>
           </w:p>
@@ -25400,7 +28821,7 @@
                 <w:b w:val="0"/>
                 <w:i w:val="0"/>
               </w:rPr>
-              <w:t>独立远程电脑-产品形态与登录链路-评审稿.md；远程电脑状态卡.md D-049～D-069</w:t>
+              <w:t>独立远程电脑-产品形态与登录链路-评审稿.md；远程电脑状态卡.md D-049～D-073</w:t>
             </w:r>
           </w:p>
         </w:tc>

</xml_diff>